<commit_message>
First Pull Request - update #1
This document now includes the changes I have made for my portion of the assignment so far.
</commit_message>
<xml_diff>
--- a/IA_ID.docx
+++ b/IA_ID.docx
@@ -999,7 +999,7 @@
               <w:rPr>
                 <w:rtl w:val="0"/>
               </w:rPr>
-              <w:t xml:space="preserve">Destination Information</w:t>
+              <w:t xml:space="preserve">Destination Information (for each destination)</w:t>
             </w:r>
           </w:p>
           <w:p>
@@ -1176,7 +1176,71 @@
               <w:rPr>
                 <w:rtl w:val="0"/>
               </w:rPr>
-              <w:t xml:space="preserve">Account </w:t>
+              <w:t xml:space="preserve">Account</w:t>
+            </w:r>
+          </w:p>
+          <w:p>
+            <w:pPr>
+              <w:keepNext w:val="0"/>
+              <w:keepLines w:val="0"/>
+              <w:pageBreakBefore w:val="0"/>
+              <w:widowControl w:val="0"/>
+              <w:numPr>
+                <w:ilvl w:val="1"/>
+                <w:numId w:val="1"/>
+              </w:numPr>
+              <w:pBdr>
+                <w:top w:space="0" w:sz="0" w:val="nil"/>
+                <w:left w:space="0" w:sz="0" w:val="nil"/>
+                <w:bottom w:space="0" w:sz="0" w:val="nil"/>
+                <w:right w:space="0" w:sz="0" w:val="nil"/>
+                <w:between w:space="0" w:sz="0" w:val="nil"/>
+              </w:pBdr>
+              <w:shd w:fill="auto" w:val="clear"/>
+              <w:spacing w:after="0" w:before="0" w:line="240" w:lineRule="auto"/>
+              <w:ind w:left="1440" w:right="0" w:hanging="360"/>
+              <w:jc w:val="left"/>
+              <w:rPr>
+                <w:u w:val="none"/>
+              </w:rPr>
+            </w:pPr>
+            <w:r>
+              <w:rPr>
+                <w:rtl w:val="0"/>
+              </w:rPr>
+              <w:t xml:space="preserve">Trips</w:t>
+            </w:r>
+          </w:p>
+          <w:p>
+            <w:pPr>
+              <w:keepNext w:val="0"/>
+              <w:keepLines w:val="0"/>
+              <w:pageBreakBefore w:val="0"/>
+              <w:widowControl w:val="0"/>
+              <w:numPr>
+                <w:ilvl w:val="1"/>
+                <w:numId w:val="1"/>
+              </w:numPr>
+              <w:pBdr>
+                <w:top w:space="0" w:sz="0" w:val="nil"/>
+                <w:left w:space="0" w:sz="0" w:val="nil"/>
+                <w:bottom w:space="0" w:sz="0" w:val="nil"/>
+                <w:right w:space="0" w:sz="0" w:val="nil"/>
+                <w:between w:space="0" w:sz="0" w:val="nil"/>
+              </w:pBdr>
+              <w:shd w:fill="auto" w:val="clear"/>
+              <w:spacing w:after="0" w:before="0" w:line="240" w:lineRule="auto"/>
+              <w:ind w:left="1440" w:right="0" w:hanging="360"/>
+              <w:jc w:val="left"/>
+              <w:rPr>
+                <w:u w:val="none"/>
+              </w:rPr>
+            </w:pPr>
+            <w:r>
+              <w:rPr>
+                <w:rtl w:val="0"/>
+              </w:rPr>
+              <w:t xml:space="preserve">Payments</w:t>
             </w:r>
           </w:p>
         </w:tc>

</xml_diff>

<commit_message>
Second Pull Request - update #2
</commit_message>
<xml_diff>
--- a/IA_ID.docx
+++ b/IA_ID.docx
@@ -946,7 +946,7 @@
               <w:widowControl w:val="0"/>
               <w:numPr>
                 <w:ilvl w:val="0"/>
-                <w:numId w:val="1"/>
+                <w:numId w:val="9"/>
               </w:numPr>
               <w:pBdr>
                 <w:top w:space="0" w:sz="0" w:val="nil"/>
@@ -967,7 +967,7 @@
               <w:rPr>
                 <w:rtl w:val="0"/>
               </w:rPr>
-              <w:t xml:space="preserve">Destinations Page (a list of all places)</w:t>
+              <w:t xml:space="preserve">Book a Trip</w:t>
             </w:r>
           </w:p>
           <w:p>
@@ -978,7 +978,7 @@
               <w:widowControl w:val="0"/>
               <w:numPr>
                 <w:ilvl w:val="0"/>
-                <w:numId w:val="1"/>
+                <w:numId w:val="9"/>
               </w:numPr>
               <w:pBdr>
                 <w:top w:space="0" w:sz="0" w:val="nil"/>
@@ -999,7 +999,7 @@
               <w:rPr>
                 <w:rtl w:val="0"/>
               </w:rPr>
-              <w:t xml:space="preserve">Destination Information (for each destination)</w:t>
+              <w:t xml:space="preserve">Destinations Page (a list of all places)</w:t>
             </w:r>
           </w:p>
           <w:p>
@@ -1010,7 +1010,7 @@
               <w:widowControl w:val="0"/>
               <w:numPr>
                 <w:ilvl w:val="0"/>
-                <w:numId w:val="1"/>
+                <w:numId w:val="9"/>
               </w:numPr>
               <w:pBdr>
                 <w:top w:space="0" w:sz="0" w:val="nil"/>
@@ -1031,24 +1031,7 @@
               <w:rPr>
                 <w:rtl w:val="0"/>
               </w:rPr>
-              <w:t xml:space="preserve">Hidden Gems (for each destination)</w:t>
-            </w:r>
-          </w:p>
-          <w:p>
-            <w:pPr>
-              <w:widowControl w:val="0"/>
-              <w:numPr>
-                <w:ilvl w:val="0"/>
-                <w:numId w:val="1"/>
-              </w:numPr>
-              <w:spacing w:line="240" w:lineRule="auto"/>
-              <w:ind w:left="720" w:hanging="360"/>
-            </w:pPr>
-            <w:r>
-              <w:rPr>
-                <w:rtl w:val="0"/>
-              </w:rPr>
-              <w:t xml:space="preserve">Activities list (for each destination)</w:t>
+              <w:t xml:space="preserve">Destination Information (for each destination)</w:t>
             </w:r>
           </w:p>
           <w:p>
@@ -1059,7 +1042,7 @@
               <w:widowControl w:val="0"/>
               <w:numPr>
                 <w:ilvl w:val="0"/>
-                <w:numId w:val="1"/>
+                <w:numId w:val="9"/>
               </w:numPr>
               <w:pBdr>
                 <w:top w:space="0" w:sz="0" w:val="nil"/>
@@ -1080,7 +1063,24 @@
               <w:rPr>
                 <w:rtl w:val="0"/>
               </w:rPr>
-              <w:t xml:space="preserve">Hotel price comparison</w:t>
+              <w:t xml:space="preserve">Hidden Gems (for each destination)</w:t>
+            </w:r>
+          </w:p>
+          <w:p>
+            <w:pPr>
+              <w:widowControl w:val="0"/>
+              <w:numPr>
+                <w:ilvl w:val="0"/>
+                <w:numId w:val="9"/>
+              </w:numPr>
+              <w:spacing w:line="240" w:lineRule="auto"/>
+              <w:ind w:left="720" w:hanging="360"/>
+            </w:pPr>
+            <w:r>
+              <w:rPr>
+                <w:rtl w:val="0"/>
+              </w:rPr>
+              <w:t xml:space="preserve">Activities list (for each destination)</w:t>
             </w:r>
           </w:p>
           <w:p>
@@ -1091,7 +1091,7 @@
               <w:widowControl w:val="0"/>
               <w:numPr>
                 <w:ilvl w:val="0"/>
-                <w:numId w:val="1"/>
+                <w:numId w:val="9"/>
               </w:numPr>
               <w:pBdr>
                 <w:top w:space="0" w:sz="0" w:val="nil"/>
@@ -1112,7 +1112,7 @@
               <w:rPr>
                 <w:rtl w:val="0"/>
               </w:rPr>
-              <w:t xml:space="preserve">Flight price comparison</w:t>
+              <w:t xml:space="preserve">Hotel price comparison</w:t>
             </w:r>
           </w:p>
           <w:p>
@@ -1123,7 +1123,7 @@
               <w:widowControl w:val="0"/>
               <w:numPr>
                 <w:ilvl w:val="0"/>
-                <w:numId w:val="1"/>
+                <w:numId w:val="9"/>
               </w:numPr>
               <w:pBdr>
                 <w:top w:space="0" w:sz="0" w:val="nil"/>
@@ -1144,7 +1144,7 @@
               <w:rPr>
                 <w:rtl w:val="0"/>
               </w:rPr>
-              <w:t xml:space="preserve">Travel Checklist</w:t>
+              <w:t xml:space="preserve">Flight price comparison</w:t>
             </w:r>
           </w:p>
           <w:p>
@@ -1155,7 +1155,7 @@
               <w:widowControl w:val="0"/>
               <w:numPr>
                 <w:ilvl w:val="0"/>
-                <w:numId w:val="1"/>
+                <w:numId w:val="9"/>
               </w:numPr>
               <w:pBdr>
                 <w:top w:space="0" w:sz="0" w:val="nil"/>
@@ -1176,7 +1176,7 @@
               <w:rPr>
                 <w:rtl w:val="0"/>
               </w:rPr>
-              <w:t xml:space="preserve">Account</w:t>
+              <w:t xml:space="preserve">Travel Checklist</w:t>
             </w:r>
           </w:p>
           <w:p>
@@ -1186,8 +1186,40 @@
               <w:pageBreakBefore w:val="0"/>
               <w:widowControl w:val="0"/>
               <w:numPr>
+                <w:ilvl w:val="0"/>
+                <w:numId w:val="9"/>
+              </w:numPr>
+              <w:pBdr>
+                <w:top w:space="0" w:sz="0" w:val="nil"/>
+                <w:left w:space="0" w:sz="0" w:val="nil"/>
+                <w:bottom w:space="0" w:sz="0" w:val="nil"/>
+                <w:right w:space="0" w:sz="0" w:val="nil"/>
+                <w:between w:space="0" w:sz="0" w:val="nil"/>
+              </w:pBdr>
+              <w:shd w:fill="auto" w:val="clear"/>
+              <w:spacing w:after="0" w:before="0" w:line="240" w:lineRule="auto"/>
+              <w:ind w:left="720" w:right="0" w:hanging="360"/>
+              <w:jc w:val="left"/>
+              <w:rPr>
+                <w:u w:val="none"/>
+              </w:rPr>
+            </w:pPr>
+            <w:r>
+              <w:rPr>
+                <w:rtl w:val="0"/>
+              </w:rPr>
+              <w:t xml:space="preserve">Account</w:t>
+            </w:r>
+          </w:p>
+          <w:p>
+            <w:pPr>
+              <w:keepNext w:val="0"/>
+              <w:keepLines w:val="0"/>
+              <w:pageBreakBefore w:val="0"/>
+              <w:widowControl w:val="0"/>
+              <w:numPr>
                 <w:ilvl w:val="1"/>
-                <w:numId w:val="1"/>
+                <w:numId w:val="9"/>
               </w:numPr>
               <w:pBdr>
                 <w:top w:space="0" w:sz="0" w:val="nil"/>
@@ -1219,7 +1251,7 @@
               <w:widowControl w:val="0"/>
               <w:numPr>
                 <w:ilvl w:val="1"/>
-                <w:numId w:val="1"/>
+                <w:numId w:val="9"/>
               </w:numPr>
               <w:pBdr>
                 <w:top w:space="0" w:sz="0" w:val="nil"/>
@@ -1246,6 +1278,25 @@
         </w:tc>
       </w:tr>
     </w:tbl>
+    <w:p>
+      <w:pPr>
+        <w:pBdr>
+          <w:top w:color="auto" w:space="0" w:sz="0" w:val="none"/>
+          <w:left w:color="auto" w:space="0" w:sz="0" w:val="none"/>
+          <w:bottom w:color="auto" w:space="0" w:sz="0" w:val="none"/>
+          <w:right w:color="auto" w:space="0" w:sz="0" w:val="none"/>
+          <w:between w:color="auto" w:space="0" w:sz="0" w:val="none"/>
+        </w:pBdr>
+        <w:shd w:fill="ffffff" w:val="clear"/>
+        <w:ind w:left="0" w:firstLine="0"/>
+        <w:rPr/>
+      </w:pPr>
+      <w:r>
+        <w:rPr>
+          <w:rtl w:val="0"/>
+        </w:rPr>
+      </w:r>
+    </w:p>
     <w:p>
       <w:pPr>
         <w:pBdr>
@@ -1496,6 +1547,10 @@
               <w:keepLines w:val="0"/>
               <w:pageBreakBefore w:val="0"/>
               <w:widowControl w:val="0"/>
+              <w:numPr>
+                <w:ilvl w:val="0"/>
+                <w:numId w:val="8"/>
+              </w:numPr>
               <w:pBdr>
                 <w:top w:space="0" w:sz="0" w:val="nil"/>
                 <w:left w:space="0" w:sz="0" w:val="nil"/>
@@ -1505,14 +1560,536 @@
               </w:pBdr>
               <w:shd w:fill="auto" w:val="clear"/>
               <w:spacing w:after="0" w:before="0" w:line="240" w:lineRule="auto"/>
-              <w:ind w:left="0" w:right="0" w:firstLine="0"/>
+              <w:ind w:left="720" w:right="0" w:hanging="360"/>
               <w:jc w:val="left"/>
-              <w:rPr/>
-            </w:pPr>
-            <w:r>
-              <w:rPr>
-                <w:rtl w:val="0"/>
-              </w:rPr>
+              <w:rPr>
+                <w:b w:val="1"/>
+                <w:bCs w:val="1"/>
+              </w:rPr>
+            </w:pPr>
+            <w:r>
+              <w:rPr>
+                <w:b w:val="1"/>
+                <w:bCs w:val="1"/>
+                <w:rtl w:val="0"/>
+              </w:rPr>
+              <w:t xml:space="preserve">Book a Trip</w:t>
+            </w:r>
+          </w:p>
+          <w:p>
+            <w:pPr>
+              <w:keepNext w:val="0"/>
+              <w:keepLines w:val="0"/>
+              <w:pageBreakBefore w:val="0"/>
+              <w:widowControl w:val="0"/>
+              <w:numPr>
+                <w:ilvl w:val="0"/>
+                <w:numId w:val="8"/>
+              </w:numPr>
+              <w:pBdr>
+                <w:top w:space="0" w:sz="0" w:val="nil"/>
+                <w:left w:space="0" w:sz="0" w:val="nil"/>
+                <w:bottom w:space="0" w:sz="0" w:val="nil"/>
+                <w:right w:space="0" w:sz="0" w:val="nil"/>
+                <w:between w:space="0" w:sz="0" w:val="nil"/>
+              </w:pBdr>
+              <w:shd w:fill="auto" w:val="clear"/>
+              <w:spacing w:after="0" w:before="0" w:line="240" w:lineRule="auto"/>
+              <w:ind w:left="720" w:right="0" w:hanging="360"/>
+              <w:jc w:val="left"/>
+              <w:rPr>
+                <w:b w:val="1"/>
+                <w:bCs w:val="1"/>
+              </w:rPr>
+            </w:pPr>
+            <w:r>
+              <w:rPr>
+                <w:b w:val="1"/>
+                <w:bCs w:val="1"/>
+                <w:rtl w:val="0"/>
+              </w:rPr>
+              <w:t xml:space="preserve">Destinations Page</w:t>
+            </w:r>
+          </w:p>
+          <w:p>
+            <w:pPr>
+              <w:keepNext w:val="0"/>
+              <w:keepLines w:val="0"/>
+              <w:pageBreakBefore w:val="0"/>
+              <w:widowControl w:val="0"/>
+              <w:numPr>
+                <w:ilvl w:val="1"/>
+                <w:numId w:val="8"/>
+              </w:numPr>
+              <w:pBdr>
+                <w:top w:space="0" w:sz="0" w:val="nil"/>
+                <w:left w:space="0" w:sz="0" w:val="nil"/>
+                <w:bottom w:space="0" w:sz="0" w:val="nil"/>
+                <w:right w:space="0" w:sz="0" w:val="nil"/>
+                <w:between w:space="0" w:sz="0" w:val="nil"/>
+              </w:pBdr>
+              <w:shd w:fill="auto" w:val="clear"/>
+              <w:spacing w:after="0" w:before="0" w:line="240" w:lineRule="auto"/>
+              <w:ind w:left="1440" w:right="0" w:hanging="360"/>
+              <w:jc w:val="left"/>
+              <w:rPr>
+                <w:u w:val="none"/>
+              </w:rPr>
+            </w:pPr>
+            <w:r>
+              <w:rPr>
+                <w:rtl w:val="0"/>
+              </w:rPr>
+              <w:t xml:space="preserve">Map </w:t>
+            </w:r>
+            <w:r>
+              <w:rPr>
+                <w:b w:val="1"/>
+                <w:bCs w:val="1"/>
+                <w:color w:val="ff0000"/>
+                <w:rtl w:val="0"/>
+              </w:rPr>
+              <w:t xml:space="preserve">(For visual search on the map (able to click the location))</w:t>
+            </w:r>
+          </w:p>
+          <w:p>
+            <w:pPr>
+              <w:widowControl w:val="0"/>
+              <w:numPr>
+                <w:ilvl w:val="2"/>
+                <w:numId w:val="8"/>
+              </w:numPr>
+              <w:spacing w:line="240" w:lineRule="auto"/>
+              <w:ind w:left="2160" w:hanging="360"/>
+            </w:pPr>
+            <w:r>
+              <w:rPr>
+                <w:rtl w:val="0"/>
+              </w:rPr>
+              <w:t xml:space="preserve">Destination Information </w:t>
+            </w:r>
+            <w:r>
+              <w:rPr>
+                <w:color w:val="ff0000"/>
+                <w:rtl w:val="0"/>
+              </w:rPr>
+              <w:t xml:space="preserve">(for each destination)</w:t>
+            </w:r>
+          </w:p>
+          <w:p>
+            <w:pPr>
+              <w:widowControl w:val="0"/>
+              <w:numPr>
+                <w:ilvl w:val="2"/>
+                <w:numId w:val="8"/>
+              </w:numPr>
+              <w:spacing w:line="240" w:lineRule="auto"/>
+              <w:ind w:left="2160" w:hanging="360"/>
+              <w:rPr>
+                <w:u w:val="none"/>
+              </w:rPr>
+            </w:pPr>
+            <w:r>
+              <w:rPr>
+                <w:rtl w:val="0"/>
+              </w:rPr>
+              <w:t xml:space="preserve">Hidden gems</w:t>
+            </w:r>
+          </w:p>
+          <w:p>
+            <w:pPr>
+              <w:widowControl w:val="0"/>
+              <w:numPr>
+                <w:ilvl w:val="2"/>
+                <w:numId w:val="8"/>
+              </w:numPr>
+              <w:spacing w:line="240" w:lineRule="auto"/>
+              <w:ind w:left="2160" w:hanging="360"/>
+              <w:rPr>
+                <w:u w:val="none"/>
+              </w:rPr>
+            </w:pPr>
+            <w:r>
+              <w:rPr>
+                <w:rtl w:val="0"/>
+              </w:rPr>
+              <w:t xml:space="preserve">Activities list</w:t>
+            </w:r>
+          </w:p>
+          <w:p>
+            <w:pPr>
+              <w:widowControl w:val="0"/>
+              <w:numPr>
+                <w:ilvl w:val="2"/>
+                <w:numId w:val="8"/>
+              </w:numPr>
+              <w:spacing w:line="240" w:lineRule="auto"/>
+              <w:ind w:left="2160" w:hanging="360"/>
+            </w:pPr>
+            <w:r>
+              <w:rPr>
+                <w:rtl w:val="0"/>
+              </w:rPr>
+              <w:t xml:space="preserve">Hotel price comparison</w:t>
+            </w:r>
+          </w:p>
+          <w:p>
+            <w:pPr>
+              <w:widowControl w:val="0"/>
+              <w:numPr>
+                <w:ilvl w:val="2"/>
+                <w:numId w:val="8"/>
+              </w:numPr>
+              <w:spacing w:line="240" w:lineRule="auto"/>
+              <w:ind w:left="2160" w:hanging="360"/>
+            </w:pPr>
+            <w:r>
+              <w:rPr>
+                <w:rtl w:val="0"/>
+              </w:rPr>
+              <w:t xml:space="preserve">Flight price comparison</w:t>
+            </w:r>
+          </w:p>
+          <w:p>
+            <w:pPr>
+              <w:keepNext w:val="0"/>
+              <w:keepLines w:val="0"/>
+              <w:pageBreakBefore w:val="0"/>
+              <w:widowControl w:val="0"/>
+              <w:numPr>
+                <w:ilvl w:val="1"/>
+                <w:numId w:val="8"/>
+              </w:numPr>
+              <w:pBdr>
+                <w:top w:space="0" w:sz="0" w:val="nil"/>
+                <w:left w:space="0" w:sz="0" w:val="nil"/>
+                <w:bottom w:space="0" w:sz="0" w:val="nil"/>
+                <w:right w:space="0" w:sz="0" w:val="nil"/>
+                <w:between w:space="0" w:sz="0" w:val="nil"/>
+              </w:pBdr>
+              <w:shd w:fill="auto" w:val="clear"/>
+              <w:spacing w:after="0" w:before="0" w:line="240" w:lineRule="auto"/>
+              <w:ind w:left="1440" w:right="0" w:hanging="360"/>
+              <w:jc w:val="left"/>
+              <w:rPr>
+                <w:u w:val="none"/>
+              </w:rPr>
+            </w:pPr>
+            <w:r>
+              <w:rPr>
+                <w:rtl w:val="0"/>
+              </w:rPr>
+              <w:t xml:space="preserve">List of Destinations </w:t>
+            </w:r>
+            <w:r>
+              <w:rPr>
+                <w:b w:val="1"/>
+                <w:bCs w:val="1"/>
+                <w:color w:val="ff0000"/>
+                <w:rtl w:val="0"/>
+              </w:rPr>
+              <w:t xml:space="preserve">(Ordered by Continent and Country, then alphabetical)</w:t>
+            </w:r>
+          </w:p>
+          <w:p>
+            <w:pPr>
+              <w:keepNext w:val="0"/>
+              <w:keepLines w:val="0"/>
+              <w:pageBreakBefore w:val="0"/>
+              <w:widowControl w:val="0"/>
+              <w:numPr>
+                <w:ilvl w:val="2"/>
+                <w:numId w:val="8"/>
+              </w:numPr>
+              <w:pBdr>
+                <w:top w:space="0" w:sz="0" w:val="nil"/>
+                <w:left w:space="0" w:sz="0" w:val="nil"/>
+                <w:bottom w:space="0" w:sz="0" w:val="nil"/>
+                <w:right w:space="0" w:sz="0" w:val="nil"/>
+                <w:between w:space="0" w:sz="0" w:val="nil"/>
+              </w:pBdr>
+              <w:shd w:fill="auto" w:val="clear"/>
+              <w:spacing w:after="0" w:before="0" w:line="240" w:lineRule="auto"/>
+              <w:ind w:left="2160" w:right="0" w:hanging="360"/>
+              <w:jc w:val="left"/>
+              <w:rPr>
+                <w:u w:val="none"/>
+              </w:rPr>
+            </w:pPr>
+            <w:r>
+              <w:rPr>
+                <w:rtl w:val="0"/>
+              </w:rPr>
+              <w:t xml:space="preserve">Destination Information </w:t>
+            </w:r>
+            <w:r>
+              <w:rPr>
+                <w:color w:val="ff0000"/>
+                <w:rtl w:val="0"/>
+              </w:rPr>
+              <w:t xml:space="preserve">(for each destination)</w:t>
+            </w:r>
+          </w:p>
+          <w:p>
+            <w:pPr>
+              <w:keepNext w:val="0"/>
+              <w:keepLines w:val="0"/>
+              <w:pageBreakBefore w:val="0"/>
+              <w:widowControl w:val="0"/>
+              <w:numPr>
+                <w:ilvl w:val="2"/>
+                <w:numId w:val="8"/>
+              </w:numPr>
+              <w:pBdr>
+                <w:top w:space="0" w:sz="0" w:val="nil"/>
+                <w:left w:space="0" w:sz="0" w:val="nil"/>
+                <w:bottom w:space="0" w:sz="0" w:val="nil"/>
+                <w:right w:space="0" w:sz="0" w:val="nil"/>
+                <w:between w:space="0" w:sz="0" w:val="nil"/>
+              </w:pBdr>
+              <w:shd w:fill="auto" w:val="clear"/>
+              <w:spacing w:after="0" w:before="0" w:line="240" w:lineRule="auto"/>
+              <w:ind w:left="2160" w:right="0" w:hanging="360"/>
+              <w:jc w:val="left"/>
+              <w:rPr>
+                <w:u w:val="none"/>
+              </w:rPr>
+            </w:pPr>
+            <w:r>
+              <w:rPr>
+                <w:rtl w:val="0"/>
+              </w:rPr>
+              <w:t xml:space="preserve">Hidden gems</w:t>
+            </w:r>
+          </w:p>
+          <w:p>
+            <w:pPr>
+              <w:keepNext w:val="0"/>
+              <w:keepLines w:val="0"/>
+              <w:pageBreakBefore w:val="0"/>
+              <w:widowControl w:val="0"/>
+              <w:numPr>
+                <w:ilvl w:val="2"/>
+                <w:numId w:val="8"/>
+              </w:numPr>
+              <w:pBdr>
+                <w:top w:space="0" w:sz="0" w:val="nil"/>
+                <w:left w:space="0" w:sz="0" w:val="nil"/>
+                <w:bottom w:space="0" w:sz="0" w:val="nil"/>
+                <w:right w:space="0" w:sz="0" w:val="nil"/>
+                <w:between w:space="0" w:sz="0" w:val="nil"/>
+              </w:pBdr>
+              <w:shd w:fill="auto" w:val="clear"/>
+              <w:spacing w:after="0" w:before="0" w:line="240" w:lineRule="auto"/>
+              <w:ind w:left="2160" w:right="0" w:hanging="360"/>
+              <w:jc w:val="left"/>
+              <w:rPr>
+                <w:u w:val="none"/>
+              </w:rPr>
+            </w:pPr>
+            <w:r>
+              <w:rPr>
+                <w:rtl w:val="0"/>
+              </w:rPr>
+              <w:t xml:space="preserve">Activities list</w:t>
+            </w:r>
+          </w:p>
+          <w:p>
+            <w:pPr>
+              <w:keepNext w:val="0"/>
+              <w:keepLines w:val="0"/>
+              <w:pageBreakBefore w:val="0"/>
+              <w:widowControl w:val="0"/>
+              <w:numPr>
+                <w:ilvl w:val="2"/>
+                <w:numId w:val="8"/>
+              </w:numPr>
+              <w:pBdr>
+                <w:top w:space="0" w:sz="0" w:val="nil"/>
+                <w:left w:space="0" w:sz="0" w:val="nil"/>
+                <w:bottom w:space="0" w:sz="0" w:val="nil"/>
+                <w:right w:space="0" w:sz="0" w:val="nil"/>
+                <w:between w:space="0" w:sz="0" w:val="nil"/>
+              </w:pBdr>
+              <w:shd w:fill="auto" w:val="clear"/>
+              <w:spacing w:after="0" w:before="0" w:line="240" w:lineRule="auto"/>
+              <w:ind w:left="2160" w:right="0" w:hanging="360"/>
+              <w:jc w:val="left"/>
+              <w:rPr>
+                <w:u w:val="none"/>
+              </w:rPr>
+            </w:pPr>
+            <w:r>
+              <w:rPr>
+                <w:rtl w:val="0"/>
+              </w:rPr>
+              <w:t xml:space="preserve">Hotel price comparison</w:t>
+            </w:r>
+          </w:p>
+          <w:p>
+            <w:pPr>
+              <w:keepNext w:val="0"/>
+              <w:keepLines w:val="0"/>
+              <w:pageBreakBefore w:val="0"/>
+              <w:widowControl w:val="0"/>
+              <w:numPr>
+                <w:ilvl w:val="2"/>
+                <w:numId w:val="8"/>
+              </w:numPr>
+              <w:pBdr>
+                <w:top w:space="0" w:sz="0" w:val="nil"/>
+                <w:left w:space="0" w:sz="0" w:val="nil"/>
+                <w:bottom w:space="0" w:sz="0" w:val="nil"/>
+                <w:right w:space="0" w:sz="0" w:val="nil"/>
+                <w:between w:space="0" w:sz="0" w:val="nil"/>
+              </w:pBdr>
+              <w:shd w:fill="auto" w:val="clear"/>
+              <w:spacing w:after="0" w:before="0" w:line="240" w:lineRule="auto"/>
+              <w:ind w:left="2160" w:right="0" w:hanging="360"/>
+              <w:jc w:val="left"/>
+              <w:rPr>
+                <w:u w:val="none"/>
+              </w:rPr>
+            </w:pPr>
+            <w:r>
+              <w:rPr>
+                <w:rtl w:val="0"/>
+              </w:rPr>
+              <w:t xml:space="preserve">Flight price comparison</w:t>
+            </w:r>
+          </w:p>
+          <w:p>
+            <w:pPr>
+              <w:keepNext w:val="0"/>
+              <w:keepLines w:val="0"/>
+              <w:pageBreakBefore w:val="0"/>
+              <w:widowControl w:val="0"/>
+              <w:numPr>
+                <w:ilvl w:val="0"/>
+                <w:numId w:val="8"/>
+              </w:numPr>
+              <w:pBdr>
+                <w:top w:space="0" w:sz="0" w:val="nil"/>
+                <w:left w:space="0" w:sz="0" w:val="nil"/>
+                <w:bottom w:space="0" w:sz="0" w:val="nil"/>
+                <w:right w:space="0" w:sz="0" w:val="nil"/>
+                <w:between w:space="0" w:sz="0" w:val="nil"/>
+              </w:pBdr>
+              <w:shd w:fill="auto" w:val="clear"/>
+              <w:spacing w:after="0" w:before="0" w:line="240" w:lineRule="auto"/>
+              <w:ind w:left="720" w:right="0" w:hanging="360"/>
+              <w:jc w:val="left"/>
+              <w:rPr>
+                <w:b w:val="1"/>
+                <w:bCs w:val="1"/>
+              </w:rPr>
+            </w:pPr>
+            <w:r>
+              <w:rPr>
+                <w:b w:val="1"/>
+                <w:bCs w:val="1"/>
+                <w:rtl w:val="0"/>
+              </w:rPr>
+              <w:t xml:space="preserve">Travel Checklist</w:t>
+            </w:r>
+          </w:p>
+          <w:p>
+            <w:pPr>
+              <w:keepNext w:val="0"/>
+              <w:keepLines w:val="0"/>
+              <w:pageBreakBefore w:val="0"/>
+              <w:widowControl w:val="0"/>
+              <w:numPr>
+                <w:ilvl w:val="0"/>
+                <w:numId w:val="8"/>
+              </w:numPr>
+              <w:pBdr>
+                <w:top w:space="0" w:sz="0" w:val="nil"/>
+                <w:left w:space="0" w:sz="0" w:val="nil"/>
+                <w:bottom w:space="0" w:sz="0" w:val="nil"/>
+                <w:right w:space="0" w:sz="0" w:val="nil"/>
+                <w:between w:space="0" w:sz="0" w:val="nil"/>
+              </w:pBdr>
+              <w:shd w:fill="auto" w:val="clear"/>
+              <w:spacing w:after="0" w:before="0" w:line="240" w:lineRule="auto"/>
+              <w:ind w:left="720" w:right="0" w:hanging="360"/>
+              <w:jc w:val="left"/>
+              <w:rPr>
+                <w:b w:val="1"/>
+                <w:bCs w:val="1"/>
+              </w:rPr>
+            </w:pPr>
+            <w:r>
+              <w:rPr>
+                <w:b w:val="1"/>
+                <w:bCs w:val="1"/>
+                <w:rtl w:val="0"/>
+              </w:rPr>
+              <w:t xml:space="preserve">Account</w:t>
+            </w:r>
+          </w:p>
+          <w:p>
+            <w:pPr>
+              <w:keepNext w:val="0"/>
+              <w:keepLines w:val="0"/>
+              <w:pageBreakBefore w:val="0"/>
+              <w:widowControl w:val="0"/>
+              <w:numPr>
+                <w:ilvl w:val="1"/>
+                <w:numId w:val="8"/>
+              </w:numPr>
+              <w:pBdr>
+                <w:top w:space="0" w:sz="0" w:val="nil"/>
+                <w:left w:space="0" w:sz="0" w:val="nil"/>
+                <w:bottom w:space="0" w:sz="0" w:val="nil"/>
+                <w:right w:space="0" w:sz="0" w:val="nil"/>
+                <w:between w:space="0" w:sz="0" w:val="nil"/>
+              </w:pBdr>
+              <w:shd w:fill="auto" w:val="clear"/>
+              <w:spacing w:after="0" w:before="0" w:line="240" w:lineRule="auto"/>
+              <w:ind w:left="1440" w:right="0" w:hanging="360"/>
+              <w:jc w:val="left"/>
+              <w:rPr>
+                <w:u w:val="none"/>
+              </w:rPr>
+            </w:pPr>
+            <w:r>
+              <w:rPr>
+                <w:rtl w:val="0"/>
+              </w:rPr>
+              <w:t xml:space="preserve">Trips</w:t>
+            </w:r>
+          </w:p>
+          <w:p>
+            <w:pPr>
+              <w:keepNext w:val="0"/>
+              <w:keepLines w:val="0"/>
+              <w:pageBreakBefore w:val="0"/>
+              <w:widowControl w:val="0"/>
+              <w:numPr>
+                <w:ilvl w:val="1"/>
+                <w:numId w:val="8"/>
+              </w:numPr>
+              <w:pBdr>
+                <w:top w:space="0" w:sz="0" w:val="nil"/>
+                <w:left w:space="0" w:sz="0" w:val="nil"/>
+                <w:bottom w:space="0" w:sz="0" w:val="nil"/>
+                <w:right w:space="0" w:sz="0" w:val="nil"/>
+                <w:between w:space="0" w:sz="0" w:val="nil"/>
+              </w:pBdr>
+              <w:shd w:fill="auto" w:val="clear"/>
+              <w:spacing w:after="0" w:before="0" w:line="240" w:lineRule="auto"/>
+              <w:ind w:left="1440" w:right="0" w:hanging="360"/>
+              <w:jc w:val="left"/>
+              <w:rPr>
+                <w:u w:val="none"/>
+              </w:rPr>
+            </w:pPr>
+            <w:r>
+              <w:rPr>
+                <w:rtl w:val="0"/>
+              </w:rPr>
+              <w:t xml:space="preserve">Payments</w:t>
             </w:r>
           </w:p>
         </w:tc>
@@ -1644,6 +2221,282 @@
         <w:shd w:fill="ffffff" w:val="clear"/>
         <w:ind w:left="0" w:firstLine="0"/>
         <w:rPr/>
+      </w:pPr>
+      <w:r>
+        <w:rPr>
+          <w:rtl w:val="0"/>
+        </w:rPr>
+      </w:r>
+    </w:p>
+    <w:p>
+      <w:pPr>
+        <w:pBdr>
+          <w:top w:color="auto" w:space="0" w:sz="0" w:val="none"/>
+          <w:left w:color="auto" w:space="0" w:sz="0" w:val="none"/>
+          <w:bottom w:color="auto" w:space="0" w:sz="0" w:val="none"/>
+          <w:right w:color="auto" w:space="0" w:sz="0" w:val="none"/>
+          <w:between w:color="auto" w:space="0" w:sz="0" w:val="none"/>
+        </w:pBdr>
+        <w:shd w:fill="ffffff" w:val="clear"/>
+        <w:ind w:left="0" w:firstLine="0"/>
+        <w:jc w:val="center"/>
+        <w:rPr>
+          <w:b w:val="1"/>
+          <w:bCs w:val="1"/>
+        </w:rPr>
+      </w:pPr>
+      <w:r>
+        <w:rPr>
+          <w:rtl w:val="0"/>
+        </w:rPr>
+      </w:r>
+    </w:p>
+    <w:p>
+      <w:pPr>
+        <w:pBdr>
+          <w:top w:color="auto" w:space="0" w:sz="0" w:val="none"/>
+          <w:left w:color="auto" w:space="0" w:sz="0" w:val="none"/>
+          <w:bottom w:color="auto" w:space="0" w:sz="0" w:val="none"/>
+          <w:right w:color="auto" w:space="0" w:sz="0" w:val="none"/>
+          <w:between w:color="auto" w:space="0" w:sz="0" w:val="none"/>
+        </w:pBdr>
+        <w:shd w:fill="ffffff" w:val="clear"/>
+        <w:ind w:left="0" w:firstLine="0"/>
+        <w:jc w:val="center"/>
+        <w:rPr>
+          <w:b w:val="1"/>
+          <w:bCs w:val="1"/>
+        </w:rPr>
+      </w:pPr>
+      <w:r>
+        <w:rPr>
+          <w:rtl w:val="0"/>
+        </w:rPr>
+      </w:r>
+    </w:p>
+    <w:p>
+      <w:pPr>
+        <w:pBdr>
+          <w:top w:color="auto" w:space="0" w:sz="0" w:val="none"/>
+          <w:left w:color="auto" w:space="0" w:sz="0" w:val="none"/>
+          <w:bottom w:color="auto" w:space="0" w:sz="0" w:val="none"/>
+          <w:right w:color="auto" w:space="0" w:sz="0" w:val="none"/>
+          <w:between w:color="auto" w:space="0" w:sz="0" w:val="none"/>
+        </w:pBdr>
+        <w:shd w:fill="ffffff" w:val="clear"/>
+        <w:ind w:left="0" w:firstLine="0"/>
+        <w:jc w:val="center"/>
+        <w:rPr>
+          <w:b w:val="1"/>
+          <w:bCs w:val="1"/>
+        </w:rPr>
+      </w:pPr>
+      <w:r>
+        <w:rPr>
+          <w:rtl w:val="0"/>
+        </w:rPr>
+      </w:r>
+    </w:p>
+    <w:p>
+      <w:pPr>
+        <w:pBdr>
+          <w:top w:color="auto" w:space="0" w:sz="0" w:val="none"/>
+          <w:left w:color="auto" w:space="0" w:sz="0" w:val="none"/>
+          <w:bottom w:color="auto" w:space="0" w:sz="0" w:val="none"/>
+          <w:right w:color="auto" w:space="0" w:sz="0" w:val="none"/>
+          <w:between w:color="auto" w:space="0" w:sz="0" w:val="none"/>
+        </w:pBdr>
+        <w:shd w:fill="ffffff" w:val="clear"/>
+        <w:ind w:left="0" w:firstLine="0"/>
+        <w:jc w:val="center"/>
+        <w:rPr>
+          <w:b w:val="1"/>
+          <w:bCs w:val="1"/>
+        </w:rPr>
+      </w:pPr>
+      <w:r>
+        <w:rPr>
+          <w:rtl w:val="0"/>
+        </w:rPr>
+      </w:r>
+    </w:p>
+    <w:p>
+      <w:pPr>
+        <w:pBdr>
+          <w:top w:color="auto" w:space="0" w:sz="0" w:val="none"/>
+          <w:left w:color="auto" w:space="0" w:sz="0" w:val="none"/>
+          <w:bottom w:color="auto" w:space="0" w:sz="0" w:val="none"/>
+          <w:right w:color="auto" w:space="0" w:sz="0" w:val="none"/>
+          <w:between w:color="auto" w:space="0" w:sz="0" w:val="none"/>
+        </w:pBdr>
+        <w:shd w:fill="ffffff" w:val="clear"/>
+        <w:ind w:left="0" w:firstLine="0"/>
+        <w:jc w:val="center"/>
+        <w:rPr>
+          <w:b w:val="1"/>
+          <w:bCs w:val="1"/>
+        </w:rPr>
+      </w:pPr>
+      <w:r>
+        <w:rPr>
+          <w:rtl w:val="0"/>
+        </w:rPr>
+      </w:r>
+    </w:p>
+    <w:p>
+      <w:pPr>
+        <w:pBdr>
+          <w:top w:color="auto" w:space="0" w:sz="0" w:val="none"/>
+          <w:left w:color="auto" w:space="0" w:sz="0" w:val="none"/>
+          <w:bottom w:color="auto" w:space="0" w:sz="0" w:val="none"/>
+          <w:right w:color="auto" w:space="0" w:sz="0" w:val="none"/>
+          <w:between w:color="auto" w:space="0" w:sz="0" w:val="none"/>
+        </w:pBdr>
+        <w:shd w:fill="ffffff" w:val="clear"/>
+        <w:ind w:left="0" w:firstLine="0"/>
+        <w:jc w:val="center"/>
+        <w:rPr>
+          <w:b w:val="1"/>
+          <w:bCs w:val="1"/>
+        </w:rPr>
+      </w:pPr>
+      <w:r>
+        <w:rPr>
+          <w:rtl w:val="0"/>
+        </w:rPr>
+      </w:r>
+    </w:p>
+    <w:p>
+      <w:pPr>
+        <w:pBdr>
+          <w:top w:color="auto" w:space="0" w:sz="0" w:val="none"/>
+          <w:left w:color="auto" w:space="0" w:sz="0" w:val="none"/>
+          <w:bottom w:color="auto" w:space="0" w:sz="0" w:val="none"/>
+          <w:right w:color="auto" w:space="0" w:sz="0" w:val="none"/>
+          <w:between w:color="auto" w:space="0" w:sz="0" w:val="none"/>
+        </w:pBdr>
+        <w:shd w:fill="ffffff" w:val="clear"/>
+        <w:ind w:left="0" w:firstLine="0"/>
+        <w:jc w:val="center"/>
+        <w:rPr>
+          <w:b w:val="1"/>
+          <w:bCs w:val="1"/>
+        </w:rPr>
+      </w:pPr>
+      <w:r>
+        <w:rPr>
+          <w:rtl w:val="0"/>
+        </w:rPr>
+      </w:r>
+    </w:p>
+    <w:p>
+      <w:pPr>
+        <w:pBdr>
+          <w:top w:color="auto" w:space="0" w:sz="0" w:val="none"/>
+          <w:left w:color="auto" w:space="0" w:sz="0" w:val="none"/>
+          <w:bottom w:color="auto" w:space="0" w:sz="0" w:val="none"/>
+          <w:right w:color="auto" w:space="0" w:sz="0" w:val="none"/>
+          <w:between w:color="auto" w:space="0" w:sz="0" w:val="none"/>
+        </w:pBdr>
+        <w:shd w:fill="ffffff" w:val="clear"/>
+        <w:ind w:left="0" w:firstLine="0"/>
+        <w:jc w:val="center"/>
+        <w:rPr>
+          <w:b w:val="1"/>
+          <w:bCs w:val="1"/>
+        </w:rPr>
+      </w:pPr>
+      <w:r>
+        <w:rPr>
+          <w:rtl w:val="0"/>
+        </w:rPr>
+      </w:r>
+    </w:p>
+    <w:p>
+      <w:pPr>
+        <w:pBdr>
+          <w:top w:color="auto" w:space="0" w:sz="0" w:val="none"/>
+          <w:left w:color="auto" w:space="0" w:sz="0" w:val="none"/>
+          <w:bottom w:color="auto" w:space="0" w:sz="0" w:val="none"/>
+          <w:right w:color="auto" w:space="0" w:sz="0" w:val="none"/>
+          <w:between w:color="auto" w:space="0" w:sz="0" w:val="none"/>
+        </w:pBdr>
+        <w:shd w:fill="ffffff" w:val="clear"/>
+        <w:ind w:left="0" w:firstLine="0"/>
+        <w:jc w:val="center"/>
+        <w:rPr>
+          <w:b w:val="1"/>
+          <w:bCs w:val="1"/>
+        </w:rPr>
+      </w:pPr>
+      <w:r>
+        <w:rPr>
+          <w:rtl w:val="0"/>
+        </w:rPr>
+      </w:r>
+    </w:p>
+    <w:p>
+      <w:pPr>
+        <w:pBdr>
+          <w:top w:color="auto" w:space="0" w:sz="0" w:val="none"/>
+          <w:left w:color="auto" w:space="0" w:sz="0" w:val="none"/>
+          <w:bottom w:color="auto" w:space="0" w:sz="0" w:val="none"/>
+          <w:right w:color="auto" w:space="0" w:sz="0" w:val="none"/>
+          <w:between w:color="auto" w:space="0" w:sz="0" w:val="none"/>
+        </w:pBdr>
+        <w:shd w:fill="ffffff" w:val="clear"/>
+        <w:ind w:left="0" w:firstLine="0"/>
+        <w:jc w:val="center"/>
+        <w:rPr>
+          <w:b w:val="1"/>
+          <w:bCs w:val="1"/>
+        </w:rPr>
+      </w:pPr>
+      <w:r>
+        <w:rPr>
+          <w:rtl w:val="0"/>
+        </w:rPr>
+      </w:r>
+    </w:p>
+    <w:p>
+      <w:pPr>
+        <w:pBdr>
+          <w:top w:color="auto" w:space="0" w:sz="0" w:val="none"/>
+          <w:left w:color="auto" w:space="0" w:sz="0" w:val="none"/>
+          <w:bottom w:color="auto" w:space="0" w:sz="0" w:val="none"/>
+          <w:right w:color="auto" w:space="0" w:sz="0" w:val="none"/>
+          <w:between w:color="auto" w:space="0" w:sz="0" w:val="none"/>
+        </w:pBdr>
+        <w:shd w:fill="ffffff" w:val="clear"/>
+        <w:ind w:left="0" w:firstLine="0"/>
+        <w:jc w:val="center"/>
+        <w:rPr>
+          <w:b w:val="1"/>
+          <w:bCs w:val="1"/>
+        </w:rPr>
+      </w:pPr>
+      <w:r>
+        <w:rPr>
+          <w:rtl w:val="0"/>
+        </w:rPr>
+      </w:r>
+    </w:p>
+    <w:p>
+      <w:pPr>
+        <w:pBdr>
+          <w:top w:color="auto" w:space="0" w:sz="0" w:val="none"/>
+          <w:left w:color="auto" w:space="0" w:sz="0" w:val="none"/>
+          <w:bottom w:color="auto" w:space="0" w:sz="0" w:val="none"/>
+          <w:right w:color="auto" w:space="0" w:sz="0" w:val="none"/>
+          <w:between w:color="auto" w:space="0" w:sz="0" w:val="none"/>
+        </w:pBdr>
+        <w:shd w:fill="ffffff" w:val="clear"/>
+        <w:ind w:left="0" w:firstLine="0"/>
+        <w:jc w:val="center"/>
+        <w:rPr>
+          <w:b w:val="1"/>
+          <w:bCs w:val="1"/>
+        </w:rPr>
       </w:pPr>
       <w:r>
         <w:rPr>
@@ -1737,6 +2590,41 @@
               <w:rPr/>
             </w:pPr>
             <w:r>
+              <w:rPr/>
+              <w:drawing>
+                <wp:inline distB="114300" distT="114300" distL="114300" distR="114300">
+                  <wp:extent cx="5810250" cy="1701800"/>
+                  <wp:effectExtent b="0" l="0" r="0" t="0"/>
+                  <wp:docPr id="1" name="image1.png"/>
+                  <a:graphic>
+                    <a:graphicData uri="http://schemas.openxmlformats.org/drawingml/2006/picture">
+                      <pic:pic>
+                        <pic:nvPicPr>
+                          <pic:cNvPr id="0" name="image1.png"/>
+                          <pic:cNvPicPr preferRelativeResize="0"/>
+                        </pic:nvPicPr>
+                        <pic:blipFill>
+                          <a:blip r:embed="rId8"/>
+                          <a:srcRect b="0" l="0" r="0" t="0"/>
+                          <a:stretch>
+                            <a:fillRect/>
+                          </a:stretch>
+                        </pic:blipFill>
+                        <pic:spPr>
+                          <a:xfrm>
+                            <a:off x="0" y="0"/>
+                            <a:ext cx="5810250" cy="1701800"/>
+                          </a:xfrm>
+                          <a:prstGeom prst="rect"/>
+                          <a:ln/>
+                        </pic:spPr>
+                      </pic:pic>
+                    </a:graphicData>
+                  </a:graphic>
+                </wp:inline>
+              </w:drawing>
+            </w:r>
+            <w:r>
               <w:rPr>
                 <w:rtl w:val="0"/>
               </w:rPr>
@@ -1874,6 +2762,10 @@
               <w:keepLines w:val="0"/>
               <w:pageBreakBefore w:val="0"/>
               <w:widowControl w:val="0"/>
+              <w:numPr>
+                <w:ilvl w:val="0"/>
+                <w:numId w:val="10"/>
+              </w:numPr>
               <w:pBdr>
                 <w:top w:space="0" w:sz="0" w:val="nil"/>
                 <w:left w:space="0" w:sz="0" w:val="nil"/>
@@ -1883,15 +2775,17 @@
               </w:pBdr>
               <w:shd w:fill="auto" w:val="clear"/>
               <w:spacing w:after="0" w:before="0" w:line="480" w:lineRule="auto"/>
-              <w:ind w:left="0" w:right="0" w:firstLine="0"/>
+              <w:ind w:left="720" w:right="0" w:hanging="360"/>
               <w:jc w:val="left"/>
-              <w:rPr/>
-            </w:pPr>
-            <w:r>
-              <w:rPr>
-                <w:rtl w:val="0"/>
-              </w:rPr>
-              <w:t xml:space="preserve">1)</w:t>
+              <w:rPr>
+                <w:u w:val="none"/>
+              </w:rPr>
+            </w:pPr>
+            <w:r>
+              <w:rPr>
+                <w:rtl w:val="0"/>
+              </w:rPr>
+              <w:t xml:space="preserve">Find information about a country and the hidden gems </w:t>
             </w:r>
           </w:p>
           <w:p>
@@ -1900,6 +2794,10 @@
               <w:keepLines w:val="0"/>
               <w:pageBreakBefore w:val="0"/>
               <w:widowControl w:val="0"/>
+              <w:numPr>
+                <w:ilvl w:val="0"/>
+                <w:numId w:val="10"/>
+              </w:numPr>
               <w:pBdr>
                 <w:top w:space="0" w:sz="0" w:val="nil"/>
                 <w:left w:space="0" w:sz="0" w:val="nil"/>
@@ -1909,15 +2807,17 @@
               </w:pBdr>
               <w:shd w:fill="auto" w:val="clear"/>
               <w:spacing w:after="0" w:before="0" w:line="480" w:lineRule="auto"/>
-              <w:ind w:left="0" w:right="0" w:firstLine="0"/>
+              <w:ind w:left="720" w:right="0" w:hanging="360"/>
               <w:jc w:val="left"/>
-              <w:rPr/>
-            </w:pPr>
-            <w:r>
-              <w:rPr>
-                <w:rtl w:val="0"/>
-              </w:rPr>
-              <w:t xml:space="preserve">2)</w:t>
+              <w:rPr>
+                <w:u w:val="none"/>
+              </w:rPr>
+            </w:pPr>
+            <w:r>
+              <w:rPr>
+                <w:rtl w:val="0"/>
+              </w:rPr>
+              <w:t xml:space="preserve">Access the Trips page</w:t>
             </w:r>
           </w:p>
           <w:p>
@@ -1926,6 +2826,10 @@
               <w:keepLines w:val="0"/>
               <w:pageBreakBefore w:val="0"/>
               <w:widowControl w:val="0"/>
+              <w:numPr>
+                <w:ilvl w:val="0"/>
+                <w:numId w:val="10"/>
+              </w:numPr>
               <w:pBdr>
                 <w:top w:space="0" w:sz="0" w:val="nil"/>
                 <w:left w:space="0" w:sz="0" w:val="nil"/>
@@ -1935,15 +2839,17 @@
               </w:pBdr>
               <w:shd w:fill="auto" w:val="clear"/>
               <w:spacing w:after="0" w:before="0" w:line="480" w:lineRule="auto"/>
-              <w:ind w:left="0" w:right="0" w:firstLine="0"/>
+              <w:ind w:left="720" w:right="0" w:hanging="360"/>
               <w:jc w:val="left"/>
-              <w:rPr/>
-            </w:pPr>
-            <w:r>
-              <w:rPr>
-                <w:rtl w:val="0"/>
-              </w:rPr>
-              <w:t xml:space="preserve">3)</w:t>
+              <w:rPr>
+                <w:u w:val="none"/>
+              </w:rPr>
+            </w:pPr>
+            <w:r>
+              <w:rPr>
+                <w:rtl w:val="0"/>
+              </w:rPr>
+              <w:t xml:space="preserve">Compare flight prices for a destination</w:t>
             </w:r>
           </w:p>
           <w:p>
@@ -1952,6 +2858,10 @@
               <w:keepLines w:val="0"/>
               <w:pageBreakBefore w:val="0"/>
               <w:widowControl w:val="0"/>
+              <w:numPr>
+                <w:ilvl w:val="0"/>
+                <w:numId w:val="10"/>
+              </w:numPr>
               <w:pBdr>
                 <w:top w:space="0" w:sz="0" w:val="nil"/>
                 <w:left w:space="0" w:sz="0" w:val="nil"/>
@@ -1961,15 +2871,17 @@
               </w:pBdr>
               <w:shd w:fill="auto" w:val="clear"/>
               <w:spacing w:after="0" w:before="0" w:line="480" w:lineRule="auto"/>
-              <w:ind w:left="0" w:right="0" w:firstLine="0"/>
+              <w:ind w:left="720" w:right="0" w:hanging="360"/>
               <w:jc w:val="left"/>
-              <w:rPr/>
-            </w:pPr>
-            <w:r>
-              <w:rPr>
-                <w:rtl w:val="0"/>
-              </w:rPr>
-              <w:t xml:space="preserve">4)</w:t>
+              <w:rPr>
+                <w:u w:val="none"/>
+              </w:rPr>
+            </w:pPr>
+            <w:r>
+              <w:rPr>
+                <w:rtl w:val="0"/>
+              </w:rPr>
+              <w:t xml:space="preserve">Find the payments page</w:t>
             </w:r>
           </w:p>
           <w:p>
@@ -1978,6 +2890,10 @@
               <w:keepLines w:val="0"/>
               <w:pageBreakBefore w:val="0"/>
               <w:widowControl w:val="0"/>
+              <w:numPr>
+                <w:ilvl w:val="0"/>
+                <w:numId w:val="10"/>
+              </w:numPr>
               <w:pBdr>
                 <w:top w:space="0" w:sz="0" w:val="nil"/>
                 <w:left w:space="0" w:sz="0" w:val="nil"/>
@@ -1987,15 +2903,17 @@
               </w:pBdr>
               <w:shd w:fill="auto" w:val="clear"/>
               <w:spacing w:after="0" w:before="0" w:line="480" w:lineRule="auto"/>
-              <w:ind w:left="0" w:right="0" w:firstLine="0"/>
+              <w:ind w:left="720" w:right="0" w:hanging="360"/>
               <w:jc w:val="left"/>
-              <w:rPr/>
-            </w:pPr>
-            <w:r>
-              <w:rPr>
-                <w:rtl w:val="0"/>
-              </w:rPr>
-              <w:t xml:space="preserve">5)</w:t>
+              <w:rPr>
+                <w:u w:val="none"/>
+              </w:rPr>
+            </w:pPr>
+            <w:r>
+              <w:rPr>
+                <w:rtl w:val="0"/>
+              </w:rPr>
+              <w:t xml:space="preserve">Access the travel checklist</w:t>
             </w:r>
           </w:p>
         </w:tc>
@@ -2032,6 +2950,259 @@
         <w:shd w:fill="ffffff" w:val="clear"/>
         <w:ind w:left="0" w:firstLine="0"/>
         <w:rPr/>
+      </w:pPr>
+      <w:r>
+        <w:rPr>
+          <w:rtl w:val="0"/>
+        </w:rPr>
+      </w:r>
+    </w:p>
+    <w:p>
+      <w:pPr>
+        <w:pBdr>
+          <w:top w:color="auto" w:space="0" w:sz="0" w:val="none"/>
+          <w:left w:color="auto" w:space="0" w:sz="0" w:val="none"/>
+          <w:bottom w:color="auto" w:space="0" w:sz="0" w:val="none"/>
+          <w:right w:color="auto" w:space="0" w:sz="0" w:val="none"/>
+          <w:between w:color="auto" w:space="0" w:sz="0" w:val="none"/>
+        </w:pBdr>
+        <w:shd w:fill="ffffff" w:val="clear"/>
+        <w:ind w:left="0" w:firstLine="0"/>
+        <w:jc w:val="center"/>
+        <w:rPr>
+          <w:b w:val="1"/>
+          <w:bCs w:val="1"/>
+        </w:rPr>
+      </w:pPr>
+      <w:r>
+        <w:rPr>
+          <w:rtl w:val="0"/>
+        </w:rPr>
+      </w:r>
+    </w:p>
+    <w:p>
+      <w:pPr>
+        <w:pBdr>
+          <w:top w:color="auto" w:space="0" w:sz="0" w:val="none"/>
+          <w:left w:color="auto" w:space="0" w:sz="0" w:val="none"/>
+          <w:bottom w:color="auto" w:space="0" w:sz="0" w:val="none"/>
+          <w:right w:color="auto" w:space="0" w:sz="0" w:val="none"/>
+          <w:between w:color="auto" w:space="0" w:sz="0" w:val="none"/>
+        </w:pBdr>
+        <w:shd w:fill="ffffff" w:val="clear"/>
+        <w:ind w:left="0" w:firstLine="0"/>
+        <w:jc w:val="center"/>
+        <w:rPr>
+          <w:b w:val="1"/>
+          <w:bCs w:val="1"/>
+        </w:rPr>
+      </w:pPr>
+      <w:r>
+        <w:rPr>
+          <w:rtl w:val="0"/>
+        </w:rPr>
+      </w:r>
+    </w:p>
+    <w:p>
+      <w:pPr>
+        <w:pBdr>
+          <w:top w:color="auto" w:space="0" w:sz="0" w:val="none"/>
+          <w:left w:color="auto" w:space="0" w:sz="0" w:val="none"/>
+          <w:bottom w:color="auto" w:space="0" w:sz="0" w:val="none"/>
+          <w:right w:color="auto" w:space="0" w:sz="0" w:val="none"/>
+          <w:between w:color="auto" w:space="0" w:sz="0" w:val="none"/>
+        </w:pBdr>
+        <w:shd w:fill="ffffff" w:val="clear"/>
+        <w:ind w:left="0" w:firstLine="0"/>
+        <w:jc w:val="center"/>
+        <w:rPr>
+          <w:b w:val="1"/>
+          <w:bCs w:val="1"/>
+        </w:rPr>
+      </w:pPr>
+      <w:r>
+        <w:rPr>
+          <w:rtl w:val="0"/>
+        </w:rPr>
+      </w:r>
+    </w:p>
+    <w:p>
+      <w:pPr>
+        <w:pBdr>
+          <w:top w:color="auto" w:space="0" w:sz="0" w:val="none"/>
+          <w:left w:color="auto" w:space="0" w:sz="0" w:val="none"/>
+          <w:bottom w:color="auto" w:space="0" w:sz="0" w:val="none"/>
+          <w:right w:color="auto" w:space="0" w:sz="0" w:val="none"/>
+          <w:between w:color="auto" w:space="0" w:sz="0" w:val="none"/>
+        </w:pBdr>
+        <w:shd w:fill="ffffff" w:val="clear"/>
+        <w:ind w:left="0" w:firstLine="0"/>
+        <w:jc w:val="center"/>
+        <w:rPr>
+          <w:b w:val="1"/>
+          <w:bCs w:val="1"/>
+        </w:rPr>
+      </w:pPr>
+      <w:r>
+        <w:rPr>
+          <w:rtl w:val="0"/>
+        </w:rPr>
+      </w:r>
+    </w:p>
+    <w:p>
+      <w:pPr>
+        <w:pBdr>
+          <w:top w:color="auto" w:space="0" w:sz="0" w:val="none"/>
+          <w:left w:color="auto" w:space="0" w:sz="0" w:val="none"/>
+          <w:bottom w:color="auto" w:space="0" w:sz="0" w:val="none"/>
+          <w:right w:color="auto" w:space="0" w:sz="0" w:val="none"/>
+          <w:between w:color="auto" w:space="0" w:sz="0" w:val="none"/>
+        </w:pBdr>
+        <w:shd w:fill="ffffff" w:val="clear"/>
+        <w:ind w:left="0" w:firstLine="0"/>
+        <w:jc w:val="center"/>
+        <w:rPr>
+          <w:b w:val="1"/>
+          <w:bCs w:val="1"/>
+        </w:rPr>
+      </w:pPr>
+      <w:r>
+        <w:rPr>
+          <w:rtl w:val="0"/>
+        </w:rPr>
+      </w:r>
+    </w:p>
+    <w:p>
+      <w:pPr>
+        <w:pBdr>
+          <w:top w:color="auto" w:space="0" w:sz="0" w:val="none"/>
+          <w:left w:color="auto" w:space="0" w:sz="0" w:val="none"/>
+          <w:bottom w:color="auto" w:space="0" w:sz="0" w:val="none"/>
+          <w:right w:color="auto" w:space="0" w:sz="0" w:val="none"/>
+          <w:between w:color="auto" w:space="0" w:sz="0" w:val="none"/>
+        </w:pBdr>
+        <w:shd w:fill="ffffff" w:val="clear"/>
+        <w:ind w:left="0" w:firstLine="0"/>
+        <w:jc w:val="center"/>
+        <w:rPr>
+          <w:b w:val="1"/>
+          <w:bCs w:val="1"/>
+        </w:rPr>
+      </w:pPr>
+      <w:r>
+        <w:rPr>
+          <w:rtl w:val="0"/>
+        </w:rPr>
+      </w:r>
+    </w:p>
+    <w:p>
+      <w:pPr>
+        <w:pBdr>
+          <w:top w:color="auto" w:space="0" w:sz="0" w:val="none"/>
+          <w:left w:color="auto" w:space="0" w:sz="0" w:val="none"/>
+          <w:bottom w:color="auto" w:space="0" w:sz="0" w:val="none"/>
+          <w:right w:color="auto" w:space="0" w:sz="0" w:val="none"/>
+          <w:between w:color="auto" w:space="0" w:sz="0" w:val="none"/>
+        </w:pBdr>
+        <w:shd w:fill="ffffff" w:val="clear"/>
+        <w:ind w:left="0" w:firstLine="0"/>
+        <w:jc w:val="center"/>
+        <w:rPr>
+          <w:b w:val="1"/>
+          <w:bCs w:val="1"/>
+        </w:rPr>
+      </w:pPr>
+      <w:r>
+        <w:rPr>
+          <w:rtl w:val="0"/>
+        </w:rPr>
+      </w:r>
+    </w:p>
+    <w:p>
+      <w:pPr>
+        <w:pBdr>
+          <w:top w:color="auto" w:space="0" w:sz="0" w:val="none"/>
+          <w:left w:color="auto" w:space="0" w:sz="0" w:val="none"/>
+          <w:bottom w:color="auto" w:space="0" w:sz="0" w:val="none"/>
+          <w:right w:color="auto" w:space="0" w:sz="0" w:val="none"/>
+          <w:between w:color="auto" w:space="0" w:sz="0" w:val="none"/>
+        </w:pBdr>
+        <w:shd w:fill="ffffff" w:val="clear"/>
+        <w:ind w:left="0" w:firstLine="0"/>
+        <w:jc w:val="center"/>
+        <w:rPr>
+          <w:b w:val="1"/>
+          <w:bCs w:val="1"/>
+        </w:rPr>
+      </w:pPr>
+      <w:r>
+        <w:rPr>
+          <w:rtl w:val="0"/>
+        </w:rPr>
+      </w:r>
+    </w:p>
+    <w:p>
+      <w:pPr>
+        <w:pBdr>
+          <w:top w:color="auto" w:space="0" w:sz="0" w:val="none"/>
+          <w:left w:color="auto" w:space="0" w:sz="0" w:val="none"/>
+          <w:bottom w:color="auto" w:space="0" w:sz="0" w:val="none"/>
+          <w:right w:color="auto" w:space="0" w:sz="0" w:val="none"/>
+          <w:between w:color="auto" w:space="0" w:sz="0" w:val="none"/>
+        </w:pBdr>
+        <w:shd w:fill="ffffff" w:val="clear"/>
+        <w:ind w:left="0" w:firstLine="0"/>
+        <w:jc w:val="center"/>
+        <w:rPr>
+          <w:b w:val="1"/>
+          <w:bCs w:val="1"/>
+        </w:rPr>
+      </w:pPr>
+      <w:r>
+        <w:rPr>
+          <w:rtl w:val="0"/>
+        </w:rPr>
+      </w:r>
+    </w:p>
+    <w:p>
+      <w:pPr>
+        <w:pBdr>
+          <w:top w:color="auto" w:space="0" w:sz="0" w:val="none"/>
+          <w:left w:color="auto" w:space="0" w:sz="0" w:val="none"/>
+          <w:bottom w:color="auto" w:space="0" w:sz="0" w:val="none"/>
+          <w:right w:color="auto" w:space="0" w:sz="0" w:val="none"/>
+          <w:between w:color="auto" w:space="0" w:sz="0" w:val="none"/>
+        </w:pBdr>
+        <w:shd w:fill="ffffff" w:val="clear"/>
+        <w:ind w:left="0" w:firstLine="0"/>
+        <w:jc w:val="center"/>
+        <w:rPr>
+          <w:b w:val="1"/>
+          <w:bCs w:val="1"/>
+        </w:rPr>
+      </w:pPr>
+      <w:r>
+        <w:rPr>
+          <w:rtl w:val="0"/>
+        </w:rPr>
+      </w:r>
+    </w:p>
+    <w:p>
+      <w:pPr>
+        <w:pBdr>
+          <w:top w:color="auto" w:space="0" w:sz="0" w:val="none"/>
+          <w:left w:color="auto" w:space="0" w:sz="0" w:val="none"/>
+          <w:bottom w:color="auto" w:space="0" w:sz="0" w:val="none"/>
+          <w:right w:color="auto" w:space="0" w:sz="0" w:val="none"/>
+          <w:between w:color="auto" w:space="0" w:sz="0" w:val="none"/>
+        </w:pBdr>
+        <w:shd w:fill="ffffff" w:val="clear"/>
+        <w:ind w:left="0" w:firstLine="0"/>
+        <w:jc w:val="center"/>
+        <w:rPr>
+          <w:b w:val="1"/>
+          <w:bCs w:val="1"/>
+        </w:rPr>
       </w:pPr>
       <w:r>
         <w:rPr>
@@ -2157,6 +3328,10 @@
           <w:p>
             <w:pPr>
               <w:widowControl w:val="0"/>
+              <w:numPr>
+                <w:ilvl w:val="0"/>
+                <w:numId w:val="6"/>
+              </w:numPr>
               <w:pBdr>
                 <w:top w:color="auto" w:space="0" w:sz="0" w:val="none"/>
                 <w:bottom w:color="auto" w:space="0" w:sz="0" w:val="none"/>
@@ -2164,12 +3339,13 @@
                 <w:between w:color="auto" w:space="0" w:sz="0" w:val="none"/>
               </w:pBdr>
               <w:spacing w:line="480" w:lineRule="auto"/>
-              <w:ind w:left="0" w:firstLine="0"/>
+              <w:ind w:left="720" w:hanging="360"/>
               <w:rPr>
                 <w:rFonts w:ascii="Roboto" w:cs="Roboto" w:eastAsia="Roboto" w:hAnsi="Roboto"/>
                 <w:color w:val="1d2125"/>
                 <w:sz w:val="24"/>
                 <w:szCs w:val="24"/>
+                <w:u w:val="none"/>
               </w:rPr>
             </w:pPr>
             <w:r>
@@ -2180,12 +3356,16 @@
                 <w:szCs w:val="24"/>
                 <w:rtl w:val="0"/>
               </w:rPr>
-              <w:t xml:space="preserve">1)</w:t>
-            </w:r>
-          </w:p>
-          <w:p>
-            <w:pPr>
-              <w:widowControl w:val="0"/>
+              <w:t xml:space="preserve">Start at homepage, Book Trip, Destinations, Hidden Gems (10sec)</w:t>
+            </w:r>
+          </w:p>
+          <w:p>
+            <w:pPr>
+              <w:widowControl w:val="0"/>
+              <w:numPr>
+                <w:ilvl w:val="0"/>
+                <w:numId w:val="6"/>
+              </w:numPr>
               <w:pBdr>
                 <w:top w:color="auto" w:space="0" w:sz="0" w:val="none"/>
                 <w:bottom w:color="auto" w:space="0" w:sz="0" w:val="none"/>
@@ -2193,12 +3373,13 @@
                 <w:between w:color="auto" w:space="0" w:sz="0" w:val="none"/>
               </w:pBdr>
               <w:spacing w:line="480" w:lineRule="auto"/>
-              <w:ind w:left="0" w:firstLine="0"/>
+              <w:ind w:left="720" w:hanging="360"/>
               <w:rPr>
                 <w:rFonts w:ascii="Roboto" w:cs="Roboto" w:eastAsia="Roboto" w:hAnsi="Roboto"/>
                 <w:color w:val="1d2125"/>
                 <w:sz w:val="24"/>
                 <w:szCs w:val="24"/>
+                <w:u w:val="none"/>
               </w:rPr>
             </w:pPr>
             <w:r>
@@ -2209,12 +3390,16 @@
                 <w:szCs w:val="24"/>
                 <w:rtl w:val="0"/>
               </w:rPr>
-              <w:t xml:space="preserve">2)</w:t>
-            </w:r>
-          </w:p>
-          <w:p>
-            <w:pPr>
-              <w:widowControl w:val="0"/>
+              <w:t xml:space="preserve">Start at homepage, Account Information, Trips (5 secs)</w:t>
+            </w:r>
+          </w:p>
+          <w:p>
+            <w:pPr>
+              <w:widowControl w:val="0"/>
+              <w:numPr>
+                <w:ilvl w:val="0"/>
+                <w:numId w:val="6"/>
+              </w:numPr>
               <w:pBdr>
                 <w:top w:color="auto" w:space="0" w:sz="0" w:val="none"/>
                 <w:bottom w:color="auto" w:space="0" w:sz="0" w:val="none"/>
@@ -2222,7 +3407,7 @@
                 <w:between w:color="auto" w:space="0" w:sz="0" w:val="none"/>
               </w:pBdr>
               <w:spacing w:line="480" w:lineRule="auto"/>
-              <w:ind w:left="0" w:firstLine="0"/>
+              <w:ind w:left="720" w:hanging="360"/>
               <w:rPr>
                 <w:rFonts w:ascii="Roboto" w:cs="Roboto" w:eastAsia="Roboto" w:hAnsi="Roboto"/>
                 <w:color w:val="1d2125"/>
@@ -2238,12 +3423,16 @@
                 <w:szCs w:val="24"/>
                 <w:rtl w:val="0"/>
               </w:rPr>
-              <w:t xml:space="preserve">3)</w:t>
-            </w:r>
-          </w:p>
-          <w:p>
-            <w:pPr>
-              <w:widowControl w:val="0"/>
+              <w:t xml:space="preserve">Start at homepage, Book Trip, Destinations Page, Destination Information, Flight Price Comparison (12 secs)</w:t>
+            </w:r>
+          </w:p>
+          <w:p>
+            <w:pPr>
+              <w:widowControl w:val="0"/>
+              <w:numPr>
+                <w:ilvl w:val="0"/>
+                <w:numId w:val="6"/>
+              </w:numPr>
               <w:pBdr>
                 <w:top w:color="auto" w:space="0" w:sz="0" w:val="none"/>
                 <w:bottom w:color="auto" w:space="0" w:sz="0" w:val="none"/>
@@ -2251,12 +3440,13 @@
                 <w:between w:color="auto" w:space="0" w:sz="0" w:val="none"/>
               </w:pBdr>
               <w:spacing w:line="480" w:lineRule="auto"/>
-              <w:ind w:left="0" w:firstLine="0"/>
+              <w:ind w:left="720" w:hanging="360"/>
               <w:rPr>
                 <w:rFonts w:ascii="Roboto" w:cs="Roboto" w:eastAsia="Roboto" w:hAnsi="Roboto"/>
                 <w:color w:val="1d2125"/>
                 <w:sz w:val="24"/>
                 <w:szCs w:val="24"/>
+                <w:u w:val="none"/>
               </w:rPr>
             </w:pPr>
             <w:r>
@@ -2267,12 +3457,16 @@
                 <w:szCs w:val="24"/>
                 <w:rtl w:val="0"/>
               </w:rPr>
-              <w:t xml:space="preserve">4)</w:t>
-            </w:r>
-          </w:p>
-          <w:p>
-            <w:pPr>
-              <w:widowControl w:val="0"/>
+              <w:t xml:space="preserve">Start at homepage, Account, Payments (5 secs)</w:t>
+            </w:r>
+          </w:p>
+          <w:p>
+            <w:pPr>
+              <w:widowControl w:val="0"/>
+              <w:numPr>
+                <w:ilvl w:val="0"/>
+                <w:numId w:val="6"/>
+              </w:numPr>
               <w:pBdr>
                 <w:top w:color="auto" w:space="0" w:sz="0" w:val="none"/>
                 <w:bottom w:color="auto" w:space="0" w:sz="0" w:val="none"/>
@@ -2280,8 +3474,10 @@
                 <w:between w:color="auto" w:space="0" w:sz="0" w:val="none"/>
               </w:pBdr>
               <w:spacing w:line="480" w:lineRule="auto"/>
-              <w:ind w:left="0" w:firstLine="0"/>
-              <w:rPr/>
+              <w:ind w:left="720" w:hanging="360"/>
+              <w:rPr>
+                <w:u w:val="none"/>
+              </w:rPr>
             </w:pPr>
             <w:r>
               <w:rPr>
@@ -2291,7 +3487,7 @@
                 <w:szCs w:val="24"/>
                 <w:rtl w:val="0"/>
               </w:rPr>
-              <w:t xml:space="preserve">5)</w:t>
+              <w:t xml:space="preserve">Start at homepage, Travel Checklist (3 secs)</w:t>
             </w:r>
             <w:r>
               <w:rPr>
@@ -2544,6 +3740,7 @@
       <w:tr>
         <w:trPr>
           <w:cantSplit w:val="0"/>
+          <w:trHeight w:val="3510.46875" w:hRule="atLeast"/>
           <w:tblHeader w:val="0"/>
         </w:trPr>
         <w:tc>
@@ -2560,6 +3757,10 @@
           <w:p>
             <w:pPr>
               <w:widowControl w:val="0"/>
+              <w:numPr>
+                <w:ilvl w:val="0"/>
+                <w:numId w:val="1"/>
+              </w:numPr>
               <w:pBdr>
                 <w:top w:color="auto" w:space="0" w:sz="0" w:val="none"/>
                 <w:bottom w:color="auto" w:space="0" w:sz="0" w:val="none"/>
@@ -2567,8 +3768,11 @@
                 <w:between w:color="auto" w:space="0" w:sz="0" w:val="none"/>
               </w:pBdr>
               <w:spacing w:line="480" w:lineRule="auto"/>
+              <w:ind w:left="720" w:hanging="360"/>
               <w:rPr>
                 <w:rFonts w:ascii="Roboto" w:cs="Roboto" w:eastAsia="Roboto" w:hAnsi="Roboto"/>
+                <w:b w:val="1"/>
+                <w:bCs w:val="1"/>
                 <w:color w:val="1d2125"/>
                 <w:sz w:val="24"/>
                 <w:szCs w:val="24"/>
@@ -2577,17 +3781,54 @@
             <w:r>
               <w:rPr>
                 <w:rFonts w:ascii="Roboto" w:cs="Roboto" w:eastAsia="Roboto" w:hAnsi="Roboto"/>
+                <w:b w:val="1"/>
+                <w:bCs w:val="1"/>
                 <w:color w:val="1d2125"/>
                 <w:sz w:val="24"/>
                 <w:szCs w:val="24"/>
                 <w:rtl w:val="0"/>
               </w:rPr>
-              <w:t xml:space="preserve">1)</w:t>
-            </w:r>
-          </w:p>
-          <w:p>
-            <w:pPr>
-              <w:widowControl w:val="0"/>
+              <w:t xml:space="preserve">Home Page -&gt; Book a Trip -&gt; Destinations Page -&gt; Hidden Gems -&gt; </w:t>
+            </w:r>
+            <w:r>
+              <w:rPr>
+                <w:rFonts w:ascii="Roboto" w:cs="Roboto" w:eastAsia="Roboto" w:hAnsi="Roboto"/>
+                <w:b w:val="1"/>
+                <w:bCs w:val="1"/>
+                <w:i w:val="1"/>
+                <w:iCs w:val="1"/>
+                <w:color w:val="1d2125"/>
+                <w:sz w:val="24"/>
+                <w:szCs w:val="24"/>
+                <w:rtl w:val="0"/>
+              </w:rPr>
+              <w:t xml:space="preserve">Go back</w:t>
+            </w:r>
+            <w:r>
+              <w:rPr>
+                <w:rFonts w:ascii="Roboto" w:cs="Roboto" w:eastAsia="Roboto" w:hAnsi="Roboto"/>
+                <w:b w:val="1"/>
+                <w:bCs w:val="1"/>
+                <w:color w:val="1d2125"/>
+                <w:sz w:val="24"/>
+                <w:szCs w:val="24"/>
+                <w:rtl w:val="0"/>
+              </w:rPr>
+              <w:t xml:space="preserve"> -&gt; Destination Information</w:t>
+            </w:r>
+            <w:r>
+              <w:rPr>
+                <w:rtl w:val="0"/>
+              </w:rPr>
+            </w:r>
+          </w:p>
+          <w:p>
+            <w:pPr>
+              <w:widowControl w:val="0"/>
+              <w:numPr>
+                <w:ilvl w:val="0"/>
+                <w:numId w:val="4"/>
+              </w:numPr>
               <w:pBdr>
                 <w:top w:color="auto" w:space="0" w:sz="0" w:val="none"/>
                 <w:bottom w:color="auto" w:space="0" w:sz="0" w:val="none"/>
@@ -2595,6 +3836,7 @@
                 <w:between w:color="auto" w:space="0" w:sz="0" w:val="none"/>
               </w:pBdr>
               <w:spacing w:line="480" w:lineRule="auto"/>
+              <w:ind w:left="1440" w:hanging="360"/>
               <w:rPr>
                 <w:rFonts w:ascii="Roboto" w:cs="Roboto" w:eastAsia="Roboto" w:hAnsi="Roboto"/>
                 <w:color w:val="1d2125"/>
@@ -2610,12 +3852,16 @@
                 <w:szCs w:val="24"/>
                 <w:rtl w:val="0"/>
               </w:rPr>
-              <w:t xml:space="preserve">2)</w:t>
-            </w:r>
-          </w:p>
-          <w:p>
-            <w:pPr>
-              <w:widowControl w:val="0"/>
+              <w:t xml:space="preserve">This took approximately 10 seconds to access</w:t>
+            </w:r>
+          </w:p>
+          <w:p>
+            <w:pPr>
+              <w:widowControl w:val="0"/>
+              <w:numPr>
+                <w:ilvl w:val="0"/>
+                <w:numId w:val="1"/>
+              </w:numPr>
               <w:pBdr>
                 <w:top w:color="auto" w:space="0" w:sz="0" w:val="none"/>
                 <w:bottom w:color="auto" w:space="0" w:sz="0" w:val="none"/>
@@ -2623,8 +3869,11 @@
                 <w:between w:color="auto" w:space="0" w:sz="0" w:val="none"/>
               </w:pBdr>
               <w:spacing w:line="480" w:lineRule="auto"/>
+              <w:ind w:left="720" w:hanging="360"/>
               <w:rPr>
                 <w:rFonts w:ascii="Roboto" w:cs="Roboto" w:eastAsia="Roboto" w:hAnsi="Roboto"/>
+                <w:b w:val="1"/>
+                <w:bCs w:val="1"/>
                 <w:color w:val="1d2125"/>
                 <w:sz w:val="24"/>
                 <w:szCs w:val="24"/>
@@ -2633,17 +3882,23 @@
             <w:r>
               <w:rPr>
                 <w:rFonts w:ascii="Roboto" w:cs="Roboto" w:eastAsia="Roboto" w:hAnsi="Roboto"/>
+                <w:b w:val="1"/>
+                <w:bCs w:val="1"/>
                 <w:color w:val="1d2125"/>
                 <w:sz w:val="24"/>
                 <w:szCs w:val="24"/>
                 <w:rtl w:val="0"/>
               </w:rPr>
-              <w:t xml:space="preserve">3)</w:t>
-            </w:r>
-          </w:p>
-          <w:p>
-            <w:pPr>
-              <w:widowControl w:val="0"/>
+              <w:t xml:space="preserve">Home Page -&gt; Account -&gt; Trips</w:t>
+            </w:r>
+          </w:p>
+          <w:p>
+            <w:pPr>
+              <w:widowControl w:val="0"/>
+              <w:numPr>
+                <w:ilvl w:val="0"/>
+                <w:numId w:val="5"/>
+              </w:numPr>
               <w:pBdr>
                 <w:top w:color="auto" w:space="0" w:sz="0" w:val="none"/>
                 <w:bottom w:color="auto" w:space="0" w:sz="0" w:val="none"/>
@@ -2651,11 +3906,13 @@
                 <w:between w:color="auto" w:space="0" w:sz="0" w:val="none"/>
               </w:pBdr>
               <w:spacing w:line="480" w:lineRule="auto"/>
+              <w:ind w:left="1440" w:hanging="360"/>
               <w:rPr>
                 <w:rFonts w:ascii="Roboto" w:cs="Roboto" w:eastAsia="Roboto" w:hAnsi="Roboto"/>
                 <w:color w:val="1d2125"/>
                 <w:sz w:val="24"/>
                 <w:szCs w:val="24"/>
+                <w:u w:val="none"/>
               </w:rPr>
             </w:pPr>
             <w:r>
@@ -2666,12 +3923,16 @@
                 <w:szCs w:val="24"/>
                 <w:rtl w:val="0"/>
               </w:rPr>
-              <w:t xml:space="preserve">4)</w:t>
-            </w:r>
-          </w:p>
-          <w:p>
-            <w:pPr>
-              <w:widowControl w:val="0"/>
+              <w:t xml:space="preserve">This took approximately 6 seconds to access</w:t>
+            </w:r>
+          </w:p>
+          <w:p>
+            <w:pPr>
+              <w:widowControl w:val="0"/>
+              <w:numPr>
+                <w:ilvl w:val="0"/>
+                <w:numId w:val="1"/>
+              </w:numPr>
               <w:pBdr>
                 <w:top w:color="auto" w:space="0" w:sz="0" w:val="none"/>
                 <w:bottom w:color="auto" w:space="0" w:sz="0" w:val="none"/>
@@ -2679,11 +3940,50 @@
                 <w:between w:color="auto" w:space="0" w:sz="0" w:val="none"/>
               </w:pBdr>
               <w:spacing w:line="480" w:lineRule="auto"/>
+              <w:ind w:left="720" w:hanging="360"/>
+              <w:rPr>
+                <w:rFonts w:ascii="Roboto" w:cs="Roboto" w:eastAsia="Roboto" w:hAnsi="Roboto"/>
+                <w:b w:val="1"/>
+                <w:bCs w:val="1"/>
+                <w:color w:val="1d2125"/>
+                <w:sz w:val="24"/>
+                <w:szCs w:val="24"/>
+              </w:rPr>
+            </w:pPr>
+            <w:r>
+              <w:rPr>
+                <w:rFonts w:ascii="Roboto" w:cs="Roboto" w:eastAsia="Roboto" w:hAnsi="Roboto"/>
+                <w:b w:val="1"/>
+                <w:bCs w:val="1"/>
+                <w:color w:val="1d2125"/>
+                <w:sz w:val="24"/>
+                <w:szCs w:val="24"/>
+                <w:rtl w:val="0"/>
+              </w:rPr>
+              <w:t xml:space="preserve">Home Page -&gt; Book a Trip -&gt; Destinations Page -&gt; Destination Information -&gt; Flight Price Comparison</w:t>
+            </w:r>
+          </w:p>
+          <w:p>
+            <w:pPr>
+              <w:widowControl w:val="0"/>
+              <w:numPr>
+                <w:ilvl w:val="0"/>
+                <w:numId w:val="2"/>
+              </w:numPr>
+              <w:pBdr>
+                <w:top w:color="auto" w:space="0" w:sz="0" w:val="none"/>
+                <w:bottom w:color="auto" w:space="0" w:sz="0" w:val="none"/>
+                <w:right w:color="auto" w:space="0" w:sz="0" w:val="none"/>
+                <w:between w:color="auto" w:space="0" w:sz="0" w:val="none"/>
+              </w:pBdr>
+              <w:spacing w:line="480" w:lineRule="auto"/>
+              <w:ind w:left="1440" w:hanging="360"/>
               <w:rPr>
                 <w:rFonts w:ascii="Roboto" w:cs="Roboto" w:eastAsia="Roboto" w:hAnsi="Roboto"/>
                 <w:color w:val="1d2125"/>
                 <w:sz w:val="24"/>
                 <w:szCs w:val="24"/>
+                <w:u w:val="none"/>
               </w:rPr>
             </w:pPr>
             <w:r>
@@ -2694,7 +3994,189 @@
                 <w:szCs w:val="24"/>
                 <w:rtl w:val="0"/>
               </w:rPr>
-              <w:t xml:space="preserve">5)</w:t>
+              <w:t xml:space="preserve">This took approximately 12 seconds to access</w:t>
+            </w:r>
+          </w:p>
+          <w:p>
+            <w:pPr>
+              <w:widowControl w:val="0"/>
+              <w:numPr>
+                <w:ilvl w:val="0"/>
+                <w:numId w:val="1"/>
+              </w:numPr>
+              <w:pBdr>
+                <w:top w:color="auto" w:space="0" w:sz="0" w:val="none"/>
+                <w:bottom w:color="auto" w:space="0" w:sz="0" w:val="none"/>
+                <w:right w:color="auto" w:space="0" w:sz="0" w:val="none"/>
+                <w:between w:color="auto" w:space="0" w:sz="0" w:val="none"/>
+              </w:pBdr>
+              <w:spacing w:line="480" w:lineRule="auto"/>
+              <w:ind w:left="720" w:hanging="360"/>
+              <w:rPr>
+                <w:rFonts w:ascii="Roboto" w:cs="Roboto" w:eastAsia="Roboto" w:hAnsi="Roboto"/>
+                <w:b w:val="1"/>
+                <w:bCs w:val="1"/>
+                <w:color w:val="1d2125"/>
+                <w:sz w:val="24"/>
+                <w:szCs w:val="24"/>
+              </w:rPr>
+            </w:pPr>
+            <w:r>
+              <w:rPr>
+                <w:rFonts w:ascii="Roboto" w:cs="Roboto" w:eastAsia="Roboto" w:hAnsi="Roboto"/>
+                <w:b w:val="1"/>
+                <w:bCs w:val="1"/>
+                <w:color w:val="1d2125"/>
+                <w:sz w:val="24"/>
+                <w:szCs w:val="24"/>
+                <w:rtl w:val="0"/>
+              </w:rPr>
+              <w:t xml:space="preserve"> Home Page -&gt; Account -&gt; Payments</w:t>
+            </w:r>
+          </w:p>
+          <w:p>
+            <w:pPr>
+              <w:widowControl w:val="0"/>
+              <w:numPr>
+                <w:ilvl w:val="0"/>
+                <w:numId w:val="3"/>
+              </w:numPr>
+              <w:pBdr>
+                <w:top w:color="auto" w:space="0" w:sz="0" w:val="none"/>
+                <w:bottom w:color="auto" w:space="0" w:sz="0" w:val="none"/>
+                <w:right w:color="auto" w:space="0" w:sz="0" w:val="none"/>
+                <w:between w:color="auto" w:space="0" w:sz="0" w:val="none"/>
+              </w:pBdr>
+              <w:spacing w:line="480" w:lineRule="auto"/>
+              <w:ind w:left="1440" w:hanging="360"/>
+              <w:rPr>
+                <w:rFonts w:ascii="Roboto" w:cs="Roboto" w:eastAsia="Roboto" w:hAnsi="Roboto"/>
+                <w:color w:val="1d2125"/>
+                <w:sz w:val="24"/>
+                <w:szCs w:val="24"/>
+              </w:rPr>
+            </w:pPr>
+            <w:r>
+              <w:rPr>
+                <w:rFonts w:ascii="Roboto" w:cs="Roboto" w:eastAsia="Roboto" w:hAnsi="Roboto"/>
+                <w:color w:val="1d2125"/>
+                <w:sz w:val="24"/>
+                <w:szCs w:val="24"/>
+                <w:rtl w:val="0"/>
+              </w:rPr>
+              <w:t xml:space="preserve">This took approximately 6 seconds</w:t>
+            </w:r>
+          </w:p>
+          <w:p>
+            <w:pPr>
+              <w:widowControl w:val="0"/>
+              <w:numPr>
+                <w:ilvl w:val="0"/>
+                <w:numId w:val="1"/>
+              </w:numPr>
+              <w:pBdr>
+                <w:top w:color="auto" w:space="0" w:sz="0" w:val="none"/>
+                <w:bottom w:color="auto" w:space="0" w:sz="0" w:val="none"/>
+                <w:right w:color="auto" w:space="0" w:sz="0" w:val="none"/>
+                <w:between w:color="auto" w:space="0" w:sz="0" w:val="none"/>
+              </w:pBdr>
+              <w:spacing w:line="480" w:lineRule="auto"/>
+              <w:ind w:left="720" w:hanging="360"/>
+              <w:rPr>
+                <w:rFonts w:ascii="Roboto" w:cs="Roboto" w:eastAsia="Roboto" w:hAnsi="Roboto"/>
+                <w:b w:val="1"/>
+                <w:bCs w:val="1"/>
+                <w:color w:val="1d2125"/>
+                <w:sz w:val="24"/>
+                <w:szCs w:val="24"/>
+              </w:rPr>
+            </w:pPr>
+            <w:r>
+              <w:rPr>
+                <w:rFonts w:ascii="Roboto" w:cs="Roboto" w:eastAsia="Roboto" w:hAnsi="Roboto"/>
+                <w:b w:val="1"/>
+                <w:bCs w:val="1"/>
+                <w:color w:val="1d2125"/>
+                <w:sz w:val="24"/>
+                <w:szCs w:val="24"/>
+                <w:rtl w:val="0"/>
+              </w:rPr>
+              <w:t xml:space="preserve">Home Page -&gt; Travel Checklist</w:t>
+            </w:r>
+          </w:p>
+          <w:p>
+            <w:pPr>
+              <w:widowControl w:val="0"/>
+              <w:numPr>
+                <w:ilvl w:val="0"/>
+                <w:numId w:val="7"/>
+              </w:numPr>
+              <w:pBdr>
+                <w:top w:color="auto" w:space="0" w:sz="0" w:val="none"/>
+                <w:bottom w:color="auto" w:space="0" w:sz="0" w:val="none"/>
+                <w:right w:color="auto" w:space="0" w:sz="0" w:val="none"/>
+                <w:between w:color="auto" w:space="0" w:sz="0" w:val="none"/>
+              </w:pBdr>
+              <w:spacing w:line="480" w:lineRule="auto"/>
+              <w:ind w:left="1440" w:hanging="360"/>
+              <w:rPr>
+                <w:rFonts w:ascii="Roboto" w:cs="Roboto" w:eastAsia="Roboto" w:hAnsi="Roboto"/>
+                <w:color w:val="1d2125"/>
+                <w:sz w:val="24"/>
+                <w:szCs w:val="24"/>
+              </w:rPr>
+            </w:pPr>
+            <w:r>
+              <w:rPr>
+                <w:rFonts w:ascii="Roboto" w:cs="Roboto" w:eastAsia="Roboto" w:hAnsi="Roboto"/>
+                <w:color w:val="1d2125"/>
+                <w:sz w:val="24"/>
+                <w:szCs w:val="24"/>
+                <w:rtl w:val="0"/>
+              </w:rPr>
+              <w:t xml:space="preserve">This took approximately 2 seconds</w:t>
+            </w:r>
+          </w:p>
+        </w:tc>
+      </w:tr>
+      <w:tr>
+        <w:trPr>
+          <w:cantSplit w:val="0"/>
+          <w:tblHeader w:val="0"/>
+        </w:trPr>
+        <w:tc>
+          <w:tcPr>
+            <w:shd w:fill="auto" w:val="clear"/>
+            <w:tcMar>
+              <w:top w:w="100.0" w:type="dxa"/>
+              <w:left w:w="100.0" w:type="dxa"/>
+              <w:bottom w:w="100.0" w:type="dxa"/>
+              <w:right w:w="100.0" w:type="dxa"/>
+            </w:tcMar>
+            <w:vAlign w:val="top"/>
+          </w:tcPr>
+          <w:p>
+            <w:pPr>
+              <w:widowControl w:val="0"/>
+              <w:pBdr>
+                <w:top w:color="auto" w:space="0" w:sz="0" w:val="none"/>
+                <w:bottom w:color="auto" w:space="0" w:sz="0" w:val="none"/>
+                <w:right w:color="auto" w:space="0" w:sz="0" w:val="none"/>
+                <w:between w:color="auto" w:space="0" w:sz="0" w:val="none"/>
+              </w:pBdr>
+              <w:spacing w:line="480" w:lineRule="auto"/>
+              <w:ind w:left="360" w:firstLine="0"/>
+              <w:rPr>
+                <w:rFonts w:ascii="Roboto" w:cs="Roboto" w:eastAsia="Roboto" w:hAnsi="Roboto"/>
+                <w:color w:val="1d2125"/>
+                <w:sz w:val="24"/>
+                <w:szCs w:val="24"/>
+              </w:rPr>
+            </w:pPr>
+            <w:r>
+              <w:rPr>
+                <w:rtl w:val="0"/>
+              </w:rPr>
             </w:r>
           </w:p>
         </w:tc>
@@ -3660,12 +5142,12 @@
         <w:tblLook w:val="0600"/>
       </w:tblPr>
       <w:tblGrid>
-        <w:gridCol w:w="4680"/>
-        <w:gridCol w:w="4680"/>
+        <w:gridCol w:w="4785"/>
+        <w:gridCol w:w="4575"/>
         <w:tblGridChange w:id="0">
           <w:tblGrid>
-            <w:gridCol w:w="4680"/>
-            <w:gridCol w:w="4680"/>
+            <w:gridCol w:w="4785"/>
+            <w:gridCol w:w="4575"/>
           </w:tblGrid>
         </w:tblGridChange>
       </w:tblGrid>
@@ -3795,15 +5277,13 @@
             <w:pPr>
               <w:widowControl w:val="0"/>
               <w:spacing w:line="240" w:lineRule="auto"/>
-              <w:rPr>
-                <w:b w:val="1"/>
-                <w:bCs w:val="1"/>
-              </w:rPr>
-            </w:pPr>
-            <w:r>
-              <w:rPr>
-                <w:rtl w:val="0"/>
-              </w:rPr>
+              <w:rPr/>
+            </w:pPr>
+            <w:r>
+              <w:rPr>
+                <w:rtl w:val="0"/>
+              </w:rPr>
+              <w:t xml:space="preserve">“Yes, the placement of each page was pretty accurate. It seemed very easy to find which direction i needed to go. Although, I think all of the information for each country should be on one page. Id like to be able to see everything in one spot so I’m not having to go back and forth from pages. If I had to say which to place it under, I would put it under the ‘Destination Information’ section as that seems the most relevant.”</w:t>
             </w:r>
           </w:p>
         </w:tc>
@@ -3867,15 +5347,13 @@
             <w:pPr>
               <w:widowControl w:val="0"/>
               <w:spacing w:line="240" w:lineRule="auto"/>
-              <w:rPr>
-                <w:b w:val="1"/>
-                <w:bCs w:val="1"/>
-              </w:rPr>
-            </w:pPr>
-            <w:r>
-              <w:rPr>
-                <w:rtl w:val="0"/>
-              </w:rPr>
+              <w:rPr/>
+            </w:pPr>
+            <w:r>
+              <w:rPr>
+                <w:rtl w:val="0"/>
+              </w:rPr>
+              <w:t xml:space="preserve">“I think i could have done it faster if I was actually looking at the website and able to click. But i feel as if the time I took was relatively fast”</w:t>
             </w:r>
           </w:p>
         </w:tc>
@@ -3940,15 +5418,13 @@
             <w:pPr>
               <w:widowControl w:val="0"/>
               <w:spacing w:line="240" w:lineRule="auto"/>
-              <w:rPr>
-                <w:b w:val="1"/>
-                <w:bCs w:val="1"/>
-              </w:rPr>
-            </w:pPr>
-            <w:r>
-              <w:rPr>
-                <w:rtl w:val="0"/>
-              </w:rPr>
+              <w:rPr/>
+            </w:pPr>
+            <w:r>
+              <w:rPr>
+                <w:rtl w:val="0"/>
+              </w:rPr>
+              <w:t xml:space="preserve">“I think the labeling was pretty good. It basically told me where each thing was, which I liked”</w:t>
             </w:r>
           </w:p>
         </w:tc>
@@ -4012,15 +5488,13 @@
             <w:pPr>
               <w:widowControl w:val="0"/>
               <w:spacing w:line="240" w:lineRule="auto"/>
-              <w:rPr>
-                <w:b w:val="1"/>
-                <w:bCs w:val="1"/>
-              </w:rPr>
-            </w:pPr>
-            <w:r>
-              <w:rPr>
-                <w:rtl w:val="0"/>
-              </w:rPr>
+              <w:rPr/>
+            </w:pPr>
+            <w:r>
+              <w:rPr>
+                <w:rtl w:val="0"/>
+              </w:rPr>
+              <w:t xml:space="preserve">“Maybe adding a section for the locations you have information on instead of having to go through “Book a Trip.”</w:t>
             </w:r>
           </w:p>
         </w:tc>
@@ -4244,15 +5718,13 @@
             <w:pPr>
               <w:widowControl w:val="0"/>
               <w:spacing w:line="240" w:lineRule="auto"/>
-              <w:rPr>
-                <w:b w:val="1"/>
-                <w:bCs w:val="1"/>
-              </w:rPr>
-            </w:pPr>
-            <w:r>
-              <w:rPr>
-                <w:rtl w:val="0"/>
-              </w:rPr>
+              <w:rPr/>
+            </w:pPr>
+            <w:r>
+              <w:rPr>
+                <w:rtl w:val="0"/>
+              </w:rPr>
+              <w:t xml:space="preserve">“”</w:t>
             </w:r>
           </w:p>
         </w:tc>
@@ -4800,7 +6272,7 @@
       </w:r>
     </w:p>
     <w:sectPr>
-      <w:headerReference r:id="rId8" w:type="default"/>
+      <w:headerReference r:id="rId9" w:type="default"/>
       <w:pgSz w:h="15840" w:w="12240" w:orient="portrait"/>
       <w:pgMar w:bottom="1440" w:top="1440" w:left="1440" w:right="1440" w:header="720" w:footer="720"/>
       <w:pgNumType w:start="1"/>
@@ -4878,11 +6350,121 @@
   <w:abstractNum w:abstractNumId="1">
     <w:lvl w:ilvl="0">
       <w:start w:val="1"/>
+      <w:numFmt w:val="decimal"/>
+      <w:lvlText w:val="%1)"/>
+      <w:lvlJc w:val="left"/>
+      <w:pPr>
+        <w:ind w:left="720" w:hanging="360"/>
+      </w:pPr>
+      <w:rPr>
+        <w:u w:val="none"/>
+      </w:rPr>
+    </w:lvl>
+    <w:lvl w:ilvl="1">
+      <w:start w:val="1"/>
+      <w:numFmt w:val="lowerLetter"/>
+      <w:lvlText w:val="%2)"/>
+      <w:lvlJc w:val="left"/>
+      <w:pPr>
+        <w:ind w:left="1440" w:hanging="360"/>
+      </w:pPr>
+      <w:rPr>
+        <w:u w:val="none"/>
+      </w:rPr>
+    </w:lvl>
+    <w:lvl w:ilvl="2">
+      <w:start w:val="1"/>
+      <w:numFmt w:val="lowerRoman"/>
+      <w:lvlText w:val="%3)"/>
+      <w:lvlJc w:val="right"/>
+      <w:pPr>
+        <w:ind w:left="2160" w:hanging="360"/>
+      </w:pPr>
+      <w:rPr>
+        <w:u w:val="none"/>
+      </w:rPr>
+    </w:lvl>
+    <w:lvl w:ilvl="3">
+      <w:start w:val="1"/>
+      <w:numFmt w:val="decimal"/>
+      <w:lvlText w:val="(%4)"/>
+      <w:lvlJc w:val="left"/>
+      <w:pPr>
+        <w:ind w:left="2880" w:hanging="360"/>
+      </w:pPr>
+      <w:rPr>
+        <w:u w:val="none"/>
+      </w:rPr>
+    </w:lvl>
+    <w:lvl w:ilvl="4">
+      <w:start w:val="1"/>
+      <w:numFmt w:val="lowerLetter"/>
+      <w:lvlText w:val="(%5)"/>
+      <w:lvlJc w:val="left"/>
+      <w:pPr>
+        <w:ind w:left="3600" w:hanging="360"/>
+      </w:pPr>
+      <w:rPr>
+        <w:u w:val="none"/>
+      </w:rPr>
+    </w:lvl>
+    <w:lvl w:ilvl="5">
+      <w:start w:val="1"/>
+      <w:numFmt w:val="lowerRoman"/>
+      <w:lvlText w:val="(%6)"/>
+      <w:lvlJc w:val="right"/>
+      <w:pPr>
+        <w:ind w:left="4320" w:hanging="360"/>
+      </w:pPr>
+      <w:rPr>
+        <w:u w:val="none"/>
+      </w:rPr>
+    </w:lvl>
+    <w:lvl w:ilvl="6">
+      <w:start w:val="1"/>
+      <w:numFmt w:val="decimal"/>
+      <w:lvlText w:val="%7."/>
+      <w:lvlJc w:val="left"/>
+      <w:pPr>
+        <w:ind w:left="5040" w:hanging="360"/>
+      </w:pPr>
+      <w:rPr>
+        <w:u w:val="none"/>
+      </w:rPr>
+    </w:lvl>
+    <w:lvl w:ilvl="7">
+      <w:start w:val="1"/>
+      <w:numFmt w:val="lowerLetter"/>
+      <w:lvlText w:val="%8."/>
+      <w:lvlJc w:val="left"/>
+      <w:pPr>
+        <w:ind w:left="5760" w:hanging="360"/>
+      </w:pPr>
+      <w:rPr>
+        <w:u w:val="none"/>
+      </w:rPr>
+    </w:lvl>
+    <w:lvl w:ilvl="8">
+      <w:start w:val="1"/>
+      <w:numFmt w:val="lowerRoman"/>
+      <w:lvlText w:val="%9."/>
+      <w:lvlJc w:val="right"/>
+      <w:pPr>
+        <w:ind w:left="6480" w:hanging="360"/>
+      </w:pPr>
+      <w:rPr>
+        <w:u w:val="none"/>
+      </w:rPr>
+    </w:lvl>
+  </w:abstractNum>
+  <w:abstractNum w:abstractNumId="2">
+    <w:lvl w:ilvl="0">
+      <w:start w:val="1"/>
       <w:numFmt w:val="bullet"/>
       <w:lvlText w:val="-"/>
       <w:lvlJc w:val="left"/>
       <w:pPr>
-        <w:ind w:left="720" w:hanging="360"/>
+        <w:ind w:left="1440" w:hanging="360"/>
       </w:pPr>
       <w:rPr>
         <w:u w:val="none"/>
@@ -4894,7 +6476,7 @@
       <w:lvlText w:val="-"/>
       <w:lvlJc w:val="left"/>
       <w:pPr>
-        <w:ind w:left="1440" w:hanging="360"/>
+        <w:ind w:left="2160" w:hanging="360"/>
       </w:pPr>
       <w:rPr>
         <w:u w:val="none"/>
@@ -4906,7 +6488,7 @@
       <w:lvlText w:val="-"/>
       <w:lvlJc w:val="left"/>
       <w:pPr>
-        <w:ind w:left="2160" w:hanging="360"/>
+        <w:ind w:left="2880" w:hanging="360"/>
       </w:pPr>
       <w:rPr>
         <w:u w:val="none"/>
@@ -4918,7 +6500,7 @@
       <w:lvlText w:val="-"/>
       <w:lvlJc w:val="left"/>
       <w:pPr>
-        <w:ind w:left="2880" w:hanging="360"/>
+        <w:ind w:left="3600" w:hanging="360"/>
       </w:pPr>
       <w:rPr>
         <w:u w:val="none"/>
@@ -4930,7 +6512,7 @@
       <w:lvlText w:val="-"/>
       <w:lvlJc w:val="left"/>
       <w:pPr>
-        <w:ind w:left="3600" w:hanging="360"/>
+        <w:ind w:left="4320" w:hanging="360"/>
       </w:pPr>
       <w:rPr>
         <w:u w:val="none"/>
@@ -4942,7 +6524,7 @@
       <w:lvlText w:val="-"/>
       <w:lvlJc w:val="left"/>
       <w:pPr>
-        <w:ind w:left="4320" w:hanging="360"/>
+        <w:ind w:left="5040" w:hanging="360"/>
       </w:pPr>
       <w:rPr>
         <w:u w:val="none"/>
@@ -4954,7 +6536,7 @@
       <w:lvlText w:val="-"/>
       <w:lvlJc w:val="left"/>
       <w:pPr>
-        <w:ind w:left="5040" w:hanging="360"/>
+        <w:ind w:left="5760" w:hanging="360"/>
       </w:pPr>
       <w:rPr>
         <w:u w:val="none"/>
@@ -4966,7 +6548,7 @@
       <w:lvlText w:val="-"/>
       <w:lvlJc w:val="left"/>
       <w:pPr>
-        <w:ind w:left="5760" w:hanging="360"/>
+        <w:ind w:left="6480" w:hanging="360"/>
       </w:pPr>
       <w:rPr>
         <w:u w:val="none"/>
@@ -4978,6 +6560,886 @@
       <w:lvlText w:val="-"/>
       <w:lvlJc w:val="left"/>
       <w:pPr>
+        <w:ind w:left="7200" w:hanging="360"/>
+      </w:pPr>
+      <w:rPr>
+        <w:u w:val="none"/>
+      </w:rPr>
+    </w:lvl>
+  </w:abstractNum>
+  <w:abstractNum w:abstractNumId="3">
+    <w:lvl w:ilvl="0">
+      <w:start w:val="1"/>
+      <w:numFmt w:val="bullet"/>
+      <w:lvlText w:val="-"/>
+      <w:lvlJc w:val="left"/>
+      <w:pPr>
+        <w:ind w:left="1440" w:hanging="360"/>
+      </w:pPr>
+      <w:rPr>
+        <w:u w:val="none"/>
+      </w:rPr>
+    </w:lvl>
+    <w:lvl w:ilvl="1">
+      <w:start w:val="1"/>
+      <w:numFmt w:val="bullet"/>
+      <w:lvlText w:val="-"/>
+      <w:lvlJc w:val="left"/>
+      <w:pPr>
+        <w:ind w:left="2160" w:hanging="360"/>
+      </w:pPr>
+      <w:rPr>
+        <w:u w:val="none"/>
+      </w:rPr>
+    </w:lvl>
+    <w:lvl w:ilvl="2">
+      <w:start w:val="1"/>
+      <w:numFmt w:val="bullet"/>
+      <w:lvlText w:val="-"/>
+      <w:lvlJc w:val="left"/>
+      <w:pPr>
+        <w:ind w:left="2880" w:hanging="360"/>
+      </w:pPr>
+      <w:rPr>
+        <w:u w:val="none"/>
+      </w:rPr>
+    </w:lvl>
+    <w:lvl w:ilvl="3">
+      <w:start w:val="1"/>
+      <w:numFmt w:val="bullet"/>
+      <w:lvlText w:val="-"/>
+      <w:lvlJc w:val="left"/>
+      <w:pPr>
+        <w:ind w:left="3600" w:hanging="360"/>
+      </w:pPr>
+      <w:rPr>
+        <w:u w:val="none"/>
+      </w:rPr>
+    </w:lvl>
+    <w:lvl w:ilvl="4">
+      <w:start w:val="1"/>
+      <w:numFmt w:val="bullet"/>
+      <w:lvlText w:val="-"/>
+      <w:lvlJc w:val="left"/>
+      <w:pPr>
+        <w:ind w:left="4320" w:hanging="360"/>
+      </w:pPr>
+      <w:rPr>
+        <w:u w:val="none"/>
+      </w:rPr>
+    </w:lvl>
+    <w:lvl w:ilvl="5">
+      <w:start w:val="1"/>
+      <w:numFmt w:val="bullet"/>
+      <w:lvlText w:val="-"/>
+      <w:lvlJc w:val="left"/>
+      <w:pPr>
+        <w:ind w:left="5040" w:hanging="360"/>
+      </w:pPr>
+      <w:rPr>
+        <w:u w:val="none"/>
+      </w:rPr>
+    </w:lvl>
+    <w:lvl w:ilvl="6">
+      <w:start w:val="1"/>
+      <w:numFmt w:val="bullet"/>
+      <w:lvlText w:val="-"/>
+      <w:lvlJc w:val="left"/>
+      <w:pPr>
+        <w:ind w:left="5760" w:hanging="360"/>
+      </w:pPr>
+      <w:rPr>
+        <w:u w:val="none"/>
+      </w:rPr>
+    </w:lvl>
+    <w:lvl w:ilvl="7">
+      <w:start w:val="1"/>
+      <w:numFmt w:val="bullet"/>
+      <w:lvlText w:val="-"/>
+      <w:lvlJc w:val="left"/>
+      <w:pPr>
+        <w:ind w:left="6480" w:hanging="360"/>
+      </w:pPr>
+      <w:rPr>
+        <w:u w:val="none"/>
+      </w:rPr>
+    </w:lvl>
+    <w:lvl w:ilvl="8">
+      <w:start w:val="1"/>
+      <w:numFmt w:val="bullet"/>
+      <w:lvlText w:val="-"/>
+      <w:lvlJc w:val="left"/>
+      <w:pPr>
+        <w:ind w:left="7200" w:hanging="360"/>
+      </w:pPr>
+      <w:rPr>
+        <w:u w:val="none"/>
+      </w:rPr>
+    </w:lvl>
+  </w:abstractNum>
+  <w:abstractNum w:abstractNumId="4">
+    <w:lvl w:ilvl="0">
+      <w:start w:val="1"/>
+      <w:numFmt w:val="bullet"/>
+      <w:lvlText w:val="-"/>
+      <w:lvlJc w:val="left"/>
+      <w:pPr>
+        <w:ind w:left="1440" w:hanging="360"/>
+      </w:pPr>
+      <w:rPr>
+        <w:u w:val="none"/>
+      </w:rPr>
+    </w:lvl>
+    <w:lvl w:ilvl="1">
+      <w:start w:val="1"/>
+      <w:numFmt w:val="bullet"/>
+      <w:lvlText w:val="-"/>
+      <w:lvlJc w:val="left"/>
+      <w:pPr>
+        <w:ind w:left="2160" w:hanging="360"/>
+      </w:pPr>
+      <w:rPr>
+        <w:u w:val="none"/>
+      </w:rPr>
+    </w:lvl>
+    <w:lvl w:ilvl="2">
+      <w:start w:val="1"/>
+      <w:numFmt w:val="bullet"/>
+      <w:lvlText w:val="-"/>
+      <w:lvlJc w:val="left"/>
+      <w:pPr>
+        <w:ind w:left="2880" w:hanging="360"/>
+      </w:pPr>
+      <w:rPr>
+        <w:u w:val="none"/>
+      </w:rPr>
+    </w:lvl>
+    <w:lvl w:ilvl="3">
+      <w:start w:val="1"/>
+      <w:numFmt w:val="bullet"/>
+      <w:lvlText w:val="-"/>
+      <w:lvlJc w:val="left"/>
+      <w:pPr>
+        <w:ind w:left="3600" w:hanging="360"/>
+      </w:pPr>
+      <w:rPr>
+        <w:u w:val="none"/>
+      </w:rPr>
+    </w:lvl>
+    <w:lvl w:ilvl="4">
+      <w:start w:val="1"/>
+      <w:numFmt w:val="bullet"/>
+      <w:lvlText w:val="-"/>
+      <w:lvlJc w:val="left"/>
+      <w:pPr>
+        <w:ind w:left="4320" w:hanging="360"/>
+      </w:pPr>
+      <w:rPr>
+        <w:u w:val="none"/>
+      </w:rPr>
+    </w:lvl>
+    <w:lvl w:ilvl="5">
+      <w:start w:val="1"/>
+      <w:numFmt w:val="bullet"/>
+      <w:lvlText w:val="-"/>
+      <w:lvlJc w:val="left"/>
+      <w:pPr>
+        <w:ind w:left="5040" w:hanging="360"/>
+      </w:pPr>
+      <w:rPr>
+        <w:u w:val="none"/>
+      </w:rPr>
+    </w:lvl>
+    <w:lvl w:ilvl="6">
+      <w:start w:val="1"/>
+      <w:numFmt w:val="bullet"/>
+      <w:lvlText w:val="-"/>
+      <w:lvlJc w:val="left"/>
+      <w:pPr>
+        <w:ind w:left="5760" w:hanging="360"/>
+      </w:pPr>
+      <w:rPr>
+        <w:u w:val="none"/>
+      </w:rPr>
+    </w:lvl>
+    <w:lvl w:ilvl="7">
+      <w:start w:val="1"/>
+      <w:numFmt w:val="bullet"/>
+      <w:lvlText w:val="-"/>
+      <w:lvlJc w:val="left"/>
+      <w:pPr>
+        <w:ind w:left="6480" w:hanging="360"/>
+      </w:pPr>
+      <w:rPr>
+        <w:u w:val="none"/>
+      </w:rPr>
+    </w:lvl>
+    <w:lvl w:ilvl="8">
+      <w:start w:val="1"/>
+      <w:numFmt w:val="bullet"/>
+      <w:lvlText w:val="-"/>
+      <w:lvlJc w:val="left"/>
+      <w:pPr>
+        <w:ind w:left="7200" w:hanging="360"/>
+      </w:pPr>
+      <w:rPr>
+        <w:u w:val="none"/>
+      </w:rPr>
+    </w:lvl>
+  </w:abstractNum>
+  <w:abstractNum w:abstractNumId="5">
+    <w:lvl w:ilvl="0">
+      <w:start w:val="1"/>
+      <w:numFmt w:val="bullet"/>
+      <w:lvlText w:val="-"/>
+      <w:lvlJc w:val="left"/>
+      <w:pPr>
+        <w:ind w:left="1440" w:hanging="360"/>
+      </w:pPr>
+      <w:rPr>
+        <w:u w:val="none"/>
+      </w:rPr>
+    </w:lvl>
+    <w:lvl w:ilvl="1">
+      <w:start w:val="1"/>
+      <w:numFmt w:val="bullet"/>
+      <w:lvlText w:val="-"/>
+      <w:lvlJc w:val="left"/>
+      <w:pPr>
+        <w:ind w:left="2160" w:hanging="360"/>
+      </w:pPr>
+      <w:rPr>
+        <w:u w:val="none"/>
+      </w:rPr>
+    </w:lvl>
+    <w:lvl w:ilvl="2">
+      <w:start w:val="1"/>
+      <w:numFmt w:val="bullet"/>
+      <w:lvlText w:val="-"/>
+      <w:lvlJc w:val="left"/>
+      <w:pPr>
+        <w:ind w:left="2880" w:hanging="360"/>
+      </w:pPr>
+      <w:rPr>
+        <w:u w:val="none"/>
+      </w:rPr>
+    </w:lvl>
+    <w:lvl w:ilvl="3">
+      <w:start w:val="1"/>
+      <w:numFmt w:val="bullet"/>
+      <w:lvlText w:val="-"/>
+      <w:lvlJc w:val="left"/>
+      <w:pPr>
+        <w:ind w:left="3600" w:hanging="360"/>
+      </w:pPr>
+      <w:rPr>
+        <w:u w:val="none"/>
+      </w:rPr>
+    </w:lvl>
+    <w:lvl w:ilvl="4">
+      <w:start w:val="1"/>
+      <w:numFmt w:val="bullet"/>
+      <w:lvlText w:val="-"/>
+      <w:lvlJc w:val="left"/>
+      <w:pPr>
+        <w:ind w:left="4320" w:hanging="360"/>
+      </w:pPr>
+      <w:rPr>
+        <w:u w:val="none"/>
+      </w:rPr>
+    </w:lvl>
+    <w:lvl w:ilvl="5">
+      <w:start w:val="1"/>
+      <w:numFmt w:val="bullet"/>
+      <w:lvlText w:val="-"/>
+      <w:lvlJc w:val="left"/>
+      <w:pPr>
+        <w:ind w:left="5040" w:hanging="360"/>
+      </w:pPr>
+      <w:rPr>
+        <w:u w:val="none"/>
+      </w:rPr>
+    </w:lvl>
+    <w:lvl w:ilvl="6">
+      <w:start w:val="1"/>
+      <w:numFmt w:val="bullet"/>
+      <w:lvlText w:val="-"/>
+      <w:lvlJc w:val="left"/>
+      <w:pPr>
+        <w:ind w:left="5760" w:hanging="360"/>
+      </w:pPr>
+      <w:rPr>
+        <w:u w:val="none"/>
+      </w:rPr>
+    </w:lvl>
+    <w:lvl w:ilvl="7">
+      <w:start w:val="1"/>
+      <w:numFmt w:val="bullet"/>
+      <w:lvlText w:val="-"/>
+      <w:lvlJc w:val="left"/>
+      <w:pPr>
+        <w:ind w:left="6480" w:hanging="360"/>
+      </w:pPr>
+      <w:rPr>
+        <w:u w:val="none"/>
+      </w:rPr>
+    </w:lvl>
+    <w:lvl w:ilvl="8">
+      <w:start w:val="1"/>
+      <w:numFmt w:val="bullet"/>
+      <w:lvlText w:val="-"/>
+      <w:lvlJc w:val="left"/>
+      <w:pPr>
+        <w:ind w:left="7200" w:hanging="360"/>
+      </w:pPr>
+      <w:rPr>
+        <w:u w:val="none"/>
+      </w:rPr>
+    </w:lvl>
+  </w:abstractNum>
+  <w:abstractNum w:abstractNumId="6">
+    <w:lvl w:ilvl="0">
+      <w:start w:val="1"/>
+      <w:numFmt w:val="decimal"/>
+      <w:lvlText w:val="%1)"/>
+      <w:lvlJc w:val="left"/>
+      <w:pPr>
+        <w:ind w:left="720" w:hanging="360"/>
+      </w:pPr>
+      <w:rPr>
+        <w:u w:val="none"/>
+      </w:rPr>
+    </w:lvl>
+    <w:lvl w:ilvl="1">
+      <w:start w:val="1"/>
+      <w:numFmt w:val="lowerLetter"/>
+      <w:lvlText w:val="%2)"/>
+      <w:lvlJc w:val="left"/>
+      <w:pPr>
+        <w:ind w:left="1440" w:hanging="360"/>
+      </w:pPr>
+      <w:rPr>
+        <w:u w:val="none"/>
+      </w:rPr>
+    </w:lvl>
+    <w:lvl w:ilvl="2">
+      <w:start w:val="1"/>
+      <w:numFmt w:val="lowerRoman"/>
+      <w:lvlText w:val="%3)"/>
+      <w:lvlJc w:val="right"/>
+      <w:pPr>
+        <w:ind w:left="2160" w:hanging="360"/>
+      </w:pPr>
+      <w:rPr>
+        <w:u w:val="none"/>
+      </w:rPr>
+    </w:lvl>
+    <w:lvl w:ilvl="3">
+      <w:start w:val="1"/>
+      <w:numFmt w:val="decimal"/>
+      <w:lvlText w:val="(%4)"/>
+      <w:lvlJc w:val="left"/>
+      <w:pPr>
+        <w:ind w:left="2880" w:hanging="360"/>
+      </w:pPr>
+      <w:rPr>
+        <w:u w:val="none"/>
+      </w:rPr>
+    </w:lvl>
+    <w:lvl w:ilvl="4">
+      <w:start w:val="1"/>
+      <w:numFmt w:val="lowerLetter"/>
+      <w:lvlText w:val="(%5)"/>
+      <w:lvlJc w:val="left"/>
+      <w:pPr>
+        <w:ind w:left="3600" w:hanging="360"/>
+      </w:pPr>
+      <w:rPr>
+        <w:u w:val="none"/>
+      </w:rPr>
+    </w:lvl>
+    <w:lvl w:ilvl="5">
+      <w:start w:val="1"/>
+      <w:numFmt w:val="lowerRoman"/>
+      <w:lvlText w:val="(%6)"/>
+      <w:lvlJc w:val="right"/>
+      <w:pPr>
+        <w:ind w:left="4320" w:hanging="360"/>
+      </w:pPr>
+      <w:rPr>
+        <w:u w:val="none"/>
+      </w:rPr>
+    </w:lvl>
+    <w:lvl w:ilvl="6">
+      <w:start w:val="1"/>
+      <w:numFmt w:val="decimal"/>
+      <w:lvlText w:val="%7."/>
+      <w:lvlJc w:val="left"/>
+      <w:pPr>
+        <w:ind w:left="5040" w:hanging="360"/>
+      </w:pPr>
+      <w:rPr>
+        <w:u w:val="none"/>
+      </w:rPr>
+    </w:lvl>
+    <w:lvl w:ilvl="7">
+      <w:start w:val="1"/>
+      <w:numFmt w:val="lowerLetter"/>
+      <w:lvlText w:val="%8."/>
+      <w:lvlJc w:val="left"/>
+      <w:pPr>
+        <w:ind w:left="5760" w:hanging="360"/>
+      </w:pPr>
+      <w:rPr>
+        <w:u w:val="none"/>
+      </w:rPr>
+    </w:lvl>
+    <w:lvl w:ilvl="8">
+      <w:start w:val="1"/>
+      <w:numFmt w:val="lowerRoman"/>
+      <w:lvlText w:val="%9."/>
+      <w:lvlJc w:val="right"/>
+      <w:pPr>
+        <w:ind w:left="6480" w:hanging="360"/>
+      </w:pPr>
+      <w:rPr>
+        <w:u w:val="none"/>
+      </w:rPr>
+    </w:lvl>
+  </w:abstractNum>
+  <w:abstractNum w:abstractNumId="7">
+    <w:lvl w:ilvl="0">
+      <w:start w:val="1"/>
+      <w:numFmt w:val="bullet"/>
+      <w:lvlText w:val="-"/>
+      <w:lvlJc w:val="left"/>
+      <w:pPr>
+        <w:ind w:left="1440" w:hanging="360"/>
+      </w:pPr>
+      <w:rPr>
+        <w:u w:val="none"/>
+      </w:rPr>
+    </w:lvl>
+    <w:lvl w:ilvl="1">
+      <w:start w:val="1"/>
+      <w:numFmt w:val="bullet"/>
+      <w:lvlText w:val="-"/>
+      <w:lvlJc w:val="left"/>
+      <w:pPr>
+        <w:ind w:left="2160" w:hanging="360"/>
+      </w:pPr>
+      <w:rPr>
+        <w:u w:val="none"/>
+      </w:rPr>
+    </w:lvl>
+    <w:lvl w:ilvl="2">
+      <w:start w:val="1"/>
+      <w:numFmt w:val="bullet"/>
+      <w:lvlText w:val="-"/>
+      <w:lvlJc w:val="left"/>
+      <w:pPr>
+        <w:ind w:left="2880" w:hanging="360"/>
+      </w:pPr>
+      <w:rPr>
+        <w:u w:val="none"/>
+      </w:rPr>
+    </w:lvl>
+    <w:lvl w:ilvl="3">
+      <w:start w:val="1"/>
+      <w:numFmt w:val="bullet"/>
+      <w:lvlText w:val="-"/>
+      <w:lvlJc w:val="left"/>
+      <w:pPr>
+        <w:ind w:left="3600" w:hanging="360"/>
+      </w:pPr>
+      <w:rPr>
+        <w:u w:val="none"/>
+      </w:rPr>
+    </w:lvl>
+    <w:lvl w:ilvl="4">
+      <w:start w:val="1"/>
+      <w:numFmt w:val="bullet"/>
+      <w:lvlText w:val="-"/>
+      <w:lvlJc w:val="left"/>
+      <w:pPr>
+        <w:ind w:left="4320" w:hanging="360"/>
+      </w:pPr>
+      <w:rPr>
+        <w:u w:val="none"/>
+      </w:rPr>
+    </w:lvl>
+    <w:lvl w:ilvl="5">
+      <w:start w:val="1"/>
+      <w:numFmt w:val="bullet"/>
+      <w:lvlText w:val="-"/>
+      <w:lvlJc w:val="left"/>
+      <w:pPr>
+        <w:ind w:left="5040" w:hanging="360"/>
+      </w:pPr>
+      <w:rPr>
+        <w:u w:val="none"/>
+      </w:rPr>
+    </w:lvl>
+    <w:lvl w:ilvl="6">
+      <w:start w:val="1"/>
+      <w:numFmt w:val="bullet"/>
+      <w:lvlText w:val="-"/>
+      <w:lvlJc w:val="left"/>
+      <w:pPr>
+        <w:ind w:left="5760" w:hanging="360"/>
+      </w:pPr>
+      <w:rPr>
+        <w:u w:val="none"/>
+      </w:rPr>
+    </w:lvl>
+    <w:lvl w:ilvl="7">
+      <w:start w:val="1"/>
+      <w:numFmt w:val="bullet"/>
+      <w:lvlText w:val="-"/>
+      <w:lvlJc w:val="left"/>
+      <w:pPr>
+        <w:ind w:left="6480" w:hanging="360"/>
+      </w:pPr>
+      <w:rPr>
+        <w:u w:val="none"/>
+      </w:rPr>
+    </w:lvl>
+    <w:lvl w:ilvl="8">
+      <w:start w:val="1"/>
+      <w:numFmt w:val="bullet"/>
+      <w:lvlText w:val="-"/>
+      <w:lvlJc w:val="left"/>
+      <w:pPr>
+        <w:ind w:left="7200" w:hanging="360"/>
+      </w:pPr>
+      <w:rPr>
+        <w:u w:val="none"/>
+      </w:rPr>
+    </w:lvl>
+  </w:abstractNum>
+  <w:abstractNum w:abstractNumId="8">
+    <w:lvl w:ilvl="0">
+      <w:start w:val="1"/>
+      <w:numFmt w:val="bullet"/>
+      <w:lvlText w:val="-"/>
+      <w:lvlJc w:val="left"/>
+      <w:pPr>
+        <w:ind w:left="720" w:hanging="360"/>
+      </w:pPr>
+      <w:rPr>
+        <w:u w:val="none"/>
+      </w:rPr>
+    </w:lvl>
+    <w:lvl w:ilvl="1">
+      <w:start w:val="1"/>
+      <w:numFmt w:val="bullet"/>
+      <w:lvlText w:val="-"/>
+      <w:lvlJc w:val="left"/>
+      <w:pPr>
+        <w:ind w:left="1440" w:hanging="360"/>
+      </w:pPr>
+      <w:rPr>
+        <w:u w:val="none"/>
+      </w:rPr>
+    </w:lvl>
+    <w:lvl w:ilvl="2">
+      <w:start w:val="1"/>
+      <w:numFmt w:val="bullet"/>
+      <w:lvlText w:val="-"/>
+      <w:lvlJc w:val="left"/>
+      <w:pPr>
+        <w:ind w:left="2160" w:hanging="360"/>
+      </w:pPr>
+      <w:rPr>
+        <w:u w:val="none"/>
+      </w:rPr>
+    </w:lvl>
+    <w:lvl w:ilvl="3">
+      <w:start w:val="1"/>
+      <w:numFmt w:val="bullet"/>
+      <w:lvlText w:val="-"/>
+      <w:lvlJc w:val="left"/>
+      <w:pPr>
+        <w:ind w:left="2880" w:hanging="360"/>
+      </w:pPr>
+      <w:rPr>
+        <w:u w:val="none"/>
+      </w:rPr>
+    </w:lvl>
+    <w:lvl w:ilvl="4">
+      <w:start w:val="1"/>
+      <w:numFmt w:val="bullet"/>
+      <w:lvlText w:val="-"/>
+      <w:lvlJc w:val="left"/>
+      <w:pPr>
+        <w:ind w:left="3600" w:hanging="360"/>
+      </w:pPr>
+      <w:rPr>
+        <w:u w:val="none"/>
+      </w:rPr>
+    </w:lvl>
+    <w:lvl w:ilvl="5">
+      <w:start w:val="1"/>
+      <w:numFmt w:val="bullet"/>
+      <w:lvlText w:val="-"/>
+      <w:lvlJc w:val="left"/>
+      <w:pPr>
+        <w:ind w:left="4320" w:hanging="360"/>
+      </w:pPr>
+      <w:rPr>
+        <w:u w:val="none"/>
+      </w:rPr>
+    </w:lvl>
+    <w:lvl w:ilvl="6">
+      <w:start w:val="1"/>
+      <w:numFmt w:val="bullet"/>
+      <w:lvlText w:val="-"/>
+      <w:lvlJc w:val="left"/>
+      <w:pPr>
+        <w:ind w:left="5040" w:hanging="360"/>
+      </w:pPr>
+      <w:rPr>
+        <w:u w:val="none"/>
+      </w:rPr>
+    </w:lvl>
+    <w:lvl w:ilvl="7">
+      <w:start w:val="1"/>
+      <w:numFmt w:val="bullet"/>
+      <w:lvlText w:val="-"/>
+      <w:lvlJc w:val="left"/>
+      <w:pPr>
+        <w:ind w:left="5760" w:hanging="360"/>
+      </w:pPr>
+      <w:rPr>
+        <w:u w:val="none"/>
+      </w:rPr>
+    </w:lvl>
+    <w:lvl w:ilvl="8">
+      <w:start w:val="1"/>
+      <w:numFmt w:val="bullet"/>
+      <w:lvlText w:val="-"/>
+      <w:lvlJc w:val="left"/>
+      <w:pPr>
+        <w:ind w:left="6480" w:hanging="360"/>
+      </w:pPr>
+      <w:rPr>
+        <w:u w:val="none"/>
+      </w:rPr>
+    </w:lvl>
+  </w:abstractNum>
+  <w:abstractNum w:abstractNumId="9">
+    <w:lvl w:ilvl="0">
+      <w:start w:val="1"/>
+      <w:numFmt w:val="bullet"/>
+      <w:lvlText w:val="-"/>
+      <w:lvlJc w:val="left"/>
+      <w:pPr>
+        <w:ind w:left="720" w:hanging="360"/>
+      </w:pPr>
+      <w:rPr>
+        <w:u w:val="none"/>
+      </w:rPr>
+    </w:lvl>
+    <w:lvl w:ilvl="1">
+      <w:start w:val="1"/>
+      <w:numFmt w:val="bullet"/>
+      <w:lvlText w:val="-"/>
+      <w:lvlJc w:val="left"/>
+      <w:pPr>
+        <w:ind w:left="1440" w:hanging="360"/>
+      </w:pPr>
+      <w:rPr>
+        <w:u w:val="none"/>
+      </w:rPr>
+    </w:lvl>
+    <w:lvl w:ilvl="2">
+      <w:start w:val="1"/>
+      <w:numFmt w:val="bullet"/>
+      <w:lvlText w:val="-"/>
+      <w:lvlJc w:val="left"/>
+      <w:pPr>
+        <w:ind w:left="2160" w:hanging="360"/>
+      </w:pPr>
+      <w:rPr>
+        <w:u w:val="none"/>
+      </w:rPr>
+    </w:lvl>
+    <w:lvl w:ilvl="3">
+      <w:start w:val="1"/>
+      <w:numFmt w:val="bullet"/>
+      <w:lvlText w:val="-"/>
+      <w:lvlJc w:val="left"/>
+      <w:pPr>
+        <w:ind w:left="2880" w:hanging="360"/>
+      </w:pPr>
+      <w:rPr>
+        <w:u w:val="none"/>
+      </w:rPr>
+    </w:lvl>
+    <w:lvl w:ilvl="4">
+      <w:start w:val="1"/>
+      <w:numFmt w:val="bullet"/>
+      <w:lvlText w:val="-"/>
+      <w:lvlJc w:val="left"/>
+      <w:pPr>
+        <w:ind w:left="3600" w:hanging="360"/>
+      </w:pPr>
+      <w:rPr>
+        <w:u w:val="none"/>
+      </w:rPr>
+    </w:lvl>
+    <w:lvl w:ilvl="5">
+      <w:start w:val="1"/>
+      <w:numFmt w:val="bullet"/>
+      <w:lvlText w:val="-"/>
+      <w:lvlJc w:val="left"/>
+      <w:pPr>
+        <w:ind w:left="4320" w:hanging="360"/>
+      </w:pPr>
+      <w:rPr>
+        <w:u w:val="none"/>
+      </w:rPr>
+    </w:lvl>
+    <w:lvl w:ilvl="6">
+      <w:start w:val="1"/>
+      <w:numFmt w:val="bullet"/>
+      <w:lvlText w:val="-"/>
+      <w:lvlJc w:val="left"/>
+      <w:pPr>
+        <w:ind w:left="5040" w:hanging="360"/>
+      </w:pPr>
+      <w:rPr>
+        <w:u w:val="none"/>
+      </w:rPr>
+    </w:lvl>
+    <w:lvl w:ilvl="7">
+      <w:start w:val="1"/>
+      <w:numFmt w:val="bullet"/>
+      <w:lvlText w:val="-"/>
+      <w:lvlJc w:val="left"/>
+      <w:pPr>
+        <w:ind w:left="5760" w:hanging="360"/>
+      </w:pPr>
+      <w:rPr>
+        <w:u w:val="none"/>
+      </w:rPr>
+    </w:lvl>
+    <w:lvl w:ilvl="8">
+      <w:start w:val="1"/>
+      <w:numFmt w:val="bullet"/>
+      <w:lvlText w:val="-"/>
+      <w:lvlJc w:val="left"/>
+      <w:pPr>
+        <w:ind w:left="6480" w:hanging="360"/>
+      </w:pPr>
+      <w:rPr>
+        <w:u w:val="none"/>
+      </w:rPr>
+    </w:lvl>
+  </w:abstractNum>
+  <w:abstractNum w:abstractNumId="10">
+    <w:lvl w:ilvl="0">
+      <w:start w:val="1"/>
+      <w:numFmt w:val="decimal"/>
+      <w:lvlText w:val="%1)"/>
+      <w:lvlJc w:val="left"/>
+      <w:pPr>
+        <w:ind w:left="720" w:hanging="360"/>
+      </w:pPr>
+      <w:rPr>
+        <w:u w:val="none"/>
+      </w:rPr>
+    </w:lvl>
+    <w:lvl w:ilvl="1">
+      <w:start w:val="1"/>
+      <w:numFmt w:val="lowerLetter"/>
+      <w:lvlText w:val="%2)"/>
+      <w:lvlJc w:val="left"/>
+      <w:pPr>
+        <w:ind w:left="1440" w:hanging="360"/>
+      </w:pPr>
+      <w:rPr>
+        <w:u w:val="none"/>
+      </w:rPr>
+    </w:lvl>
+    <w:lvl w:ilvl="2">
+      <w:start w:val="1"/>
+      <w:numFmt w:val="lowerRoman"/>
+      <w:lvlText w:val="%3)"/>
+      <w:lvlJc w:val="right"/>
+      <w:pPr>
+        <w:ind w:left="2160" w:hanging="360"/>
+      </w:pPr>
+      <w:rPr>
+        <w:u w:val="none"/>
+      </w:rPr>
+    </w:lvl>
+    <w:lvl w:ilvl="3">
+      <w:start w:val="1"/>
+      <w:numFmt w:val="decimal"/>
+      <w:lvlText w:val="(%4)"/>
+      <w:lvlJc w:val="left"/>
+      <w:pPr>
+        <w:ind w:left="2880" w:hanging="360"/>
+      </w:pPr>
+      <w:rPr>
+        <w:u w:val="none"/>
+      </w:rPr>
+    </w:lvl>
+    <w:lvl w:ilvl="4">
+      <w:start w:val="1"/>
+      <w:numFmt w:val="lowerLetter"/>
+      <w:lvlText w:val="(%5)"/>
+      <w:lvlJc w:val="left"/>
+      <w:pPr>
+        <w:ind w:left="3600" w:hanging="360"/>
+      </w:pPr>
+      <w:rPr>
+        <w:u w:val="none"/>
+      </w:rPr>
+    </w:lvl>
+    <w:lvl w:ilvl="5">
+      <w:start w:val="1"/>
+      <w:numFmt w:val="lowerRoman"/>
+      <w:lvlText w:val="(%6)"/>
+      <w:lvlJc w:val="right"/>
+      <w:pPr>
+        <w:ind w:left="4320" w:hanging="360"/>
+      </w:pPr>
+      <w:rPr>
+        <w:u w:val="none"/>
+      </w:rPr>
+    </w:lvl>
+    <w:lvl w:ilvl="6">
+      <w:start w:val="1"/>
+      <w:numFmt w:val="decimal"/>
+      <w:lvlText w:val="%7."/>
+      <w:lvlJc w:val="left"/>
+      <w:pPr>
+        <w:ind w:left="5040" w:hanging="360"/>
+      </w:pPr>
+      <w:rPr>
+        <w:u w:val="none"/>
+      </w:rPr>
+    </w:lvl>
+    <w:lvl w:ilvl="7">
+      <w:start w:val="1"/>
+      <w:numFmt w:val="lowerLetter"/>
+      <w:lvlText w:val="%8."/>
+      <w:lvlJc w:val="left"/>
+      <w:pPr>
+        <w:ind w:left="5760" w:hanging="360"/>
+      </w:pPr>
+      <w:rPr>
+        <w:u w:val="none"/>
+      </w:rPr>
+    </w:lvl>
+    <w:lvl w:ilvl="8">
+      <w:start w:val="1"/>
+      <w:numFmt w:val="lowerRoman"/>
+      <w:lvlText w:val="%9."/>
+      <w:lvlJc w:val="right"/>
+      <w:pPr>
         <w:ind w:left="6480" w:hanging="360"/>
       </w:pPr>
       <w:rPr>
@@ -4987,6 +7449,33 @@
   </w:abstractNum>
   <w:num w:numId="1">
     <w:abstractNumId w:val="1"/>
+  </w:num>
+  <w:num w:numId="2">
+    <w:abstractNumId w:val="2"/>
+  </w:num>
+  <w:num w:numId="3">
+    <w:abstractNumId w:val="3"/>
+  </w:num>
+  <w:num w:numId="4">
+    <w:abstractNumId w:val="4"/>
+  </w:num>
+  <w:num w:numId="5">
+    <w:abstractNumId w:val="5"/>
+  </w:num>
+  <w:num w:numId="6">
+    <w:abstractNumId w:val="6"/>
+  </w:num>
+  <w:num w:numId="7">
+    <w:abstractNumId w:val="7"/>
+  </w:num>
+  <w:num w:numId="8">
+    <w:abstractNumId w:val="8"/>
+  </w:num>
+  <w:num w:numId="9">
+    <w:abstractNumId w:val="9"/>
+  </w:num>
+  <w:num w:numId="10">
+    <w:abstractNumId w:val="10"/>
   </w:num>
 </w:numbering>
 </file>

</xml_diff>

<commit_message>
Pull Request - update #3
</commit_message>
<xml_diff>
--- a/IA_ID.docx
+++ b/IA_ID.docx
@@ -574,25 +574,6 @@
         </w:pBdr>
         <w:shd w:fill="ffffff" w:val="clear"/>
         <w:ind w:left="0" w:firstLine="0"/>
-        <w:rPr/>
-      </w:pPr>
-      <w:r>
-        <w:rPr>
-          <w:rtl w:val="0"/>
-        </w:rPr>
-      </w:r>
-    </w:p>
-    <w:p>
-      <w:pPr>
-        <w:pBdr>
-          <w:top w:color="auto" w:space="0" w:sz="0" w:val="none"/>
-          <w:left w:color="auto" w:space="0" w:sz="0" w:val="none"/>
-          <w:bottom w:color="auto" w:space="0" w:sz="0" w:val="none"/>
-          <w:right w:color="auto" w:space="0" w:sz="0" w:val="none"/>
-          <w:between w:color="auto" w:space="0" w:sz="0" w:val="none"/>
-        </w:pBdr>
-        <w:shd w:fill="ffffff" w:val="clear"/>
-        <w:ind w:left="0" w:firstLine="0"/>
         <w:jc w:val="center"/>
         <w:rPr>
           <w:b w:val="1"/>
@@ -827,6 +808,32 @@
               <w:t xml:space="preserve">-Country information page</w:t>
             </w:r>
           </w:p>
+          <w:p>
+            <w:pPr>
+              <w:keepNext w:val="0"/>
+              <w:keepLines w:val="0"/>
+              <w:pageBreakBefore w:val="0"/>
+              <w:widowControl w:val="0"/>
+              <w:pBdr>
+                <w:top w:space="0" w:sz="0" w:val="nil"/>
+                <w:left w:space="0" w:sz="0" w:val="nil"/>
+                <w:bottom w:space="0" w:sz="0" w:val="nil"/>
+                <w:right w:space="0" w:sz="0" w:val="nil"/>
+                <w:between w:space="0" w:sz="0" w:val="nil"/>
+              </w:pBdr>
+              <w:shd w:fill="auto" w:val="clear"/>
+              <w:spacing w:after="0" w:before="0" w:line="240" w:lineRule="auto"/>
+              <w:ind w:left="0" w:right="0" w:firstLine="0"/>
+              <w:jc w:val="left"/>
+              <w:rPr/>
+            </w:pPr>
+            <w:r>
+              <w:rPr>
+                <w:rtl w:val="0"/>
+              </w:rPr>
+              <w:t xml:space="preserve">-Activities list</w:t>
+            </w:r>
+          </w:p>
         </w:tc>
       </w:tr>
     </w:tbl>
@@ -946,7 +953,7 @@
               <w:widowControl w:val="0"/>
               <w:numPr>
                 <w:ilvl w:val="0"/>
-                <w:numId w:val="9"/>
+                <w:numId w:val="17"/>
               </w:numPr>
               <w:pBdr>
                 <w:top w:space="0" w:sz="0" w:val="nil"/>
@@ -978,7 +985,7 @@
               <w:widowControl w:val="0"/>
               <w:numPr>
                 <w:ilvl w:val="0"/>
-                <w:numId w:val="9"/>
+                <w:numId w:val="17"/>
               </w:numPr>
               <w:pBdr>
                 <w:top w:space="0" w:sz="0" w:val="nil"/>
@@ -1010,7 +1017,7 @@
               <w:widowControl w:val="0"/>
               <w:numPr>
                 <w:ilvl w:val="0"/>
-                <w:numId w:val="9"/>
+                <w:numId w:val="17"/>
               </w:numPr>
               <w:pBdr>
                 <w:top w:space="0" w:sz="0" w:val="nil"/>
@@ -1042,7 +1049,7 @@
               <w:widowControl w:val="0"/>
               <w:numPr>
                 <w:ilvl w:val="0"/>
-                <w:numId w:val="9"/>
+                <w:numId w:val="17"/>
               </w:numPr>
               <w:pBdr>
                 <w:top w:space="0" w:sz="0" w:val="nil"/>
@@ -1071,7 +1078,7 @@
               <w:widowControl w:val="0"/>
               <w:numPr>
                 <w:ilvl w:val="0"/>
-                <w:numId w:val="9"/>
+                <w:numId w:val="17"/>
               </w:numPr>
               <w:spacing w:line="240" w:lineRule="auto"/>
               <w:ind w:left="720" w:hanging="360"/>
@@ -1091,7 +1098,7 @@
               <w:widowControl w:val="0"/>
               <w:numPr>
                 <w:ilvl w:val="0"/>
-                <w:numId w:val="9"/>
+                <w:numId w:val="17"/>
               </w:numPr>
               <w:pBdr>
                 <w:top w:space="0" w:sz="0" w:val="nil"/>
@@ -1123,7 +1130,7 @@
               <w:widowControl w:val="0"/>
               <w:numPr>
                 <w:ilvl w:val="0"/>
-                <w:numId w:val="9"/>
+                <w:numId w:val="17"/>
               </w:numPr>
               <w:pBdr>
                 <w:top w:space="0" w:sz="0" w:val="nil"/>
@@ -1155,7 +1162,7 @@
               <w:widowControl w:val="0"/>
               <w:numPr>
                 <w:ilvl w:val="0"/>
-                <w:numId w:val="9"/>
+                <w:numId w:val="17"/>
               </w:numPr>
               <w:pBdr>
                 <w:top w:space="0" w:sz="0" w:val="nil"/>
@@ -1187,7 +1194,7 @@
               <w:widowControl w:val="0"/>
               <w:numPr>
                 <w:ilvl w:val="0"/>
-                <w:numId w:val="9"/>
+                <w:numId w:val="17"/>
               </w:numPr>
               <w:pBdr>
                 <w:top w:space="0" w:sz="0" w:val="nil"/>
@@ -1219,7 +1226,7 @@
               <w:widowControl w:val="0"/>
               <w:numPr>
                 <w:ilvl w:val="1"/>
-                <w:numId w:val="9"/>
+                <w:numId w:val="17"/>
               </w:numPr>
               <w:pBdr>
                 <w:top w:space="0" w:sz="0" w:val="nil"/>
@@ -1251,7 +1258,7 @@
               <w:widowControl w:val="0"/>
               <w:numPr>
                 <w:ilvl w:val="1"/>
-                <w:numId w:val="9"/>
+                <w:numId w:val="17"/>
               </w:numPr>
               <w:pBdr>
                 <w:top w:space="0" w:sz="0" w:val="nil"/>
@@ -1278,6 +1285,25 @@
         </w:tc>
       </w:tr>
     </w:tbl>
+    <w:p>
+      <w:pPr>
+        <w:pBdr>
+          <w:top w:color="auto" w:space="0" w:sz="0" w:val="none"/>
+          <w:left w:color="auto" w:space="0" w:sz="0" w:val="none"/>
+          <w:bottom w:color="auto" w:space="0" w:sz="0" w:val="none"/>
+          <w:right w:color="auto" w:space="0" w:sz="0" w:val="none"/>
+          <w:between w:color="auto" w:space="0" w:sz="0" w:val="none"/>
+        </w:pBdr>
+        <w:shd w:fill="ffffff" w:val="clear"/>
+        <w:ind w:left="0" w:firstLine="0"/>
+        <w:rPr/>
+      </w:pPr>
+      <w:r>
+        <w:rPr>
+          <w:rtl w:val="0"/>
+        </w:rPr>
+      </w:r>
+    </w:p>
     <w:p>
       <w:pPr>
         <w:pBdr>
@@ -1411,6 +1437,10 @@
               <w:keepLines w:val="0"/>
               <w:pageBreakBefore w:val="0"/>
               <w:widowControl w:val="0"/>
+              <w:numPr>
+                <w:ilvl w:val="0"/>
+                <w:numId w:val="9"/>
+              </w:numPr>
               <w:pBdr>
                 <w:top w:space="0" w:sz="0" w:val="nil"/>
                 <w:left w:space="0" w:sz="0" w:val="nil"/>
@@ -1420,14 +1450,305 @@
               </w:pBdr>
               <w:shd w:fill="auto" w:val="clear"/>
               <w:spacing w:after="0" w:before="0" w:line="240" w:lineRule="auto"/>
-              <w:ind w:left="0" w:right="0" w:firstLine="0"/>
+              <w:ind w:left="720" w:right="0" w:hanging="360"/>
               <w:jc w:val="left"/>
-              <w:rPr/>
-            </w:pPr>
-            <w:r>
-              <w:rPr>
-                <w:rtl w:val="0"/>
-              </w:rPr>
+              <w:rPr>
+                <w:u w:val="none"/>
+              </w:rPr>
+            </w:pPr>
+            <w:r>
+              <w:rPr>
+                <w:rtl w:val="0"/>
+              </w:rPr>
+              <w:t xml:space="preserve">Travel Budget Planner</w:t>
+            </w:r>
+          </w:p>
+          <w:p>
+            <w:pPr>
+              <w:keepNext w:val="0"/>
+              <w:keepLines w:val="0"/>
+              <w:pageBreakBefore w:val="0"/>
+              <w:widowControl w:val="0"/>
+              <w:numPr>
+                <w:ilvl w:val="0"/>
+                <w:numId w:val="9"/>
+              </w:numPr>
+              <w:pBdr>
+                <w:top w:space="0" w:sz="0" w:val="nil"/>
+                <w:left w:space="0" w:sz="0" w:val="nil"/>
+                <w:bottom w:space="0" w:sz="0" w:val="nil"/>
+                <w:right w:space="0" w:sz="0" w:val="nil"/>
+                <w:between w:space="0" w:sz="0" w:val="nil"/>
+              </w:pBdr>
+              <w:shd w:fill="auto" w:val="clear"/>
+              <w:spacing w:after="0" w:before="0" w:line="240" w:lineRule="auto"/>
+              <w:ind w:left="720" w:right="0" w:hanging="360"/>
+              <w:jc w:val="left"/>
+              <w:rPr>
+                <w:u w:val="none"/>
+              </w:rPr>
+            </w:pPr>
+            <w:r>
+              <w:rPr>
+                <w:rtl w:val="0"/>
+              </w:rPr>
+              <w:t xml:space="preserve">Visa Information</w:t>
+            </w:r>
+          </w:p>
+          <w:p>
+            <w:pPr>
+              <w:keepNext w:val="0"/>
+              <w:keepLines w:val="0"/>
+              <w:pageBreakBefore w:val="0"/>
+              <w:widowControl w:val="0"/>
+              <w:numPr>
+                <w:ilvl w:val="0"/>
+                <w:numId w:val="9"/>
+              </w:numPr>
+              <w:pBdr>
+                <w:top w:space="0" w:sz="0" w:val="nil"/>
+                <w:left w:space="0" w:sz="0" w:val="nil"/>
+                <w:bottom w:space="0" w:sz="0" w:val="nil"/>
+                <w:right w:space="0" w:sz="0" w:val="nil"/>
+                <w:between w:space="0" w:sz="0" w:val="nil"/>
+              </w:pBdr>
+              <w:shd w:fill="auto" w:val="clear"/>
+              <w:spacing w:after="0" w:before="0" w:line="240" w:lineRule="auto"/>
+              <w:ind w:left="720" w:right="0" w:hanging="360"/>
+              <w:jc w:val="left"/>
+              <w:rPr>
+                <w:u w:val="none"/>
+              </w:rPr>
+            </w:pPr>
+            <w:r>
+              <w:rPr>
+                <w:rtl w:val="0"/>
+              </w:rPr>
+              <w:t xml:space="preserve">Travel Safety Tips</w:t>
+            </w:r>
+          </w:p>
+          <w:p>
+            <w:pPr>
+              <w:keepNext w:val="0"/>
+              <w:keepLines w:val="0"/>
+              <w:pageBreakBefore w:val="0"/>
+              <w:widowControl w:val="0"/>
+              <w:numPr>
+                <w:ilvl w:val="0"/>
+                <w:numId w:val="9"/>
+              </w:numPr>
+              <w:pBdr>
+                <w:top w:space="0" w:sz="0" w:val="nil"/>
+                <w:left w:space="0" w:sz="0" w:val="nil"/>
+                <w:bottom w:space="0" w:sz="0" w:val="nil"/>
+                <w:right w:space="0" w:sz="0" w:val="nil"/>
+                <w:between w:space="0" w:sz="0" w:val="nil"/>
+              </w:pBdr>
+              <w:shd w:fill="auto" w:val="clear"/>
+              <w:spacing w:after="0" w:before="0" w:line="240" w:lineRule="auto"/>
+              <w:ind w:left="720" w:right="0" w:hanging="360"/>
+              <w:jc w:val="left"/>
+              <w:rPr>
+                <w:u w:val="none"/>
+              </w:rPr>
+            </w:pPr>
+            <w:r>
+              <w:rPr>
+                <w:rtl w:val="0"/>
+              </w:rPr>
+              <w:t xml:space="preserve">Transportation Guides</w:t>
+            </w:r>
+          </w:p>
+          <w:p>
+            <w:pPr>
+              <w:keepNext w:val="0"/>
+              <w:keepLines w:val="0"/>
+              <w:pageBreakBefore w:val="0"/>
+              <w:widowControl w:val="0"/>
+              <w:numPr>
+                <w:ilvl w:val="0"/>
+                <w:numId w:val="9"/>
+              </w:numPr>
+              <w:pBdr>
+                <w:top w:space="0" w:sz="0" w:val="nil"/>
+                <w:left w:space="0" w:sz="0" w:val="nil"/>
+                <w:bottom w:space="0" w:sz="0" w:val="nil"/>
+                <w:right w:space="0" w:sz="0" w:val="nil"/>
+                <w:between w:space="0" w:sz="0" w:val="nil"/>
+              </w:pBdr>
+              <w:shd w:fill="auto" w:val="clear"/>
+              <w:spacing w:after="0" w:before="0" w:line="240" w:lineRule="auto"/>
+              <w:ind w:left="720" w:right="0" w:hanging="360"/>
+              <w:jc w:val="left"/>
+              <w:rPr>
+                <w:u w:val="none"/>
+              </w:rPr>
+            </w:pPr>
+            <w:r>
+              <w:rPr>
+                <w:rtl w:val="0"/>
+              </w:rPr>
+              <w:t xml:space="preserve">Restaurant Recommendations</w:t>
+            </w:r>
+          </w:p>
+          <w:p>
+            <w:pPr>
+              <w:keepNext w:val="0"/>
+              <w:keepLines w:val="0"/>
+              <w:pageBreakBefore w:val="0"/>
+              <w:widowControl w:val="0"/>
+              <w:numPr>
+                <w:ilvl w:val="0"/>
+                <w:numId w:val="9"/>
+              </w:numPr>
+              <w:pBdr>
+                <w:top w:space="0" w:sz="0" w:val="nil"/>
+                <w:left w:space="0" w:sz="0" w:val="nil"/>
+                <w:bottom w:space="0" w:sz="0" w:val="nil"/>
+                <w:right w:space="0" w:sz="0" w:val="nil"/>
+                <w:between w:space="0" w:sz="0" w:val="nil"/>
+              </w:pBdr>
+              <w:shd w:fill="auto" w:val="clear"/>
+              <w:spacing w:after="0" w:before="0" w:line="240" w:lineRule="auto"/>
+              <w:ind w:left="720" w:right="0" w:hanging="360"/>
+              <w:jc w:val="left"/>
+              <w:rPr>
+                <w:u w:val="none"/>
+              </w:rPr>
+            </w:pPr>
+            <w:r>
+              <w:rPr>
+                <w:rtl w:val="0"/>
+              </w:rPr>
+              <w:t xml:space="preserve">Local Culture Guides</w:t>
+            </w:r>
+          </w:p>
+          <w:p>
+            <w:pPr>
+              <w:keepNext w:val="0"/>
+              <w:keepLines w:val="0"/>
+              <w:pageBreakBefore w:val="0"/>
+              <w:widowControl w:val="0"/>
+              <w:numPr>
+                <w:ilvl w:val="0"/>
+                <w:numId w:val="9"/>
+              </w:numPr>
+              <w:pBdr>
+                <w:top w:space="0" w:sz="0" w:val="nil"/>
+                <w:left w:space="0" w:sz="0" w:val="nil"/>
+                <w:bottom w:space="0" w:sz="0" w:val="nil"/>
+                <w:right w:space="0" w:sz="0" w:val="nil"/>
+                <w:between w:space="0" w:sz="0" w:val="nil"/>
+              </w:pBdr>
+              <w:shd w:fill="auto" w:val="clear"/>
+              <w:spacing w:after="0" w:before="0" w:line="240" w:lineRule="auto"/>
+              <w:ind w:left="720" w:right="0" w:hanging="360"/>
+              <w:jc w:val="left"/>
+              <w:rPr>
+                <w:u w:val="none"/>
+              </w:rPr>
+            </w:pPr>
+            <w:r>
+              <w:rPr>
+                <w:rtl w:val="0"/>
+              </w:rPr>
+              <w:t xml:space="preserve">Travel Reviews</w:t>
+            </w:r>
+          </w:p>
+          <w:p>
+            <w:pPr>
+              <w:keepNext w:val="0"/>
+              <w:keepLines w:val="0"/>
+              <w:pageBreakBefore w:val="0"/>
+              <w:widowControl w:val="0"/>
+              <w:numPr>
+                <w:ilvl w:val="0"/>
+                <w:numId w:val="9"/>
+              </w:numPr>
+              <w:pBdr>
+                <w:top w:space="0" w:sz="0" w:val="nil"/>
+                <w:left w:space="0" w:sz="0" w:val="nil"/>
+                <w:bottom w:space="0" w:sz="0" w:val="nil"/>
+                <w:right w:space="0" w:sz="0" w:val="nil"/>
+                <w:between w:space="0" w:sz="0" w:val="nil"/>
+              </w:pBdr>
+              <w:shd w:fill="auto" w:val="clear"/>
+              <w:spacing w:after="0" w:before="0" w:line="240" w:lineRule="auto"/>
+              <w:ind w:left="720" w:right="0" w:hanging="360"/>
+              <w:jc w:val="left"/>
+              <w:rPr>
+                <w:u w:val="none"/>
+              </w:rPr>
+            </w:pPr>
+            <w:r>
+              <w:rPr>
+                <w:rtl w:val="0"/>
+              </w:rPr>
+              <w:t xml:space="preserve">Saved Destinations</w:t>
+            </w:r>
+          </w:p>
+          <w:p>
+            <w:pPr>
+              <w:keepNext w:val="0"/>
+              <w:keepLines w:val="0"/>
+              <w:pageBreakBefore w:val="0"/>
+              <w:widowControl w:val="0"/>
+              <w:numPr>
+                <w:ilvl w:val="0"/>
+                <w:numId w:val="9"/>
+              </w:numPr>
+              <w:pBdr>
+                <w:top w:space="0" w:sz="0" w:val="nil"/>
+                <w:left w:space="0" w:sz="0" w:val="nil"/>
+                <w:bottom w:space="0" w:sz="0" w:val="nil"/>
+                <w:right w:space="0" w:sz="0" w:val="nil"/>
+                <w:between w:space="0" w:sz="0" w:val="nil"/>
+              </w:pBdr>
+              <w:shd w:fill="auto" w:val="clear"/>
+              <w:spacing w:after="0" w:before="0" w:line="240" w:lineRule="auto"/>
+              <w:ind w:left="720" w:right="0" w:hanging="360"/>
+              <w:jc w:val="left"/>
+              <w:rPr>
+                <w:u w:val="none"/>
+              </w:rPr>
+            </w:pPr>
+            <w:r>
+              <w:rPr>
+                <w:rtl w:val="0"/>
+              </w:rPr>
+              <w:t xml:space="preserve">Trip History</w:t>
+            </w:r>
+          </w:p>
+          <w:p>
+            <w:pPr>
+              <w:keepNext w:val="0"/>
+              <w:keepLines w:val="0"/>
+              <w:pageBreakBefore w:val="0"/>
+              <w:widowControl w:val="0"/>
+              <w:numPr>
+                <w:ilvl w:val="0"/>
+                <w:numId w:val="9"/>
+              </w:numPr>
+              <w:pBdr>
+                <w:top w:space="0" w:sz="0" w:val="nil"/>
+                <w:left w:space="0" w:sz="0" w:val="nil"/>
+                <w:bottom w:space="0" w:sz="0" w:val="nil"/>
+                <w:right w:space="0" w:sz="0" w:val="nil"/>
+                <w:between w:space="0" w:sz="0" w:val="nil"/>
+              </w:pBdr>
+              <w:shd w:fill="auto" w:val="clear"/>
+              <w:spacing w:after="0" w:before="0" w:line="240" w:lineRule="auto"/>
+              <w:ind w:left="720" w:right="0" w:hanging="360"/>
+              <w:jc w:val="left"/>
+              <w:rPr>
+                <w:u w:val="none"/>
+              </w:rPr>
+            </w:pPr>
+            <w:r>
+              <w:rPr>
+                <w:rtl w:val="0"/>
+              </w:rPr>
+              <w:t xml:space="preserve">Customer Support</w:t>
             </w:r>
           </w:p>
         </w:tc>
@@ -1549,7 +1870,7 @@
               <w:widowControl w:val="0"/>
               <w:numPr>
                 <w:ilvl w:val="0"/>
-                <w:numId w:val="8"/>
+                <w:numId w:val="14"/>
               </w:numPr>
               <w:pBdr>
                 <w:top w:space="0" w:sz="0" w:val="nil"/>
@@ -1584,7 +1905,7 @@
               <w:widowControl w:val="0"/>
               <w:numPr>
                 <w:ilvl w:val="0"/>
-                <w:numId w:val="8"/>
+                <w:numId w:val="14"/>
               </w:numPr>
               <w:pBdr>
                 <w:top w:space="0" w:sz="0" w:val="nil"/>
@@ -1619,7 +1940,7 @@
               <w:widowControl w:val="0"/>
               <w:numPr>
                 <w:ilvl w:val="1"/>
-                <w:numId w:val="8"/>
+                <w:numId w:val="14"/>
               </w:numPr>
               <w:pBdr>
                 <w:top w:space="0" w:sz="0" w:val="nil"/>
@@ -1657,7 +1978,7 @@
               <w:widowControl w:val="0"/>
               <w:numPr>
                 <w:ilvl w:val="2"/>
-                <w:numId w:val="8"/>
+                <w:numId w:val="14"/>
               </w:numPr>
               <w:spacing w:line="240" w:lineRule="auto"/>
               <w:ind w:left="2160" w:hanging="360"/>
@@ -1681,7 +2002,7 @@
               <w:widowControl w:val="0"/>
               <w:numPr>
                 <w:ilvl w:val="2"/>
-                <w:numId w:val="8"/>
+                <w:numId w:val="14"/>
               </w:numPr>
               <w:spacing w:line="240" w:lineRule="auto"/>
               <w:ind w:left="2160" w:hanging="360"/>
@@ -1701,7 +2022,7 @@
               <w:widowControl w:val="0"/>
               <w:numPr>
                 <w:ilvl w:val="2"/>
-                <w:numId w:val="8"/>
+                <w:numId w:val="14"/>
               </w:numPr>
               <w:spacing w:line="240" w:lineRule="auto"/>
               <w:ind w:left="2160" w:hanging="360"/>
@@ -1721,7 +2042,7 @@
               <w:widowControl w:val="0"/>
               <w:numPr>
                 <w:ilvl w:val="2"/>
-                <w:numId w:val="8"/>
+                <w:numId w:val="14"/>
               </w:numPr>
               <w:spacing w:line="240" w:lineRule="auto"/>
               <w:ind w:left="2160" w:hanging="360"/>
@@ -1738,7 +2059,7 @@
               <w:widowControl w:val="0"/>
               <w:numPr>
                 <w:ilvl w:val="2"/>
-                <w:numId w:val="8"/>
+                <w:numId w:val="14"/>
               </w:numPr>
               <w:spacing w:line="240" w:lineRule="auto"/>
               <w:ind w:left="2160" w:hanging="360"/>
@@ -1752,13 +2073,30 @@
           </w:p>
           <w:p>
             <w:pPr>
+              <w:widowControl w:val="0"/>
+              <w:numPr>
+                <w:ilvl w:val="2"/>
+                <w:numId w:val="14"/>
+              </w:numPr>
+              <w:spacing w:line="240" w:lineRule="auto"/>
+              <w:ind w:left="2160" w:hanging="360"/>
+            </w:pPr>
+            <w:r>
+              <w:rPr>
+                <w:rtl w:val="0"/>
+              </w:rPr>
+              <w:t xml:space="preserve">Budget Planner for the entire trip!</w:t>
+            </w:r>
+          </w:p>
+          <w:p>
+            <w:pPr>
               <w:keepNext w:val="0"/>
               <w:keepLines w:val="0"/>
               <w:pageBreakBefore w:val="0"/>
               <w:widowControl w:val="0"/>
               <w:numPr>
                 <w:ilvl w:val="1"/>
-                <w:numId w:val="8"/>
+                <w:numId w:val="14"/>
               </w:numPr>
               <w:pBdr>
                 <w:top w:space="0" w:sz="0" w:val="nil"/>
@@ -1799,7 +2137,7 @@
               <w:widowControl w:val="0"/>
               <w:numPr>
                 <w:ilvl w:val="2"/>
-                <w:numId w:val="8"/>
+                <w:numId w:val="14"/>
               </w:numPr>
               <w:pBdr>
                 <w:top w:space="0" w:sz="0" w:val="nil"/>
@@ -1838,7 +2176,7 @@
               <w:widowControl w:val="0"/>
               <w:numPr>
                 <w:ilvl w:val="2"/>
-                <w:numId w:val="8"/>
+                <w:numId w:val="14"/>
               </w:numPr>
               <w:pBdr>
                 <w:top w:space="0" w:sz="0" w:val="nil"/>
@@ -1870,7 +2208,7 @@
               <w:widowControl w:val="0"/>
               <w:numPr>
                 <w:ilvl w:val="2"/>
-                <w:numId w:val="8"/>
+                <w:numId w:val="14"/>
               </w:numPr>
               <w:pBdr>
                 <w:top w:space="0" w:sz="0" w:val="nil"/>
@@ -1902,7 +2240,7 @@
               <w:widowControl w:val="0"/>
               <w:numPr>
                 <w:ilvl w:val="2"/>
-                <w:numId w:val="8"/>
+                <w:numId w:val="14"/>
               </w:numPr>
               <w:pBdr>
                 <w:top w:space="0" w:sz="0" w:val="nil"/>
@@ -1934,7 +2272,7 @@
               <w:widowControl w:val="0"/>
               <w:numPr>
                 <w:ilvl w:val="2"/>
-                <w:numId w:val="8"/>
+                <w:numId w:val="14"/>
               </w:numPr>
               <w:pBdr>
                 <w:top w:space="0" w:sz="0" w:val="nil"/>
@@ -1965,8 +2303,8 @@
               <w:pageBreakBefore w:val="0"/>
               <w:widowControl w:val="0"/>
               <w:numPr>
-                <w:ilvl w:val="0"/>
-                <w:numId w:val="8"/>
+                <w:ilvl w:val="2"/>
+                <w:numId w:val="14"/>
               </w:numPr>
               <w:pBdr>
                 <w:top w:space="0" w:sz="0" w:val="nil"/>
@@ -1977,20 +2315,17 @@
               </w:pBdr>
               <w:shd w:fill="auto" w:val="clear"/>
               <w:spacing w:after="0" w:before="0" w:line="240" w:lineRule="auto"/>
-              <w:ind w:left="720" w:right="0" w:hanging="360"/>
+              <w:ind w:left="2160" w:right="0" w:hanging="360"/>
               <w:jc w:val="left"/>
               <w:rPr>
-                <w:b w:val="1"/>
-                <w:bCs w:val="1"/>
-              </w:rPr>
-            </w:pPr>
-            <w:r>
-              <w:rPr>
-                <w:b w:val="1"/>
-                <w:bCs w:val="1"/>
-                <w:rtl w:val="0"/>
-              </w:rPr>
-              <w:t xml:space="preserve">Travel Checklist</w:t>
+                <w:u w:val="none"/>
+              </w:rPr>
+            </w:pPr>
+            <w:r>
+              <w:rPr>
+                <w:rtl w:val="0"/>
+              </w:rPr>
+              <w:t xml:space="preserve">Budget Planner for the entire trip!</w:t>
             </w:r>
           </w:p>
           <w:p>
@@ -2001,7 +2336,7 @@
               <w:widowControl w:val="0"/>
               <w:numPr>
                 <w:ilvl w:val="0"/>
-                <w:numId w:val="8"/>
+                <w:numId w:val="14"/>
               </w:numPr>
               <w:pBdr>
                 <w:top w:space="0" w:sz="0" w:val="nil"/>
@@ -2025,7 +2360,7 @@
                 <w:bCs w:val="1"/>
                 <w:rtl w:val="0"/>
               </w:rPr>
-              <w:t xml:space="preserve">Account</w:t>
+              <w:t xml:space="preserve">Travel Checklist</w:t>
             </w:r>
           </w:p>
           <w:p>
@@ -2035,8 +2370,8 @@
               <w:pageBreakBefore w:val="0"/>
               <w:widowControl w:val="0"/>
               <w:numPr>
-                <w:ilvl w:val="1"/>
-                <w:numId w:val="8"/>
+                <w:ilvl w:val="0"/>
+                <w:numId w:val="14"/>
               </w:numPr>
               <w:pBdr>
                 <w:top w:space="0" w:sz="0" w:val="nil"/>
@@ -2047,17 +2382,20 @@
               </w:pBdr>
               <w:shd w:fill="auto" w:val="clear"/>
               <w:spacing w:after="0" w:before="0" w:line="240" w:lineRule="auto"/>
-              <w:ind w:left="1440" w:right="0" w:hanging="360"/>
+              <w:ind w:left="720" w:right="0" w:hanging="360"/>
               <w:jc w:val="left"/>
               <w:rPr>
-                <w:u w:val="none"/>
-              </w:rPr>
-            </w:pPr>
-            <w:r>
-              <w:rPr>
-                <w:rtl w:val="0"/>
-              </w:rPr>
-              <w:t xml:space="preserve">Trips</w:t>
+                <w:b w:val="1"/>
+                <w:bCs w:val="1"/>
+              </w:rPr>
+            </w:pPr>
+            <w:r>
+              <w:rPr>
+                <w:b w:val="1"/>
+                <w:bCs w:val="1"/>
+                <w:rtl w:val="0"/>
+              </w:rPr>
+              <w:t xml:space="preserve">Account</w:t>
             </w:r>
           </w:p>
           <w:p>
@@ -2068,7 +2406,39 @@
               <w:widowControl w:val="0"/>
               <w:numPr>
                 <w:ilvl w:val="1"/>
-                <w:numId w:val="8"/>
+                <w:numId w:val="14"/>
+              </w:numPr>
+              <w:pBdr>
+                <w:top w:space="0" w:sz="0" w:val="nil"/>
+                <w:left w:space="0" w:sz="0" w:val="nil"/>
+                <w:bottom w:space="0" w:sz="0" w:val="nil"/>
+                <w:right w:space="0" w:sz="0" w:val="nil"/>
+                <w:between w:space="0" w:sz="0" w:val="nil"/>
+              </w:pBdr>
+              <w:shd w:fill="auto" w:val="clear"/>
+              <w:spacing w:after="0" w:before="0" w:line="240" w:lineRule="auto"/>
+              <w:ind w:left="1440" w:right="0" w:hanging="360"/>
+              <w:jc w:val="left"/>
+              <w:rPr>
+                <w:u w:val="none"/>
+              </w:rPr>
+            </w:pPr>
+            <w:r>
+              <w:rPr>
+                <w:rtl w:val="0"/>
+              </w:rPr>
+              <w:t xml:space="preserve">Trips</w:t>
+            </w:r>
+          </w:p>
+          <w:p>
+            <w:pPr>
+              <w:keepNext w:val="0"/>
+              <w:keepLines w:val="0"/>
+              <w:pageBreakBefore w:val="0"/>
+              <w:widowControl w:val="0"/>
+              <w:numPr>
+                <w:ilvl w:val="1"/>
+                <w:numId w:val="14"/>
               </w:numPr>
               <w:pBdr>
                 <w:top w:space="0" w:sz="0" w:val="nil"/>
@@ -2106,209 +2476,7 @@
         </w:pBdr>
         <w:shd w:fill="ffffff" w:val="clear"/>
         <w:ind w:left="0" w:firstLine="0"/>
-        <w:rPr/>
-      </w:pPr>
-      <w:r>
-        <w:rPr>
-          <w:rtl w:val="0"/>
-        </w:rPr>
-      </w:r>
-    </w:p>
-    <w:p>
-      <w:pPr>
-        <w:pBdr>
-          <w:top w:color="auto" w:space="0" w:sz="0" w:val="none"/>
-          <w:left w:color="auto" w:space="0" w:sz="0" w:val="none"/>
-          <w:bottom w:color="auto" w:space="0" w:sz="0" w:val="none"/>
-          <w:right w:color="auto" w:space="0" w:sz="0" w:val="none"/>
-          <w:between w:color="auto" w:space="0" w:sz="0" w:val="none"/>
-        </w:pBdr>
-        <w:shd w:fill="ffffff" w:val="clear"/>
-        <w:ind w:left="0" w:firstLine="0"/>
-        <w:rPr/>
-      </w:pPr>
-      <w:r>
-        <w:rPr>
-          <w:rtl w:val="0"/>
-        </w:rPr>
-      </w:r>
-    </w:p>
-    <w:p>
-      <w:pPr>
-        <w:pBdr>
-          <w:top w:color="auto" w:space="0" w:sz="0" w:val="none"/>
-          <w:left w:color="auto" w:space="0" w:sz="0" w:val="none"/>
-          <w:bottom w:color="auto" w:space="0" w:sz="0" w:val="none"/>
-          <w:right w:color="auto" w:space="0" w:sz="0" w:val="none"/>
-          <w:between w:color="auto" w:space="0" w:sz="0" w:val="none"/>
-        </w:pBdr>
-        <w:shd w:fill="ffffff" w:val="clear"/>
-        <w:ind w:left="0" w:firstLine="0"/>
-        <w:rPr/>
-      </w:pPr>
-      <w:r>
-        <w:rPr>
-          <w:rtl w:val="0"/>
-        </w:rPr>
-      </w:r>
-    </w:p>
-    <w:p>
-      <w:pPr>
-        <w:pBdr>
-          <w:top w:color="auto" w:space="0" w:sz="0" w:val="none"/>
-          <w:left w:color="auto" w:space="0" w:sz="0" w:val="none"/>
-          <w:bottom w:color="auto" w:space="0" w:sz="0" w:val="none"/>
-          <w:right w:color="auto" w:space="0" w:sz="0" w:val="none"/>
-          <w:between w:color="auto" w:space="0" w:sz="0" w:val="none"/>
-        </w:pBdr>
-        <w:shd w:fill="ffffff" w:val="clear"/>
-        <w:ind w:left="0" w:firstLine="0"/>
-        <w:rPr/>
-      </w:pPr>
-      <w:r>
-        <w:rPr>
-          <w:rtl w:val="0"/>
-        </w:rPr>
-      </w:r>
-    </w:p>
-    <w:p>
-      <w:pPr>
-        <w:pBdr>
-          <w:top w:color="auto" w:space="0" w:sz="0" w:val="none"/>
-          <w:left w:color="auto" w:space="0" w:sz="0" w:val="none"/>
-          <w:bottom w:color="auto" w:space="0" w:sz="0" w:val="none"/>
-          <w:right w:color="auto" w:space="0" w:sz="0" w:val="none"/>
-          <w:between w:color="auto" w:space="0" w:sz="0" w:val="none"/>
-        </w:pBdr>
-        <w:shd w:fill="ffffff" w:val="clear"/>
-        <w:ind w:left="0" w:firstLine="0"/>
-        <w:rPr/>
-      </w:pPr>
-      <w:r>
-        <w:rPr>
-          <w:rtl w:val="0"/>
-        </w:rPr>
-      </w:r>
-    </w:p>
-    <w:p>
-      <w:pPr>
-        <w:pBdr>
-          <w:top w:color="auto" w:space="0" w:sz="0" w:val="none"/>
-          <w:left w:color="auto" w:space="0" w:sz="0" w:val="none"/>
-          <w:bottom w:color="auto" w:space="0" w:sz="0" w:val="none"/>
-          <w:right w:color="auto" w:space="0" w:sz="0" w:val="none"/>
-          <w:between w:color="auto" w:space="0" w:sz="0" w:val="none"/>
-        </w:pBdr>
-        <w:shd w:fill="ffffff" w:val="clear"/>
-        <w:ind w:left="0" w:firstLine="0"/>
-        <w:rPr/>
-      </w:pPr>
-      <w:r>
-        <w:rPr>
-          <w:rtl w:val="0"/>
-        </w:rPr>
-      </w:r>
-    </w:p>
-    <w:p>
-      <w:pPr>
-        <w:pBdr>
-          <w:top w:color="auto" w:space="0" w:sz="0" w:val="none"/>
-          <w:left w:color="auto" w:space="0" w:sz="0" w:val="none"/>
-          <w:bottom w:color="auto" w:space="0" w:sz="0" w:val="none"/>
-          <w:right w:color="auto" w:space="0" w:sz="0" w:val="none"/>
-          <w:between w:color="auto" w:space="0" w:sz="0" w:val="none"/>
-        </w:pBdr>
-        <w:shd w:fill="ffffff" w:val="clear"/>
-        <w:ind w:left="0" w:firstLine="0"/>
-        <w:rPr/>
-      </w:pPr>
-      <w:r>
-        <w:rPr>
-          <w:rtl w:val="0"/>
-        </w:rPr>
-      </w:r>
-    </w:p>
-    <w:p>
-      <w:pPr>
-        <w:pBdr>
-          <w:top w:color="auto" w:space="0" w:sz="0" w:val="none"/>
-          <w:left w:color="auto" w:space="0" w:sz="0" w:val="none"/>
-          <w:bottom w:color="auto" w:space="0" w:sz="0" w:val="none"/>
-          <w:right w:color="auto" w:space="0" w:sz="0" w:val="none"/>
-          <w:between w:color="auto" w:space="0" w:sz="0" w:val="none"/>
-        </w:pBdr>
-        <w:shd w:fill="ffffff" w:val="clear"/>
-        <w:ind w:left="0" w:firstLine="0"/>
-        <w:jc w:val="center"/>
-        <w:rPr>
-          <w:b w:val="1"/>
-          <w:bCs w:val="1"/>
-        </w:rPr>
-      </w:pPr>
-      <w:r>
-        <w:rPr>
-          <w:rtl w:val="0"/>
-        </w:rPr>
-      </w:r>
-    </w:p>
-    <w:p>
-      <w:pPr>
-        <w:pBdr>
-          <w:top w:color="auto" w:space="0" w:sz="0" w:val="none"/>
-          <w:left w:color="auto" w:space="0" w:sz="0" w:val="none"/>
-          <w:bottom w:color="auto" w:space="0" w:sz="0" w:val="none"/>
-          <w:right w:color="auto" w:space="0" w:sz="0" w:val="none"/>
-          <w:between w:color="auto" w:space="0" w:sz="0" w:val="none"/>
-        </w:pBdr>
-        <w:shd w:fill="ffffff" w:val="clear"/>
-        <w:ind w:left="0" w:firstLine="0"/>
-        <w:jc w:val="center"/>
-        <w:rPr>
-          <w:b w:val="1"/>
-          <w:bCs w:val="1"/>
-        </w:rPr>
-      </w:pPr>
-      <w:r>
-        <w:rPr>
-          <w:rtl w:val="0"/>
-        </w:rPr>
-      </w:r>
-    </w:p>
-    <w:p>
-      <w:pPr>
-        <w:pBdr>
-          <w:top w:color="auto" w:space="0" w:sz="0" w:val="none"/>
-          <w:left w:color="auto" w:space="0" w:sz="0" w:val="none"/>
-          <w:bottom w:color="auto" w:space="0" w:sz="0" w:val="none"/>
-          <w:right w:color="auto" w:space="0" w:sz="0" w:val="none"/>
-          <w:between w:color="auto" w:space="0" w:sz="0" w:val="none"/>
-        </w:pBdr>
-        <w:shd w:fill="ffffff" w:val="clear"/>
-        <w:ind w:left="0" w:firstLine="0"/>
-        <w:jc w:val="center"/>
-        <w:rPr>
-          <w:b w:val="1"/>
-          <w:bCs w:val="1"/>
-        </w:rPr>
-      </w:pPr>
-      <w:r>
-        <w:rPr>
-          <w:rtl w:val="0"/>
-        </w:rPr>
-      </w:r>
-    </w:p>
-    <w:p>
-      <w:pPr>
-        <w:pBdr>
-          <w:top w:color="auto" w:space="0" w:sz="0" w:val="none"/>
-          <w:left w:color="auto" w:space="0" w:sz="0" w:val="none"/>
-          <w:bottom w:color="auto" w:space="0" w:sz="0" w:val="none"/>
-          <w:right w:color="auto" w:space="0" w:sz="0" w:val="none"/>
-          <w:between w:color="auto" w:space="0" w:sz="0" w:val="none"/>
-        </w:pBdr>
-        <w:shd w:fill="ffffff" w:val="clear"/>
-        <w:ind w:left="0" w:firstLine="0"/>
-        <w:jc w:val="center"/>
+        <w:jc w:val="left"/>
         <w:rPr>
           <w:b w:val="1"/>
           <w:bCs w:val="1"/>
@@ -2682,25 +2850,6 @@
         </w:pBdr>
         <w:shd w:fill="ffffff" w:val="clear"/>
         <w:ind w:left="0" w:firstLine="0"/>
-        <w:rPr/>
-      </w:pPr>
-      <w:r>
-        <w:rPr>
-          <w:rtl w:val="0"/>
-        </w:rPr>
-      </w:r>
-    </w:p>
-    <w:p>
-      <w:pPr>
-        <w:pBdr>
-          <w:top w:color="auto" w:space="0" w:sz="0" w:val="none"/>
-          <w:left w:color="auto" w:space="0" w:sz="0" w:val="none"/>
-          <w:bottom w:color="auto" w:space="0" w:sz="0" w:val="none"/>
-          <w:right w:color="auto" w:space="0" w:sz="0" w:val="none"/>
-          <w:between w:color="auto" w:space="0" w:sz="0" w:val="none"/>
-        </w:pBdr>
-        <w:shd w:fill="ffffff" w:val="clear"/>
-        <w:ind w:left="0" w:firstLine="0"/>
         <w:jc w:val="center"/>
         <w:rPr>
           <w:b w:val="1"/>
@@ -2764,7 +2913,7 @@
               <w:widowControl w:val="0"/>
               <w:numPr>
                 <w:ilvl w:val="0"/>
-                <w:numId w:val="10"/>
+                <w:numId w:val="18"/>
               </w:numPr>
               <w:pBdr>
                 <w:top w:space="0" w:sz="0" w:val="nil"/>
@@ -2796,7 +2945,7 @@
               <w:widowControl w:val="0"/>
               <w:numPr>
                 <w:ilvl w:val="0"/>
-                <w:numId w:val="10"/>
+                <w:numId w:val="18"/>
               </w:numPr>
               <w:pBdr>
                 <w:top w:space="0" w:sz="0" w:val="nil"/>
@@ -2828,7 +2977,7 @@
               <w:widowControl w:val="0"/>
               <w:numPr>
                 <w:ilvl w:val="0"/>
-                <w:numId w:val="10"/>
+                <w:numId w:val="18"/>
               </w:numPr>
               <w:pBdr>
                 <w:top w:space="0" w:sz="0" w:val="nil"/>
@@ -2860,7 +3009,7 @@
               <w:widowControl w:val="0"/>
               <w:numPr>
                 <w:ilvl w:val="0"/>
-                <w:numId w:val="10"/>
+                <w:numId w:val="18"/>
               </w:numPr>
               <w:pBdr>
                 <w:top w:space="0" w:sz="0" w:val="nil"/>
@@ -2892,7 +3041,7 @@
               <w:widowControl w:val="0"/>
               <w:numPr>
                 <w:ilvl w:val="0"/>
-                <w:numId w:val="10"/>
+                <w:numId w:val="18"/>
               </w:numPr>
               <w:pBdr>
                 <w:top w:space="0" w:sz="0" w:val="nil"/>
@@ -2930,275 +3079,7 @@
         </w:pBdr>
         <w:shd w:fill="ffffff" w:val="clear"/>
         <w:ind w:left="0" w:firstLine="0"/>
-        <w:rPr/>
-      </w:pPr>
-      <w:r>
-        <w:rPr>
-          <w:rtl w:val="0"/>
-        </w:rPr>
-      </w:r>
-    </w:p>
-    <w:p>
-      <w:pPr>
-        <w:pBdr>
-          <w:top w:color="auto" w:space="0" w:sz="0" w:val="none"/>
-          <w:left w:color="auto" w:space="0" w:sz="0" w:val="none"/>
-          <w:bottom w:color="auto" w:space="0" w:sz="0" w:val="none"/>
-          <w:right w:color="auto" w:space="0" w:sz="0" w:val="none"/>
-          <w:between w:color="auto" w:space="0" w:sz="0" w:val="none"/>
-        </w:pBdr>
-        <w:shd w:fill="ffffff" w:val="clear"/>
-        <w:ind w:left="0" w:firstLine="0"/>
-        <w:rPr/>
-      </w:pPr>
-      <w:r>
-        <w:rPr>
-          <w:rtl w:val="0"/>
-        </w:rPr>
-      </w:r>
-    </w:p>
-    <w:p>
-      <w:pPr>
-        <w:pBdr>
-          <w:top w:color="auto" w:space="0" w:sz="0" w:val="none"/>
-          <w:left w:color="auto" w:space="0" w:sz="0" w:val="none"/>
-          <w:bottom w:color="auto" w:space="0" w:sz="0" w:val="none"/>
-          <w:right w:color="auto" w:space="0" w:sz="0" w:val="none"/>
-          <w:between w:color="auto" w:space="0" w:sz="0" w:val="none"/>
-        </w:pBdr>
-        <w:shd w:fill="ffffff" w:val="clear"/>
-        <w:ind w:left="0" w:firstLine="0"/>
-        <w:jc w:val="center"/>
-        <w:rPr>
-          <w:b w:val="1"/>
-          <w:bCs w:val="1"/>
-        </w:rPr>
-      </w:pPr>
-      <w:r>
-        <w:rPr>
-          <w:rtl w:val="0"/>
-        </w:rPr>
-      </w:r>
-    </w:p>
-    <w:p>
-      <w:pPr>
-        <w:pBdr>
-          <w:top w:color="auto" w:space="0" w:sz="0" w:val="none"/>
-          <w:left w:color="auto" w:space="0" w:sz="0" w:val="none"/>
-          <w:bottom w:color="auto" w:space="0" w:sz="0" w:val="none"/>
-          <w:right w:color="auto" w:space="0" w:sz="0" w:val="none"/>
-          <w:between w:color="auto" w:space="0" w:sz="0" w:val="none"/>
-        </w:pBdr>
-        <w:shd w:fill="ffffff" w:val="clear"/>
-        <w:ind w:left="0" w:firstLine="0"/>
-        <w:jc w:val="center"/>
-        <w:rPr>
-          <w:b w:val="1"/>
-          <w:bCs w:val="1"/>
-        </w:rPr>
-      </w:pPr>
-      <w:r>
-        <w:rPr>
-          <w:rtl w:val="0"/>
-        </w:rPr>
-      </w:r>
-    </w:p>
-    <w:p>
-      <w:pPr>
-        <w:pBdr>
-          <w:top w:color="auto" w:space="0" w:sz="0" w:val="none"/>
-          <w:left w:color="auto" w:space="0" w:sz="0" w:val="none"/>
-          <w:bottom w:color="auto" w:space="0" w:sz="0" w:val="none"/>
-          <w:right w:color="auto" w:space="0" w:sz="0" w:val="none"/>
-          <w:between w:color="auto" w:space="0" w:sz="0" w:val="none"/>
-        </w:pBdr>
-        <w:shd w:fill="ffffff" w:val="clear"/>
-        <w:ind w:left="0" w:firstLine="0"/>
-        <w:jc w:val="center"/>
-        <w:rPr>
-          <w:b w:val="1"/>
-          <w:bCs w:val="1"/>
-        </w:rPr>
-      </w:pPr>
-      <w:r>
-        <w:rPr>
-          <w:rtl w:val="0"/>
-        </w:rPr>
-      </w:r>
-    </w:p>
-    <w:p>
-      <w:pPr>
-        <w:pBdr>
-          <w:top w:color="auto" w:space="0" w:sz="0" w:val="none"/>
-          <w:left w:color="auto" w:space="0" w:sz="0" w:val="none"/>
-          <w:bottom w:color="auto" w:space="0" w:sz="0" w:val="none"/>
-          <w:right w:color="auto" w:space="0" w:sz="0" w:val="none"/>
-          <w:between w:color="auto" w:space="0" w:sz="0" w:val="none"/>
-        </w:pBdr>
-        <w:shd w:fill="ffffff" w:val="clear"/>
-        <w:ind w:left="0" w:firstLine="0"/>
-        <w:jc w:val="center"/>
-        <w:rPr>
-          <w:b w:val="1"/>
-          <w:bCs w:val="1"/>
-        </w:rPr>
-      </w:pPr>
-      <w:r>
-        <w:rPr>
-          <w:rtl w:val="0"/>
-        </w:rPr>
-      </w:r>
-    </w:p>
-    <w:p>
-      <w:pPr>
-        <w:pBdr>
-          <w:top w:color="auto" w:space="0" w:sz="0" w:val="none"/>
-          <w:left w:color="auto" w:space="0" w:sz="0" w:val="none"/>
-          <w:bottom w:color="auto" w:space="0" w:sz="0" w:val="none"/>
-          <w:right w:color="auto" w:space="0" w:sz="0" w:val="none"/>
-          <w:between w:color="auto" w:space="0" w:sz="0" w:val="none"/>
-        </w:pBdr>
-        <w:shd w:fill="ffffff" w:val="clear"/>
-        <w:ind w:left="0" w:firstLine="0"/>
-        <w:jc w:val="center"/>
-        <w:rPr>
-          <w:b w:val="1"/>
-          <w:bCs w:val="1"/>
-        </w:rPr>
-      </w:pPr>
-      <w:r>
-        <w:rPr>
-          <w:rtl w:val="0"/>
-        </w:rPr>
-      </w:r>
-    </w:p>
-    <w:p>
-      <w:pPr>
-        <w:pBdr>
-          <w:top w:color="auto" w:space="0" w:sz="0" w:val="none"/>
-          <w:left w:color="auto" w:space="0" w:sz="0" w:val="none"/>
-          <w:bottom w:color="auto" w:space="0" w:sz="0" w:val="none"/>
-          <w:right w:color="auto" w:space="0" w:sz="0" w:val="none"/>
-          <w:between w:color="auto" w:space="0" w:sz="0" w:val="none"/>
-        </w:pBdr>
-        <w:shd w:fill="ffffff" w:val="clear"/>
-        <w:ind w:left="0" w:firstLine="0"/>
-        <w:jc w:val="center"/>
-        <w:rPr>
-          <w:b w:val="1"/>
-          <w:bCs w:val="1"/>
-        </w:rPr>
-      </w:pPr>
-      <w:r>
-        <w:rPr>
-          <w:rtl w:val="0"/>
-        </w:rPr>
-      </w:r>
-    </w:p>
-    <w:p>
-      <w:pPr>
-        <w:pBdr>
-          <w:top w:color="auto" w:space="0" w:sz="0" w:val="none"/>
-          <w:left w:color="auto" w:space="0" w:sz="0" w:val="none"/>
-          <w:bottom w:color="auto" w:space="0" w:sz="0" w:val="none"/>
-          <w:right w:color="auto" w:space="0" w:sz="0" w:val="none"/>
-          <w:between w:color="auto" w:space="0" w:sz="0" w:val="none"/>
-        </w:pBdr>
-        <w:shd w:fill="ffffff" w:val="clear"/>
-        <w:ind w:left="0" w:firstLine="0"/>
-        <w:jc w:val="center"/>
-        <w:rPr>
-          <w:b w:val="1"/>
-          <w:bCs w:val="1"/>
-        </w:rPr>
-      </w:pPr>
-      <w:r>
-        <w:rPr>
-          <w:rtl w:val="0"/>
-        </w:rPr>
-      </w:r>
-    </w:p>
-    <w:p>
-      <w:pPr>
-        <w:pBdr>
-          <w:top w:color="auto" w:space="0" w:sz="0" w:val="none"/>
-          <w:left w:color="auto" w:space="0" w:sz="0" w:val="none"/>
-          <w:bottom w:color="auto" w:space="0" w:sz="0" w:val="none"/>
-          <w:right w:color="auto" w:space="0" w:sz="0" w:val="none"/>
-          <w:between w:color="auto" w:space="0" w:sz="0" w:val="none"/>
-        </w:pBdr>
-        <w:shd w:fill="ffffff" w:val="clear"/>
-        <w:ind w:left="0" w:firstLine="0"/>
-        <w:jc w:val="center"/>
-        <w:rPr>
-          <w:b w:val="1"/>
-          <w:bCs w:val="1"/>
-        </w:rPr>
-      </w:pPr>
-      <w:r>
-        <w:rPr>
-          <w:rtl w:val="0"/>
-        </w:rPr>
-      </w:r>
-    </w:p>
-    <w:p>
-      <w:pPr>
-        <w:pBdr>
-          <w:top w:color="auto" w:space="0" w:sz="0" w:val="none"/>
-          <w:left w:color="auto" w:space="0" w:sz="0" w:val="none"/>
-          <w:bottom w:color="auto" w:space="0" w:sz="0" w:val="none"/>
-          <w:right w:color="auto" w:space="0" w:sz="0" w:val="none"/>
-          <w:between w:color="auto" w:space="0" w:sz="0" w:val="none"/>
-        </w:pBdr>
-        <w:shd w:fill="ffffff" w:val="clear"/>
-        <w:ind w:left="0" w:firstLine="0"/>
-        <w:jc w:val="center"/>
-        <w:rPr>
-          <w:b w:val="1"/>
-          <w:bCs w:val="1"/>
-        </w:rPr>
-      </w:pPr>
-      <w:r>
-        <w:rPr>
-          <w:rtl w:val="0"/>
-        </w:rPr>
-      </w:r>
-    </w:p>
-    <w:p>
-      <w:pPr>
-        <w:pBdr>
-          <w:top w:color="auto" w:space="0" w:sz="0" w:val="none"/>
-          <w:left w:color="auto" w:space="0" w:sz="0" w:val="none"/>
-          <w:bottom w:color="auto" w:space="0" w:sz="0" w:val="none"/>
-          <w:right w:color="auto" w:space="0" w:sz="0" w:val="none"/>
-          <w:between w:color="auto" w:space="0" w:sz="0" w:val="none"/>
-        </w:pBdr>
-        <w:shd w:fill="ffffff" w:val="clear"/>
-        <w:ind w:left="0" w:firstLine="0"/>
-        <w:jc w:val="center"/>
-        <w:rPr>
-          <w:b w:val="1"/>
-          <w:bCs w:val="1"/>
-        </w:rPr>
-      </w:pPr>
-      <w:r>
-        <w:rPr>
-          <w:rtl w:val="0"/>
-        </w:rPr>
-      </w:r>
-    </w:p>
-    <w:p>
-      <w:pPr>
-        <w:pBdr>
-          <w:top w:color="auto" w:space="0" w:sz="0" w:val="none"/>
-          <w:left w:color="auto" w:space="0" w:sz="0" w:val="none"/>
-          <w:bottom w:color="auto" w:space="0" w:sz="0" w:val="none"/>
-          <w:right w:color="auto" w:space="0" w:sz="0" w:val="none"/>
-          <w:between w:color="auto" w:space="0" w:sz="0" w:val="none"/>
-        </w:pBdr>
-        <w:shd w:fill="ffffff" w:val="clear"/>
-        <w:ind w:left="0" w:firstLine="0"/>
-        <w:jc w:val="center"/>
+        <w:jc w:val="left"/>
         <w:rPr>
           <w:b w:val="1"/>
           <w:bCs w:val="1"/>
@@ -3330,7 +3211,7 @@
               <w:widowControl w:val="0"/>
               <w:numPr>
                 <w:ilvl w:val="0"/>
-                <w:numId w:val="6"/>
+                <w:numId w:val="10"/>
               </w:numPr>
               <w:pBdr>
                 <w:top w:color="auto" w:space="0" w:sz="0" w:val="none"/>
@@ -3356,7 +3237,7 @@
                 <w:szCs w:val="24"/>
                 <w:rtl w:val="0"/>
               </w:rPr>
-              <w:t xml:space="preserve">Start at homepage, Book Trip, Destinations, Hidden Gems (10sec)</w:t>
+              <w:t xml:space="preserve">Start at homepage, Book Trip, Destinations, Hidden Gems (about 10sec)</w:t>
             </w:r>
           </w:p>
           <w:p>
@@ -3364,7 +3245,7 @@
               <w:widowControl w:val="0"/>
               <w:numPr>
                 <w:ilvl w:val="0"/>
-                <w:numId w:val="6"/>
+                <w:numId w:val="10"/>
               </w:numPr>
               <w:pBdr>
                 <w:top w:color="auto" w:space="0" w:sz="0" w:val="none"/>
@@ -3390,7 +3271,7 @@
                 <w:szCs w:val="24"/>
                 <w:rtl w:val="0"/>
               </w:rPr>
-              <w:t xml:space="preserve">Start at homepage, Account Information, Trips (5 secs)</w:t>
+              <w:t xml:space="preserve">Start at homepage, Account Information, Trips (about 5 secs)</w:t>
             </w:r>
           </w:p>
           <w:p>
@@ -3398,7 +3279,7 @@
               <w:widowControl w:val="0"/>
               <w:numPr>
                 <w:ilvl w:val="0"/>
-                <w:numId w:val="6"/>
+                <w:numId w:val="10"/>
               </w:numPr>
               <w:pBdr>
                 <w:top w:color="auto" w:space="0" w:sz="0" w:val="none"/>
@@ -3423,7 +3304,7 @@
                 <w:szCs w:val="24"/>
                 <w:rtl w:val="0"/>
               </w:rPr>
-              <w:t xml:space="preserve">Start at homepage, Book Trip, Destinations Page, Destination Information, Flight Price Comparison (12 secs)</w:t>
+              <w:t xml:space="preserve">Start at homepage, Book Trip, Destinations Page, Destination Information, Flight Price Comparison (about 12 secs)</w:t>
             </w:r>
           </w:p>
           <w:p>
@@ -3431,7 +3312,7 @@
               <w:widowControl w:val="0"/>
               <w:numPr>
                 <w:ilvl w:val="0"/>
-                <w:numId w:val="6"/>
+                <w:numId w:val="10"/>
               </w:numPr>
               <w:pBdr>
                 <w:top w:color="auto" w:space="0" w:sz="0" w:val="none"/>
@@ -3457,7 +3338,7 @@
                 <w:szCs w:val="24"/>
                 <w:rtl w:val="0"/>
               </w:rPr>
-              <w:t xml:space="preserve">Start at homepage, Account, Payments (5 secs)</w:t>
+              <w:t xml:space="preserve">Start at homepage, Account, Payments (about 5 secs)</w:t>
             </w:r>
           </w:p>
           <w:p>
@@ -3465,7 +3346,7 @@
               <w:widowControl w:val="0"/>
               <w:numPr>
                 <w:ilvl w:val="0"/>
-                <w:numId w:val="6"/>
+                <w:numId w:val="10"/>
               </w:numPr>
               <w:pBdr>
                 <w:top w:color="auto" w:space="0" w:sz="0" w:val="none"/>
@@ -3487,7 +3368,7 @@
                 <w:szCs w:val="24"/>
                 <w:rtl w:val="0"/>
               </w:rPr>
-              <w:t xml:space="preserve">Start at homepage, Travel Checklist (3 secs)</w:t>
+              <w:t xml:space="preserve">Start at homepage, Travel Checklist (about 3 secs)</w:t>
             </w:r>
             <w:r>
               <w:rPr>
@@ -3498,197 +3379,6 @@
         </w:tc>
       </w:tr>
     </w:tbl>
-    <w:p>
-      <w:pPr>
-        <w:pBdr>
-          <w:top w:color="auto" w:space="0" w:sz="0" w:val="none"/>
-          <w:left w:color="auto" w:space="0" w:sz="0" w:val="none"/>
-          <w:bottom w:color="auto" w:space="0" w:sz="0" w:val="none"/>
-          <w:right w:color="auto" w:space="0" w:sz="0" w:val="none"/>
-          <w:between w:color="auto" w:space="0" w:sz="0" w:val="none"/>
-        </w:pBdr>
-        <w:shd w:fill="ffffff" w:val="clear"/>
-        <w:ind w:left="0" w:firstLine="0"/>
-        <w:jc w:val="left"/>
-        <w:rPr>
-          <w:b w:val="1"/>
-          <w:bCs w:val="1"/>
-        </w:rPr>
-      </w:pPr>
-      <w:r>
-        <w:rPr>
-          <w:rtl w:val="0"/>
-        </w:rPr>
-      </w:r>
-    </w:p>
-    <w:p>
-      <w:pPr>
-        <w:pBdr>
-          <w:top w:color="auto" w:space="0" w:sz="0" w:val="none"/>
-          <w:left w:color="auto" w:space="0" w:sz="0" w:val="none"/>
-          <w:bottom w:color="auto" w:space="0" w:sz="0" w:val="none"/>
-          <w:right w:color="auto" w:space="0" w:sz="0" w:val="none"/>
-          <w:between w:color="auto" w:space="0" w:sz="0" w:val="none"/>
-        </w:pBdr>
-        <w:shd w:fill="ffffff" w:val="clear"/>
-        <w:rPr>
-          <w:b w:val="1"/>
-          <w:bCs w:val="1"/>
-        </w:rPr>
-      </w:pPr>
-      <w:r>
-        <w:rPr>
-          <w:rtl w:val="0"/>
-        </w:rPr>
-      </w:r>
-    </w:p>
-    <w:p>
-      <w:pPr>
-        <w:pBdr>
-          <w:top w:color="auto" w:space="0" w:sz="0" w:val="none"/>
-          <w:left w:color="auto" w:space="0" w:sz="0" w:val="none"/>
-          <w:bottom w:color="auto" w:space="0" w:sz="0" w:val="none"/>
-          <w:right w:color="auto" w:space="0" w:sz="0" w:val="none"/>
-          <w:between w:color="auto" w:space="0" w:sz="0" w:val="none"/>
-        </w:pBdr>
-        <w:shd w:fill="ffffff" w:val="clear"/>
-        <w:rPr>
-          <w:b w:val="1"/>
-          <w:bCs w:val="1"/>
-        </w:rPr>
-      </w:pPr>
-      <w:r>
-        <w:rPr>
-          <w:rtl w:val="0"/>
-        </w:rPr>
-      </w:r>
-    </w:p>
-    <w:p>
-      <w:pPr>
-        <w:pBdr>
-          <w:top w:color="auto" w:space="0" w:sz="0" w:val="none"/>
-          <w:left w:color="auto" w:space="0" w:sz="0" w:val="none"/>
-          <w:bottom w:color="auto" w:space="0" w:sz="0" w:val="none"/>
-          <w:right w:color="auto" w:space="0" w:sz="0" w:val="none"/>
-          <w:between w:color="auto" w:space="0" w:sz="0" w:val="none"/>
-        </w:pBdr>
-        <w:shd w:fill="ffffff" w:val="clear"/>
-        <w:rPr>
-          <w:b w:val="1"/>
-          <w:bCs w:val="1"/>
-        </w:rPr>
-      </w:pPr>
-      <w:r>
-        <w:rPr>
-          <w:rtl w:val="0"/>
-        </w:rPr>
-      </w:r>
-    </w:p>
-    <w:p>
-      <w:pPr>
-        <w:pBdr>
-          <w:top w:color="auto" w:space="0" w:sz="0" w:val="none"/>
-          <w:left w:color="auto" w:space="0" w:sz="0" w:val="none"/>
-          <w:bottom w:color="auto" w:space="0" w:sz="0" w:val="none"/>
-          <w:right w:color="auto" w:space="0" w:sz="0" w:val="none"/>
-          <w:between w:color="auto" w:space="0" w:sz="0" w:val="none"/>
-        </w:pBdr>
-        <w:shd w:fill="ffffff" w:val="clear"/>
-        <w:rPr>
-          <w:b w:val="1"/>
-          <w:bCs w:val="1"/>
-        </w:rPr>
-      </w:pPr>
-      <w:r>
-        <w:rPr>
-          <w:rtl w:val="0"/>
-        </w:rPr>
-      </w:r>
-    </w:p>
-    <w:p>
-      <w:pPr>
-        <w:pBdr>
-          <w:top w:color="auto" w:space="0" w:sz="0" w:val="none"/>
-          <w:left w:color="auto" w:space="0" w:sz="0" w:val="none"/>
-          <w:bottom w:color="auto" w:space="0" w:sz="0" w:val="none"/>
-          <w:right w:color="auto" w:space="0" w:sz="0" w:val="none"/>
-          <w:between w:color="auto" w:space="0" w:sz="0" w:val="none"/>
-        </w:pBdr>
-        <w:shd w:fill="ffffff" w:val="clear"/>
-        <w:rPr>
-          <w:b w:val="1"/>
-          <w:bCs w:val="1"/>
-        </w:rPr>
-      </w:pPr>
-      <w:r>
-        <w:rPr>
-          <w:rtl w:val="0"/>
-        </w:rPr>
-      </w:r>
-    </w:p>
-    <w:p>
-      <w:pPr>
-        <w:pBdr>
-          <w:top w:color="auto" w:space="0" w:sz="0" w:val="none"/>
-          <w:left w:color="auto" w:space="0" w:sz="0" w:val="none"/>
-          <w:bottom w:color="auto" w:space="0" w:sz="0" w:val="none"/>
-          <w:right w:color="auto" w:space="0" w:sz="0" w:val="none"/>
-          <w:between w:color="auto" w:space="0" w:sz="0" w:val="none"/>
-        </w:pBdr>
-        <w:shd w:fill="ffffff" w:val="clear"/>
-        <w:rPr>
-          <w:b w:val="1"/>
-          <w:bCs w:val="1"/>
-        </w:rPr>
-      </w:pPr>
-      <w:r>
-        <w:rPr>
-          <w:rtl w:val="0"/>
-        </w:rPr>
-      </w:r>
-    </w:p>
-    <w:p>
-      <w:pPr>
-        <w:pBdr>
-          <w:top w:color="auto" w:space="0" w:sz="0" w:val="none"/>
-          <w:left w:color="auto" w:space="0" w:sz="0" w:val="none"/>
-          <w:bottom w:color="auto" w:space="0" w:sz="0" w:val="none"/>
-          <w:right w:color="auto" w:space="0" w:sz="0" w:val="none"/>
-          <w:between w:color="auto" w:space="0" w:sz="0" w:val="none"/>
-        </w:pBdr>
-        <w:shd w:fill="ffffff" w:val="clear"/>
-        <w:rPr>
-          <w:b w:val="1"/>
-          <w:bCs w:val="1"/>
-        </w:rPr>
-      </w:pPr>
-      <w:r>
-        <w:rPr>
-          <w:rtl w:val="0"/>
-        </w:rPr>
-      </w:r>
-    </w:p>
-    <w:p>
-      <w:pPr>
-        <w:pBdr>
-          <w:top w:color="auto" w:space="0" w:sz="0" w:val="none"/>
-          <w:left w:color="auto" w:space="0" w:sz="0" w:val="none"/>
-          <w:bottom w:color="auto" w:space="0" w:sz="0" w:val="none"/>
-          <w:right w:color="auto" w:space="0" w:sz="0" w:val="none"/>
-          <w:between w:color="auto" w:space="0" w:sz="0" w:val="none"/>
-        </w:pBdr>
-        <w:shd w:fill="ffffff" w:val="clear"/>
-        <w:rPr>
-          <w:b w:val="1"/>
-          <w:bCs w:val="1"/>
-        </w:rPr>
-      </w:pPr>
-      <w:r>
-        <w:rPr>
-          <w:rtl w:val="0"/>
-        </w:rPr>
-      </w:r>
-    </w:p>
     <w:p>
       <w:pPr>
         <w:pBdr>
@@ -3827,7 +3517,7 @@
               <w:widowControl w:val="0"/>
               <w:numPr>
                 <w:ilvl w:val="0"/>
-                <w:numId w:val="4"/>
+                <w:numId w:val="7"/>
               </w:numPr>
               <w:pBdr>
                 <w:top w:color="auto" w:space="0" w:sz="0" w:val="none"/>
@@ -3897,7 +3587,7 @@
               <w:widowControl w:val="0"/>
               <w:numPr>
                 <w:ilvl w:val="0"/>
-                <w:numId w:val="5"/>
+                <w:numId w:val="8"/>
               </w:numPr>
               <w:pBdr>
                 <w:top w:color="auto" w:space="0" w:sz="0" w:val="none"/>
@@ -4039,7 +3729,7 @@
               <w:widowControl w:val="0"/>
               <w:numPr>
                 <w:ilvl w:val="0"/>
-                <w:numId w:val="3"/>
+                <w:numId w:val="5"/>
               </w:numPr>
               <w:pBdr>
                 <w:top w:color="auto" w:space="0" w:sz="0" w:val="none"/>
@@ -4109,7 +3799,7 @@
               <w:widowControl w:val="0"/>
               <w:numPr>
                 <w:ilvl w:val="0"/>
-                <w:numId w:val="7"/>
+                <w:numId w:val="13"/>
               </w:numPr>
               <w:pBdr>
                 <w:top w:color="auto" w:space="0" w:sz="0" w:val="none"/>
@@ -4182,6 +3872,216 @@
         </w:tc>
       </w:tr>
     </w:tbl>
+    <w:p>
+      <w:pPr>
+        <w:pBdr>
+          <w:top w:color="auto" w:space="0" w:sz="0" w:val="none"/>
+          <w:left w:color="auto" w:space="0" w:sz="0" w:val="none"/>
+          <w:bottom w:color="auto" w:space="0" w:sz="0" w:val="none"/>
+          <w:right w:color="auto" w:space="0" w:sz="0" w:val="none"/>
+          <w:between w:color="auto" w:space="0" w:sz="0" w:val="none"/>
+        </w:pBdr>
+        <w:shd w:fill="ffffff" w:val="clear"/>
+        <w:rPr>
+          <w:b w:val="1"/>
+          <w:bCs w:val="1"/>
+        </w:rPr>
+      </w:pPr>
+      <w:r>
+        <w:rPr>
+          <w:rtl w:val="0"/>
+        </w:rPr>
+      </w:r>
+    </w:p>
+    <w:p>
+      <w:pPr>
+        <w:pBdr>
+          <w:top w:color="auto" w:space="0" w:sz="0" w:val="none"/>
+          <w:left w:color="auto" w:space="0" w:sz="0" w:val="none"/>
+          <w:bottom w:color="auto" w:space="0" w:sz="0" w:val="none"/>
+          <w:right w:color="auto" w:space="0" w:sz="0" w:val="none"/>
+          <w:between w:color="auto" w:space="0" w:sz="0" w:val="none"/>
+        </w:pBdr>
+        <w:shd w:fill="ffffff" w:val="clear"/>
+        <w:rPr>
+          <w:b w:val="1"/>
+          <w:bCs w:val="1"/>
+        </w:rPr>
+      </w:pPr>
+      <w:r>
+        <w:rPr>
+          <w:rtl w:val="0"/>
+        </w:rPr>
+      </w:r>
+    </w:p>
+    <w:p>
+      <w:pPr>
+        <w:pBdr>
+          <w:top w:color="auto" w:space="0" w:sz="0" w:val="none"/>
+          <w:left w:color="auto" w:space="0" w:sz="0" w:val="none"/>
+          <w:bottom w:color="auto" w:space="0" w:sz="0" w:val="none"/>
+          <w:right w:color="auto" w:space="0" w:sz="0" w:val="none"/>
+          <w:between w:color="auto" w:space="0" w:sz="0" w:val="none"/>
+        </w:pBdr>
+        <w:shd w:fill="ffffff" w:val="clear"/>
+        <w:rPr>
+          <w:b w:val="1"/>
+          <w:bCs w:val="1"/>
+        </w:rPr>
+      </w:pPr>
+      <w:r>
+        <w:rPr>
+          <w:rtl w:val="0"/>
+        </w:rPr>
+      </w:r>
+    </w:p>
+    <w:p>
+      <w:pPr>
+        <w:pBdr>
+          <w:top w:color="auto" w:space="0" w:sz="0" w:val="none"/>
+          <w:left w:color="auto" w:space="0" w:sz="0" w:val="none"/>
+          <w:bottom w:color="auto" w:space="0" w:sz="0" w:val="none"/>
+          <w:right w:color="auto" w:space="0" w:sz="0" w:val="none"/>
+          <w:between w:color="auto" w:space="0" w:sz="0" w:val="none"/>
+        </w:pBdr>
+        <w:shd w:fill="ffffff" w:val="clear"/>
+        <w:rPr>
+          <w:b w:val="1"/>
+          <w:bCs w:val="1"/>
+        </w:rPr>
+      </w:pPr>
+      <w:r>
+        <w:rPr>
+          <w:rtl w:val="0"/>
+        </w:rPr>
+      </w:r>
+    </w:p>
+    <w:p>
+      <w:pPr>
+        <w:pBdr>
+          <w:top w:color="auto" w:space="0" w:sz="0" w:val="none"/>
+          <w:left w:color="auto" w:space="0" w:sz="0" w:val="none"/>
+          <w:bottom w:color="auto" w:space="0" w:sz="0" w:val="none"/>
+          <w:right w:color="auto" w:space="0" w:sz="0" w:val="none"/>
+          <w:between w:color="auto" w:space="0" w:sz="0" w:val="none"/>
+        </w:pBdr>
+        <w:shd w:fill="ffffff" w:val="clear"/>
+        <w:rPr>
+          <w:b w:val="1"/>
+          <w:bCs w:val="1"/>
+        </w:rPr>
+      </w:pPr>
+      <w:r>
+        <w:rPr>
+          <w:rtl w:val="0"/>
+        </w:rPr>
+      </w:r>
+    </w:p>
+    <w:p>
+      <w:pPr>
+        <w:pBdr>
+          <w:top w:color="auto" w:space="0" w:sz="0" w:val="none"/>
+          <w:left w:color="auto" w:space="0" w:sz="0" w:val="none"/>
+          <w:bottom w:color="auto" w:space="0" w:sz="0" w:val="none"/>
+          <w:right w:color="auto" w:space="0" w:sz="0" w:val="none"/>
+          <w:between w:color="auto" w:space="0" w:sz="0" w:val="none"/>
+        </w:pBdr>
+        <w:shd w:fill="ffffff" w:val="clear"/>
+        <w:rPr>
+          <w:b w:val="1"/>
+          <w:bCs w:val="1"/>
+        </w:rPr>
+      </w:pPr>
+      <w:r>
+        <w:rPr>
+          <w:rtl w:val="0"/>
+        </w:rPr>
+      </w:r>
+    </w:p>
+    <w:p>
+      <w:pPr>
+        <w:pBdr>
+          <w:top w:color="auto" w:space="0" w:sz="0" w:val="none"/>
+          <w:left w:color="auto" w:space="0" w:sz="0" w:val="none"/>
+          <w:bottom w:color="auto" w:space="0" w:sz="0" w:val="none"/>
+          <w:right w:color="auto" w:space="0" w:sz="0" w:val="none"/>
+          <w:between w:color="auto" w:space="0" w:sz="0" w:val="none"/>
+        </w:pBdr>
+        <w:shd w:fill="ffffff" w:val="clear"/>
+        <w:rPr>
+          <w:b w:val="1"/>
+          <w:bCs w:val="1"/>
+        </w:rPr>
+      </w:pPr>
+      <w:r>
+        <w:rPr>
+          <w:rtl w:val="0"/>
+        </w:rPr>
+      </w:r>
+    </w:p>
+    <w:p>
+      <w:pPr>
+        <w:pBdr>
+          <w:top w:color="auto" w:space="0" w:sz="0" w:val="none"/>
+          <w:left w:color="auto" w:space="0" w:sz="0" w:val="none"/>
+          <w:bottom w:color="auto" w:space="0" w:sz="0" w:val="none"/>
+          <w:right w:color="auto" w:space="0" w:sz="0" w:val="none"/>
+          <w:between w:color="auto" w:space="0" w:sz="0" w:val="none"/>
+        </w:pBdr>
+        <w:shd w:fill="ffffff" w:val="clear"/>
+        <w:rPr>
+          <w:b w:val="1"/>
+          <w:bCs w:val="1"/>
+        </w:rPr>
+      </w:pPr>
+      <w:r>
+        <w:rPr>
+          <w:rtl w:val="0"/>
+        </w:rPr>
+      </w:r>
+    </w:p>
+    <w:p>
+      <w:pPr>
+        <w:pBdr>
+          <w:top w:color="auto" w:space="0" w:sz="0" w:val="none"/>
+          <w:left w:color="auto" w:space="0" w:sz="0" w:val="none"/>
+          <w:bottom w:color="auto" w:space="0" w:sz="0" w:val="none"/>
+          <w:right w:color="auto" w:space="0" w:sz="0" w:val="none"/>
+          <w:between w:color="auto" w:space="0" w:sz="0" w:val="none"/>
+        </w:pBdr>
+        <w:shd w:fill="ffffff" w:val="clear"/>
+        <w:rPr>
+          <w:b w:val="1"/>
+          <w:bCs w:val="1"/>
+        </w:rPr>
+      </w:pPr>
+      <w:r>
+        <w:rPr>
+          <w:rtl w:val="0"/>
+        </w:rPr>
+      </w:r>
+    </w:p>
+    <w:p>
+      <w:pPr>
+        <w:pBdr>
+          <w:top w:color="auto" w:space="0" w:sz="0" w:val="none"/>
+          <w:left w:color="auto" w:space="0" w:sz="0" w:val="none"/>
+          <w:bottom w:color="auto" w:space="0" w:sz="0" w:val="none"/>
+          <w:right w:color="auto" w:space="0" w:sz="0" w:val="none"/>
+          <w:between w:color="auto" w:space="0" w:sz="0" w:val="none"/>
+        </w:pBdr>
+        <w:shd w:fill="ffffff" w:val="clear"/>
+        <w:rPr>
+          <w:b w:val="1"/>
+          <w:bCs w:val="1"/>
+        </w:rPr>
+      </w:pPr>
+      <w:r>
+        <w:rPr>
+          <w:rtl w:val="0"/>
+        </w:rPr>
+      </w:r>
+    </w:p>
     <w:p>
       <w:pPr>
         <w:pBdr>
@@ -4270,141 +4170,341 @@
           <w:p>
             <w:pPr>
               <w:widowControl w:val="0"/>
+              <w:numPr>
+                <w:ilvl w:val="0"/>
+                <w:numId w:val="3"/>
+              </w:numPr>
               <w:pBdr>
                 <w:top w:color="auto" w:space="0" w:sz="0" w:val="none"/>
                 <w:bottom w:color="auto" w:space="0" w:sz="0" w:val="none"/>
                 <w:right w:color="auto" w:space="0" w:sz="0" w:val="none"/>
                 <w:between w:color="auto" w:space="0" w:sz="0" w:val="none"/>
               </w:pBdr>
-              <w:spacing w:line="480" w:lineRule="auto"/>
+              <w:spacing w:line="240" w:lineRule="auto"/>
+              <w:ind w:left="720" w:hanging="360"/>
               <w:rPr>
                 <w:rFonts w:ascii="Roboto" w:cs="Roboto" w:eastAsia="Roboto" w:hAnsi="Roboto"/>
                 <w:color w:val="1d2125"/>
                 <w:sz w:val="24"/>
                 <w:szCs w:val="24"/>
-              </w:rPr>
-            </w:pPr>
-            <w:r>
+                <w:u w:val="none"/>
+              </w:rPr>
+            </w:pPr>
+            <w:r>
+              <w:rPr>
+                <w:rFonts w:ascii="Nova Mono" w:cs="Nova Mono" w:eastAsia="Nova Mono" w:hAnsi="Nova Mono"/>
+                <w:color w:val="1d2125"/>
+                <w:sz w:val="24"/>
+                <w:szCs w:val="24"/>
+                <w:rtl w:val="0"/>
+              </w:rPr>
+              <w:t xml:space="preserve">Home Page → Book a Trip → Destinations → Hidden Gems (11 seconds)</w:t>
+            </w:r>
+          </w:p>
+          <w:p>
+            <w:pPr>
+              <w:widowControl w:val="0"/>
+              <w:numPr>
+                <w:ilvl w:val="0"/>
+                <w:numId w:val="15"/>
+              </w:numPr>
+              <w:pBdr>
+                <w:top w:color="auto" w:space="0" w:sz="0" w:val="none"/>
+                <w:bottom w:color="auto" w:space="0" w:sz="0" w:val="none"/>
+                <w:right w:color="auto" w:space="0" w:sz="0" w:val="none"/>
+                <w:between w:color="auto" w:space="0" w:sz="0" w:val="none"/>
+              </w:pBdr>
+              <w:spacing w:line="240" w:lineRule="auto"/>
+              <w:ind w:left="1440" w:hanging="360"/>
               <w:rPr>
                 <w:rFonts w:ascii="Roboto" w:cs="Roboto" w:eastAsia="Roboto" w:hAnsi="Roboto"/>
                 <w:color w:val="1d2125"/>
                 <w:sz w:val="24"/>
                 <w:szCs w:val="24"/>
-                <w:rtl w:val="0"/>
-              </w:rPr>
-              <w:t xml:space="preserve">1)</w:t>
-            </w:r>
-          </w:p>
-          <w:p>
-            <w:pPr>
-              <w:widowControl w:val="0"/>
+                <w:u w:val="none"/>
+              </w:rPr>
+            </w:pPr>
+            <w:r>
+              <w:rPr>
+                <w:rFonts w:ascii="Roboto" w:cs="Roboto" w:eastAsia="Roboto" w:hAnsi="Roboto"/>
+                <w:color w:val="1d2125"/>
+                <w:sz w:val="24"/>
+                <w:szCs w:val="24"/>
+                <w:rtl w:val="0"/>
+              </w:rPr>
+              <w:t xml:space="preserve">Finding information about a country and its hidden gems.</w:t>
+            </w:r>
+          </w:p>
+          <w:p>
+            <w:pPr>
+              <w:widowControl w:val="0"/>
+              <w:numPr>
+                <w:ilvl w:val="0"/>
+                <w:numId w:val="3"/>
+              </w:numPr>
               <w:pBdr>
                 <w:top w:color="auto" w:space="0" w:sz="0" w:val="none"/>
                 <w:bottom w:color="auto" w:space="0" w:sz="0" w:val="none"/>
                 <w:right w:color="auto" w:space="0" w:sz="0" w:val="none"/>
                 <w:between w:color="auto" w:space="0" w:sz="0" w:val="none"/>
               </w:pBdr>
-              <w:spacing w:line="480" w:lineRule="auto"/>
+              <w:spacing w:line="240" w:lineRule="auto"/>
+              <w:ind w:left="720" w:hanging="360"/>
               <w:rPr>
                 <w:rFonts w:ascii="Roboto" w:cs="Roboto" w:eastAsia="Roboto" w:hAnsi="Roboto"/>
                 <w:color w:val="1d2125"/>
                 <w:sz w:val="24"/>
                 <w:szCs w:val="24"/>
-              </w:rPr>
-            </w:pPr>
-            <w:r>
+                <w:u w:val="none"/>
+              </w:rPr>
+            </w:pPr>
+            <w:r>
+              <w:rPr>
+                <w:rFonts w:ascii="Nova Mono" w:cs="Nova Mono" w:eastAsia="Nova Mono" w:hAnsi="Nova Mono"/>
+                <w:color w:val="1d2125"/>
+                <w:sz w:val="24"/>
+                <w:szCs w:val="24"/>
+                <w:rtl w:val="0"/>
+              </w:rPr>
+              <w:t xml:space="preserve">Home Page → Account → Trips (7 seconds)</w:t>
+            </w:r>
+          </w:p>
+          <w:p>
+            <w:pPr>
+              <w:widowControl w:val="0"/>
+              <w:numPr>
+                <w:ilvl w:val="0"/>
+                <w:numId w:val="4"/>
+              </w:numPr>
+              <w:pBdr>
+                <w:top w:color="auto" w:space="0" w:sz="0" w:val="none"/>
+                <w:bottom w:color="auto" w:space="0" w:sz="0" w:val="none"/>
+                <w:right w:color="auto" w:space="0" w:sz="0" w:val="none"/>
+                <w:between w:color="auto" w:space="0" w:sz="0" w:val="none"/>
+              </w:pBdr>
+              <w:spacing w:line="240" w:lineRule="auto"/>
+              <w:ind w:left="1440" w:hanging="360"/>
               <w:rPr>
                 <w:rFonts w:ascii="Roboto" w:cs="Roboto" w:eastAsia="Roboto" w:hAnsi="Roboto"/>
                 <w:color w:val="1d2125"/>
                 <w:sz w:val="24"/>
                 <w:szCs w:val="24"/>
-                <w:rtl w:val="0"/>
-              </w:rPr>
-              <w:t xml:space="preserve">2)</w:t>
-            </w:r>
-          </w:p>
-          <w:p>
-            <w:pPr>
-              <w:widowControl w:val="0"/>
+                <w:u w:val="none"/>
+              </w:rPr>
+            </w:pPr>
+            <w:r>
+              <w:rPr>
+                <w:rFonts w:ascii="Roboto" w:cs="Roboto" w:eastAsia="Roboto" w:hAnsi="Roboto"/>
+                <w:color w:val="1d2125"/>
+                <w:sz w:val="24"/>
+                <w:szCs w:val="24"/>
+                <w:rtl w:val="0"/>
+              </w:rPr>
+              <w:t xml:space="preserve">Accessing the trips page.</w:t>
+            </w:r>
+          </w:p>
+          <w:p>
+            <w:pPr>
+              <w:widowControl w:val="0"/>
+              <w:numPr>
+                <w:ilvl w:val="0"/>
+                <w:numId w:val="3"/>
+              </w:numPr>
               <w:pBdr>
                 <w:top w:color="auto" w:space="0" w:sz="0" w:val="none"/>
                 <w:bottom w:color="auto" w:space="0" w:sz="0" w:val="none"/>
                 <w:right w:color="auto" w:space="0" w:sz="0" w:val="none"/>
                 <w:between w:color="auto" w:space="0" w:sz="0" w:val="none"/>
               </w:pBdr>
-              <w:spacing w:line="480" w:lineRule="auto"/>
+              <w:spacing w:line="240" w:lineRule="auto"/>
+              <w:ind w:left="720" w:hanging="360"/>
               <w:rPr>
                 <w:rFonts w:ascii="Roboto" w:cs="Roboto" w:eastAsia="Roboto" w:hAnsi="Roboto"/>
                 <w:color w:val="1d2125"/>
                 <w:sz w:val="24"/>
                 <w:szCs w:val="24"/>
-              </w:rPr>
-            </w:pPr>
-            <w:r>
+                <w:u w:val="none"/>
+              </w:rPr>
+            </w:pPr>
+            <w:r>
+              <w:rPr>
+                <w:rFonts w:ascii="Nova Mono" w:cs="Nova Mono" w:eastAsia="Nova Mono" w:hAnsi="Nova Mono"/>
+                <w:color w:val="1d2125"/>
+                <w:sz w:val="24"/>
+                <w:szCs w:val="24"/>
+                <w:rtl w:val="0"/>
+              </w:rPr>
+              <w:t xml:space="preserve">Home Page → Book a Trip → Destinations → Destination Information → Flight Price Comparison (14 seconds)</w:t>
+            </w:r>
+          </w:p>
+          <w:p>
+            <w:pPr>
+              <w:widowControl w:val="0"/>
+              <w:numPr>
+                <w:ilvl w:val="0"/>
+                <w:numId w:val="6"/>
+              </w:numPr>
+              <w:pBdr>
+                <w:top w:color="auto" w:space="0" w:sz="0" w:val="none"/>
+                <w:bottom w:color="auto" w:space="0" w:sz="0" w:val="none"/>
+                <w:right w:color="auto" w:space="0" w:sz="0" w:val="none"/>
+                <w:between w:color="auto" w:space="0" w:sz="0" w:val="none"/>
+              </w:pBdr>
+              <w:spacing w:line="240" w:lineRule="auto"/>
+              <w:ind w:left="1440" w:hanging="360"/>
               <w:rPr>
                 <w:rFonts w:ascii="Roboto" w:cs="Roboto" w:eastAsia="Roboto" w:hAnsi="Roboto"/>
                 <w:color w:val="1d2125"/>
                 <w:sz w:val="24"/>
                 <w:szCs w:val="24"/>
-                <w:rtl w:val="0"/>
-              </w:rPr>
-              <w:t xml:space="preserve">3)</w:t>
-            </w:r>
-          </w:p>
-          <w:p>
-            <w:pPr>
-              <w:widowControl w:val="0"/>
+                <w:u w:val="none"/>
+              </w:rPr>
+            </w:pPr>
+            <w:r>
+              <w:rPr>
+                <w:rFonts w:ascii="Roboto" w:cs="Roboto" w:eastAsia="Roboto" w:hAnsi="Roboto"/>
+                <w:color w:val="1d2125"/>
+                <w:sz w:val="24"/>
+                <w:szCs w:val="24"/>
+                <w:rtl w:val="0"/>
+              </w:rPr>
+              <w:t xml:space="preserve">Comparing flight prices for a destination.</w:t>
+            </w:r>
+          </w:p>
+          <w:p>
+            <w:pPr>
+              <w:widowControl w:val="0"/>
+              <w:numPr>
+                <w:ilvl w:val="0"/>
+                <w:numId w:val="3"/>
+              </w:numPr>
               <w:pBdr>
                 <w:top w:color="auto" w:space="0" w:sz="0" w:val="none"/>
                 <w:bottom w:color="auto" w:space="0" w:sz="0" w:val="none"/>
                 <w:right w:color="auto" w:space="0" w:sz="0" w:val="none"/>
                 <w:between w:color="auto" w:space="0" w:sz="0" w:val="none"/>
               </w:pBdr>
-              <w:spacing w:line="480" w:lineRule="auto"/>
+              <w:spacing w:line="240" w:lineRule="auto"/>
+              <w:ind w:left="720" w:hanging="360"/>
               <w:rPr>
                 <w:rFonts w:ascii="Roboto" w:cs="Roboto" w:eastAsia="Roboto" w:hAnsi="Roboto"/>
                 <w:color w:val="1d2125"/>
                 <w:sz w:val="24"/>
                 <w:szCs w:val="24"/>
-              </w:rPr>
-            </w:pPr>
-            <w:r>
+                <w:u w:val="none"/>
+              </w:rPr>
+            </w:pPr>
+            <w:r>
+              <w:rPr>
+                <w:rFonts w:ascii="Nova Mono" w:cs="Nova Mono" w:eastAsia="Nova Mono" w:hAnsi="Nova Mono"/>
+                <w:color w:val="1d2125"/>
+                <w:sz w:val="24"/>
+                <w:szCs w:val="24"/>
+                <w:rtl w:val="0"/>
+              </w:rPr>
+              <w:t xml:space="preserve">Home Page → Account → Payments (6 seconds)</w:t>
+            </w:r>
+          </w:p>
+          <w:p>
+            <w:pPr>
+              <w:widowControl w:val="0"/>
+              <w:numPr>
+                <w:ilvl w:val="0"/>
+                <w:numId w:val="16"/>
+              </w:numPr>
+              <w:pBdr>
+                <w:top w:color="auto" w:space="0" w:sz="0" w:val="none"/>
+                <w:bottom w:color="auto" w:space="0" w:sz="0" w:val="none"/>
+                <w:right w:color="auto" w:space="0" w:sz="0" w:val="none"/>
+                <w:between w:color="auto" w:space="0" w:sz="0" w:val="none"/>
+              </w:pBdr>
+              <w:spacing w:line="240" w:lineRule="auto"/>
+              <w:ind w:left="1440" w:hanging="360"/>
               <w:rPr>
                 <w:rFonts w:ascii="Roboto" w:cs="Roboto" w:eastAsia="Roboto" w:hAnsi="Roboto"/>
                 <w:color w:val="1d2125"/>
                 <w:sz w:val="24"/>
                 <w:szCs w:val="24"/>
-                <w:rtl w:val="0"/>
-              </w:rPr>
-              <w:t xml:space="preserve">4)</w:t>
-            </w:r>
-          </w:p>
-          <w:p>
-            <w:pPr>
-              <w:widowControl w:val="0"/>
+                <w:u w:val="none"/>
+              </w:rPr>
+            </w:pPr>
+            <w:r>
+              <w:rPr>
+                <w:rFonts w:ascii="Roboto" w:cs="Roboto" w:eastAsia="Roboto" w:hAnsi="Roboto"/>
+                <w:color w:val="1d2125"/>
+                <w:sz w:val="24"/>
+                <w:szCs w:val="24"/>
+                <w:rtl w:val="0"/>
+              </w:rPr>
+              <w:t xml:space="preserve">Finding the payment page.</w:t>
+            </w:r>
+          </w:p>
+          <w:p>
+            <w:pPr>
+              <w:widowControl w:val="0"/>
+              <w:numPr>
+                <w:ilvl w:val="0"/>
+                <w:numId w:val="3"/>
+              </w:numPr>
               <w:pBdr>
                 <w:top w:color="auto" w:space="0" w:sz="0" w:val="none"/>
                 <w:bottom w:color="auto" w:space="0" w:sz="0" w:val="none"/>
                 <w:right w:color="auto" w:space="0" w:sz="0" w:val="none"/>
                 <w:between w:color="auto" w:space="0" w:sz="0" w:val="none"/>
               </w:pBdr>
-              <w:spacing w:line="480" w:lineRule="auto"/>
+              <w:spacing w:line="240" w:lineRule="auto"/>
+              <w:ind w:left="720" w:hanging="360"/>
               <w:rPr>
                 <w:rFonts w:ascii="Roboto" w:cs="Roboto" w:eastAsia="Roboto" w:hAnsi="Roboto"/>
                 <w:color w:val="1d2125"/>
                 <w:sz w:val="24"/>
                 <w:szCs w:val="24"/>
-              </w:rPr>
-            </w:pPr>
-            <w:r>
+                <w:u w:val="none"/>
+              </w:rPr>
+            </w:pPr>
+            <w:r>
+              <w:rPr>
+                <w:rFonts w:ascii="Nova Mono" w:cs="Nova Mono" w:eastAsia="Nova Mono" w:hAnsi="Nova Mono"/>
+                <w:color w:val="1d2125"/>
+                <w:sz w:val="24"/>
+                <w:szCs w:val="24"/>
+                <w:rtl w:val="0"/>
+              </w:rPr>
+              <w:t xml:space="preserve">Home Page → Travel Checklist</w:t>
+            </w:r>
+          </w:p>
+          <w:p>
+            <w:pPr>
+              <w:widowControl w:val="0"/>
+              <w:numPr>
+                <w:ilvl w:val="0"/>
+                <w:numId w:val="12"/>
+              </w:numPr>
+              <w:pBdr>
+                <w:top w:color="auto" w:space="0" w:sz="0" w:val="none"/>
+                <w:bottom w:color="auto" w:space="0" w:sz="0" w:val="none"/>
+                <w:right w:color="auto" w:space="0" w:sz="0" w:val="none"/>
+                <w:between w:color="auto" w:space="0" w:sz="0" w:val="none"/>
+              </w:pBdr>
+              <w:spacing w:line="240" w:lineRule="auto"/>
+              <w:ind w:left="1440" w:hanging="360"/>
               <w:rPr>
                 <w:rFonts w:ascii="Roboto" w:cs="Roboto" w:eastAsia="Roboto" w:hAnsi="Roboto"/>
                 <w:color w:val="1d2125"/>
                 <w:sz w:val="24"/>
                 <w:szCs w:val="24"/>
-                <w:rtl w:val="0"/>
-              </w:rPr>
-              <w:t xml:space="preserve">5)</w:t>
+                <w:u w:val="none"/>
+              </w:rPr>
+            </w:pPr>
+            <w:r>
+              <w:rPr>
+                <w:rFonts w:ascii="Roboto" w:cs="Roboto" w:eastAsia="Roboto" w:hAnsi="Roboto"/>
+                <w:color w:val="1d2125"/>
+                <w:sz w:val="24"/>
+                <w:szCs w:val="24"/>
+                <w:rtl w:val="0"/>
+              </w:rPr>
+              <w:t xml:space="preserve">Accessing the travel checklist.</w:t>
             </w:r>
           </w:p>
         </w:tc>
@@ -4735,8 +4835,11 @@
             </w:pPr>
             <w:r>
               <w:rPr>
-                <w:rtl w:val="0"/>
-              </w:rPr>
+                <w:b w:val="1"/>
+                <w:bCs w:val="1"/>
+                <w:rtl w:val="0"/>
+              </w:rPr>
+              <w:t xml:space="preserve">Yes, I feel like all the pages are in a pretty good spot. Although I think the destination page should just take the highlights of each location so there is a good amount of information about it</w:t>
             </w:r>
           </w:p>
         </w:tc>
@@ -4833,8 +4936,11 @@
             </w:pPr>
             <w:r>
               <w:rPr>
-                <w:rtl w:val="0"/>
-              </w:rPr>
+                <w:b w:val="1"/>
+                <w:bCs w:val="1"/>
+                <w:rtl w:val="0"/>
+              </w:rPr>
+              <w:t xml:space="preserve">Not really, I feel that each time is accurate to how complex the task is. </w:t>
             </w:r>
           </w:p>
         </w:tc>
@@ -4932,8 +5038,11 @@
             </w:pPr>
             <w:r>
               <w:rPr>
-                <w:rtl w:val="0"/>
-              </w:rPr>
+                <w:b w:val="1"/>
+                <w:bCs w:val="1"/>
+                <w:rtl w:val="0"/>
+              </w:rPr>
+              <w:t xml:space="preserve">I feel that they were. Each one was labeled as what it did.</w:t>
             </w:r>
           </w:p>
         </w:tc>
@@ -5030,8 +5139,11 @@
             </w:pPr>
             <w:r>
               <w:rPr>
-                <w:rtl w:val="0"/>
-              </w:rPr>
+                <w:b w:val="1"/>
+                <w:bCs w:val="1"/>
+                <w:rtl w:val="0"/>
+              </w:rPr>
+              <w:t xml:space="preserve">Overall, I feel that the site is relatively easy to traverse. Maybe have the destinations page easier to access, rather than going through “Book a Trip”</w:t>
             </w:r>
           </w:p>
         </w:tc>
@@ -5583,12 +5695,12 @@
         <w:tblLook w:val="0600"/>
       </w:tblPr>
       <w:tblGrid>
-        <w:gridCol w:w="4680"/>
-        <w:gridCol w:w="4680"/>
+        <w:gridCol w:w="2295"/>
+        <w:gridCol w:w="7065"/>
         <w:tblGridChange w:id="0">
           <w:tblGrid>
-            <w:gridCol w:w="4680"/>
-            <w:gridCol w:w="4680"/>
+            <w:gridCol w:w="2295"/>
+            <w:gridCol w:w="7065"/>
           </w:tblGrid>
         </w:tblGridChange>
       </w:tblGrid>
@@ -5724,7 +5836,7 @@
               <w:rPr>
                 <w:rtl w:val="0"/>
               </w:rPr>
-              <w:t xml:space="preserve">“”</w:t>
+              <w:t xml:space="preserve">I was able to ask one of my classmates studying in the same room as me to be the user for this, and I feel as if they were able to find most of the pages where they expected them to be. The “Trips” and “Payments” pages made sense under the Account section. However, the user expected some travel planning resources such as the Travel Checklist, Travel Budget Planner, and Visa Information to be grouped together under the “Book a Trip” section rather than appearing separately. They felt that these tools were all part of the trip planning process.</w:t>
             </w:r>
           </w:p>
         </w:tc>
@@ -5788,15 +5900,13 @@
             <w:pPr>
               <w:widowControl w:val="0"/>
               <w:spacing w:line="240" w:lineRule="auto"/>
-              <w:rPr>
-                <w:b w:val="1"/>
-                <w:bCs w:val="1"/>
-              </w:rPr>
-            </w:pPr>
-            <w:r>
-              <w:rPr>
-                <w:rtl w:val="0"/>
-              </w:rPr>
+              <w:rPr/>
+            </w:pPr>
+            <w:r>
+              <w:rPr>
+                <w:rtl w:val="0"/>
+              </w:rPr>
+              <w:t xml:space="preserve">Most tasks were completed fairly quickly, but finding the flight price comparison took slightly longer because the user had to navigate through the Destinations page and then the Destination Information page first. The user also mentioned that if additional planning resources such as Transportation Guides or Travel Safety Tips were included, they would expect them to be located in the same planning section to reduce navigation time.</w:t>
             </w:r>
           </w:p>
         </w:tc>
@@ -5861,15 +5971,13 @@
             <w:pPr>
               <w:widowControl w:val="0"/>
               <w:spacing w:line="240" w:lineRule="auto"/>
-              <w:rPr>
-                <w:b w:val="1"/>
-                <w:bCs w:val="1"/>
-              </w:rPr>
-            </w:pPr>
-            <w:r>
-              <w:rPr>
-                <w:rtl w:val="0"/>
-              </w:rPr>
+              <w:rPr/>
+            </w:pPr>
+            <w:r>
+              <w:rPr>
+                <w:rtl w:val="0"/>
+              </w:rPr>
+              <w:t xml:space="preserve">The user felt that most labels were clear, but suggested that “Book a Trip” could be renamed to something like “Plan Your Trip” because it would better represent resources such as travel budgeting, transportation guides, and travel checklists. The user also suggested that cultural resources like Local Culture Guides, Restaurant Recommendations, and Travel Reviews should be clearly grouped under destination information so users can easily explore what to do at each location.</w:t>
             </w:r>
           </w:p>
         </w:tc>
@@ -5933,20 +6041,62 @@
             <w:pPr>
               <w:widowControl w:val="0"/>
               <w:spacing w:line="240" w:lineRule="auto"/>
-              <w:rPr>
-                <w:b w:val="1"/>
-                <w:bCs w:val="1"/>
-              </w:rPr>
-            </w:pPr>
-            <w:r>
-              <w:rPr>
-                <w:rtl w:val="0"/>
-              </w:rPr>
+              <w:rPr/>
+            </w:pPr>
+            <w:r>
+              <w:rPr>
+                <w:rtl w:val="0"/>
+              </w:rPr>
+              <w:t xml:space="preserve">The user suggested grouping related tools and information together. For example, travel planning resources such as Travel Budget Planner, Visa Information, and Travel Safety Tips could be grouped under a “Travel Planning” section. They also suggested adding a section within user accounts where features like Saved Destinations and Trip History are stored so users can easily revisit places they are interested in. Additionally, having a visible Customer Support page would help users quickly find assistance if they encounter issues while planning their trip.</w:t>
             </w:r>
           </w:p>
         </w:tc>
       </w:tr>
     </w:tbl>
+    <w:p>
+      <w:pPr>
+        <w:pBdr>
+          <w:top w:color="auto" w:space="0" w:sz="0" w:val="none"/>
+          <w:left w:color="auto" w:space="0" w:sz="0" w:val="none"/>
+          <w:bottom w:color="auto" w:space="0" w:sz="0" w:val="none"/>
+          <w:right w:color="auto" w:space="0" w:sz="0" w:val="none"/>
+          <w:between w:color="auto" w:space="0" w:sz="0" w:val="none"/>
+        </w:pBdr>
+        <w:shd w:fill="ffffff" w:val="clear"/>
+        <w:jc w:val="left"/>
+        <w:rPr>
+          <w:b w:val="1"/>
+          <w:bCs w:val="1"/>
+        </w:rPr>
+      </w:pPr>
+      <w:r>
+        <w:rPr>
+          <w:rtl w:val="0"/>
+        </w:rPr>
+      </w:r>
+    </w:p>
+    <w:p>
+      <w:pPr>
+        <w:pBdr>
+          <w:top w:color="auto" w:space="0" w:sz="0" w:val="none"/>
+          <w:left w:color="auto" w:space="0" w:sz="0" w:val="none"/>
+          <w:bottom w:color="auto" w:space="0" w:sz="0" w:val="none"/>
+          <w:right w:color="auto" w:space="0" w:sz="0" w:val="none"/>
+          <w:between w:color="auto" w:space="0" w:sz="0" w:val="none"/>
+        </w:pBdr>
+        <w:shd w:fill="ffffff" w:val="clear"/>
+        <w:jc w:val="left"/>
+        <w:rPr>
+          <w:b w:val="1"/>
+          <w:bCs w:val="1"/>
+        </w:rPr>
+      </w:pPr>
+      <w:r>
+        <w:rPr>
+          <w:rtl w:val="0"/>
+        </w:rPr>
+      </w:r>
+    </w:p>
     <w:p>
       <w:pPr>
         <w:pBdr>
@@ -6102,13 +6252,60 @@
             </w:pPr>
             <w:r>
               <w:rPr>
-                <w:rtl w:val="0"/>
-              </w:rPr>
+                <w:b w:val="1"/>
+                <w:bCs w:val="1"/>
+                <w:rtl w:val="0"/>
+              </w:rPr>
+              <w:t xml:space="preserve">Overall, the sitemap flows really well, and users were able to find most pages easily during the tree testing. Pages such as Trips, Payments, and Travel Checklist were located quickly, which shows that the general navigation structure is good and thoughtful of its users. One suggestion from the testing was to combine most destination-related information into a single destination page. It could include a variety of items, such as destination information, hidden gems, activities, restaurant recommendations, and travel reviews. Another improvement could be grouping travel planning resources together, such as a travel budget planner, visa info, travel safety tips, and transportation guides, so users can easily find tools that help them prepare for their trips. Overall, the sitemap works well but organizing related resources together could help make navigation even clearer! </w:t>
             </w:r>
           </w:p>
         </w:tc>
       </w:tr>
     </w:tbl>
+    <w:p>
+      <w:pPr>
+        <w:pBdr>
+          <w:top w:color="auto" w:space="0" w:sz="0" w:val="none"/>
+          <w:left w:color="auto" w:space="0" w:sz="0" w:val="none"/>
+          <w:bottom w:color="auto" w:space="0" w:sz="0" w:val="none"/>
+          <w:right w:color="auto" w:space="0" w:sz="0" w:val="none"/>
+          <w:between w:color="auto" w:space="0" w:sz="0" w:val="none"/>
+        </w:pBdr>
+        <w:shd w:fill="ffffff" w:val="clear"/>
+        <w:jc w:val="left"/>
+        <w:rPr>
+          <w:b w:val="1"/>
+          <w:bCs w:val="1"/>
+        </w:rPr>
+      </w:pPr>
+      <w:r>
+        <w:rPr>
+          <w:rtl w:val="0"/>
+        </w:rPr>
+      </w:r>
+    </w:p>
+    <w:p>
+      <w:pPr>
+        <w:pBdr>
+          <w:top w:color="auto" w:space="0" w:sz="0" w:val="none"/>
+          <w:left w:color="auto" w:space="0" w:sz="0" w:val="none"/>
+          <w:bottom w:color="auto" w:space="0" w:sz="0" w:val="none"/>
+          <w:right w:color="auto" w:space="0" w:sz="0" w:val="none"/>
+          <w:between w:color="auto" w:space="0" w:sz="0" w:val="none"/>
+        </w:pBdr>
+        <w:shd w:fill="ffffff" w:val="clear"/>
+        <w:jc w:val="left"/>
+        <w:rPr>
+          <w:b w:val="1"/>
+          <w:bCs w:val="1"/>
+        </w:rPr>
+      </w:pPr>
+      <w:r>
+        <w:rPr>
+          <w:rtl w:val="0"/>
+        </w:rPr>
+      </w:r>
+    </w:p>
     <w:p>
       <w:pPr>
         <w:pBdr>
@@ -6224,6 +6421,10 @@
               <w:keepLines w:val="0"/>
               <w:pageBreakBefore w:val="0"/>
               <w:widowControl w:val="0"/>
+              <w:numPr>
+                <w:ilvl w:val="0"/>
+                <w:numId w:val="11"/>
+              </w:numPr>
               <w:pBdr>
                 <w:top w:space="0" w:sz="0" w:val="nil"/>
                 <w:left w:space="0" w:sz="0" w:val="nil"/>
@@ -6233,17 +6434,453 @@
               </w:pBdr>
               <w:shd w:fill="auto" w:val="clear"/>
               <w:spacing w:after="0" w:before="0" w:line="240" w:lineRule="auto"/>
-              <w:ind w:left="0" w:right="0" w:firstLine="0"/>
+              <w:ind w:left="720" w:right="0" w:hanging="360"/>
               <w:jc w:val="left"/>
               <w:rPr>
                 <w:b w:val="1"/>
                 <w:bCs w:val="1"/>
-              </w:rPr>
-            </w:pPr>
-            <w:r>
-              <w:rPr>
-                <w:rtl w:val="0"/>
-              </w:rPr>
+                <w:u w:val="none"/>
+              </w:rPr>
+            </w:pPr>
+            <w:r>
+              <w:rPr>
+                <w:b w:val="1"/>
+                <w:bCs w:val="1"/>
+                <w:rtl w:val="0"/>
+              </w:rPr>
+              <w:t xml:space="preserve">Homepage</w:t>
+            </w:r>
+          </w:p>
+          <w:p>
+            <w:pPr>
+              <w:keepNext w:val="0"/>
+              <w:keepLines w:val="0"/>
+              <w:pageBreakBefore w:val="0"/>
+              <w:widowControl w:val="0"/>
+              <w:numPr>
+                <w:ilvl w:val="0"/>
+                <w:numId w:val="11"/>
+              </w:numPr>
+              <w:pBdr>
+                <w:top w:space="0" w:sz="0" w:val="nil"/>
+                <w:left w:space="0" w:sz="0" w:val="nil"/>
+                <w:bottom w:space="0" w:sz="0" w:val="nil"/>
+                <w:right w:space="0" w:sz="0" w:val="nil"/>
+                <w:between w:space="0" w:sz="0" w:val="nil"/>
+              </w:pBdr>
+              <w:shd w:fill="auto" w:val="clear"/>
+              <w:spacing w:after="0" w:before="0" w:line="240" w:lineRule="auto"/>
+              <w:ind w:left="720" w:right="0" w:hanging="360"/>
+              <w:jc w:val="left"/>
+              <w:rPr>
+                <w:b w:val="1"/>
+                <w:bCs w:val="1"/>
+                <w:u w:val="none"/>
+              </w:rPr>
+            </w:pPr>
+            <w:r>
+              <w:rPr>
+                <w:b w:val="1"/>
+                <w:bCs w:val="1"/>
+                <w:rtl w:val="0"/>
+              </w:rPr>
+              <w:t xml:space="preserve">Plan a Trip</w:t>
+            </w:r>
+          </w:p>
+          <w:p>
+            <w:pPr>
+              <w:keepNext w:val="0"/>
+              <w:keepLines w:val="0"/>
+              <w:pageBreakBefore w:val="0"/>
+              <w:widowControl w:val="0"/>
+              <w:numPr>
+                <w:ilvl w:val="0"/>
+                <w:numId w:val="11"/>
+              </w:numPr>
+              <w:pBdr>
+                <w:top w:space="0" w:sz="0" w:val="nil"/>
+                <w:left w:space="0" w:sz="0" w:val="nil"/>
+                <w:bottom w:space="0" w:sz="0" w:val="nil"/>
+                <w:right w:space="0" w:sz="0" w:val="nil"/>
+                <w:between w:space="0" w:sz="0" w:val="nil"/>
+              </w:pBdr>
+              <w:shd w:fill="auto" w:val="clear"/>
+              <w:spacing w:after="0" w:before="0" w:line="240" w:lineRule="auto"/>
+              <w:ind w:left="720" w:right="0" w:hanging="360"/>
+              <w:jc w:val="left"/>
+              <w:rPr>
+                <w:b w:val="1"/>
+                <w:bCs w:val="1"/>
+                <w:u w:val="none"/>
+              </w:rPr>
+            </w:pPr>
+            <w:r>
+              <w:rPr>
+                <w:b w:val="1"/>
+                <w:bCs w:val="1"/>
+                <w:rtl w:val="0"/>
+              </w:rPr>
+              <w:t xml:space="preserve">Travel Checklist</w:t>
+            </w:r>
+          </w:p>
+          <w:p>
+            <w:pPr>
+              <w:keepNext w:val="0"/>
+              <w:keepLines w:val="0"/>
+              <w:pageBreakBefore w:val="0"/>
+              <w:widowControl w:val="0"/>
+              <w:numPr>
+                <w:ilvl w:val="0"/>
+                <w:numId w:val="11"/>
+              </w:numPr>
+              <w:pBdr>
+                <w:top w:space="0" w:sz="0" w:val="nil"/>
+                <w:left w:space="0" w:sz="0" w:val="nil"/>
+                <w:bottom w:space="0" w:sz="0" w:val="nil"/>
+                <w:right w:space="0" w:sz="0" w:val="nil"/>
+                <w:between w:space="0" w:sz="0" w:val="nil"/>
+              </w:pBdr>
+              <w:shd w:fill="auto" w:val="clear"/>
+              <w:spacing w:after="0" w:before="0" w:line="240" w:lineRule="auto"/>
+              <w:ind w:left="720" w:right="0" w:hanging="360"/>
+              <w:jc w:val="left"/>
+              <w:rPr>
+                <w:b w:val="1"/>
+                <w:bCs w:val="1"/>
+                <w:u w:val="none"/>
+              </w:rPr>
+            </w:pPr>
+            <w:r>
+              <w:rPr>
+                <w:b w:val="1"/>
+                <w:bCs w:val="1"/>
+                <w:rtl w:val="0"/>
+              </w:rPr>
+              <w:t xml:space="preserve">Account Information</w:t>
+            </w:r>
+          </w:p>
+          <w:p>
+            <w:pPr>
+              <w:keepNext w:val="0"/>
+              <w:keepLines w:val="0"/>
+              <w:pageBreakBefore w:val="0"/>
+              <w:widowControl w:val="0"/>
+              <w:numPr>
+                <w:ilvl w:val="0"/>
+                <w:numId w:val="11"/>
+              </w:numPr>
+              <w:pBdr>
+                <w:top w:space="0" w:sz="0" w:val="nil"/>
+                <w:left w:space="0" w:sz="0" w:val="nil"/>
+                <w:bottom w:space="0" w:sz="0" w:val="nil"/>
+                <w:right w:space="0" w:sz="0" w:val="nil"/>
+                <w:between w:space="0" w:sz="0" w:val="nil"/>
+              </w:pBdr>
+              <w:shd w:fill="auto" w:val="clear"/>
+              <w:spacing w:after="0" w:before="0" w:line="240" w:lineRule="auto"/>
+              <w:ind w:left="720" w:right="0" w:hanging="360"/>
+              <w:jc w:val="left"/>
+              <w:rPr>
+                <w:b w:val="1"/>
+                <w:bCs w:val="1"/>
+                <w:u w:val="none"/>
+              </w:rPr>
+            </w:pPr>
+            <w:r>
+              <w:rPr>
+                <w:b w:val="1"/>
+                <w:bCs w:val="1"/>
+                <w:rtl w:val="0"/>
+              </w:rPr>
+              <w:t xml:space="preserve">Trips</w:t>
+            </w:r>
+          </w:p>
+          <w:p>
+            <w:pPr>
+              <w:keepNext w:val="0"/>
+              <w:keepLines w:val="0"/>
+              <w:pageBreakBefore w:val="0"/>
+              <w:widowControl w:val="0"/>
+              <w:numPr>
+                <w:ilvl w:val="0"/>
+                <w:numId w:val="11"/>
+              </w:numPr>
+              <w:pBdr>
+                <w:top w:space="0" w:sz="0" w:val="nil"/>
+                <w:left w:space="0" w:sz="0" w:val="nil"/>
+                <w:bottom w:space="0" w:sz="0" w:val="nil"/>
+                <w:right w:space="0" w:sz="0" w:val="nil"/>
+                <w:between w:space="0" w:sz="0" w:val="nil"/>
+              </w:pBdr>
+              <w:shd w:fill="auto" w:val="clear"/>
+              <w:spacing w:after="0" w:before="0" w:line="240" w:lineRule="auto"/>
+              <w:ind w:left="720" w:right="0" w:hanging="360"/>
+              <w:jc w:val="left"/>
+              <w:rPr>
+                <w:b w:val="1"/>
+                <w:bCs w:val="1"/>
+                <w:u w:val="none"/>
+              </w:rPr>
+            </w:pPr>
+            <w:r>
+              <w:rPr>
+                <w:b w:val="1"/>
+                <w:bCs w:val="1"/>
+                <w:rtl w:val="0"/>
+              </w:rPr>
+              <w:t xml:space="preserve">Payments</w:t>
+            </w:r>
+          </w:p>
+          <w:p>
+            <w:pPr>
+              <w:keepNext w:val="0"/>
+              <w:keepLines w:val="0"/>
+              <w:pageBreakBefore w:val="0"/>
+              <w:widowControl w:val="0"/>
+              <w:numPr>
+                <w:ilvl w:val="0"/>
+                <w:numId w:val="11"/>
+              </w:numPr>
+              <w:pBdr>
+                <w:top w:space="0" w:sz="0" w:val="nil"/>
+                <w:left w:space="0" w:sz="0" w:val="nil"/>
+                <w:bottom w:space="0" w:sz="0" w:val="nil"/>
+                <w:right w:space="0" w:sz="0" w:val="nil"/>
+                <w:between w:space="0" w:sz="0" w:val="nil"/>
+              </w:pBdr>
+              <w:shd w:fill="auto" w:val="clear"/>
+              <w:spacing w:after="0" w:before="0" w:line="240" w:lineRule="auto"/>
+              <w:ind w:left="720" w:right="0" w:hanging="360"/>
+              <w:jc w:val="left"/>
+              <w:rPr>
+                <w:b w:val="1"/>
+                <w:bCs w:val="1"/>
+                <w:u w:val="none"/>
+              </w:rPr>
+            </w:pPr>
+            <w:r>
+              <w:rPr>
+                <w:b w:val="1"/>
+                <w:bCs w:val="1"/>
+                <w:rtl w:val="0"/>
+              </w:rPr>
+              <w:t xml:space="preserve">Map</w:t>
+            </w:r>
+          </w:p>
+          <w:p>
+            <w:pPr>
+              <w:keepNext w:val="0"/>
+              <w:keepLines w:val="0"/>
+              <w:pageBreakBefore w:val="0"/>
+              <w:widowControl w:val="0"/>
+              <w:numPr>
+                <w:ilvl w:val="0"/>
+                <w:numId w:val="11"/>
+              </w:numPr>
+              <w:pBdr>
+                <w:top w:space="0" w:sz="0" w:val="nil"/>
+                <w:left w:space="0" w:sz="0" w:val="nil"/>
+                <w:bottom w:space="0" w:sz="0" w:val="nil"/>
+                <w:right w:space="0" w:sz="0" w:val="nil"/>
+                <w:between w:space="0" w:sz="0" w:val="nil"/>
+              </w:pBdr>
+              <w:shd w:fill="auto" w:val="clear"/>
+              <w:spacing w:after="0" w:before="0" w:line="240" w:lineRule="auto"/>
+              <w:ind w:left="720" w:right="0" w:hanging="360"/>
+              <w:jc w:val="left"/>
+              <w:rPr>
+                <w:b w:val="1"/>
+                <w:bCs w:val="1"/>
+                <w:u w:val="none"/>
+              </w:rPr>
+            </w:pPr>
+            <w:r>
+              <w:rPr>
+                <w:b w:val="1"/>
+                <w:bCs w:val="1"/>
+                <w:rtl w:val="0"/>
+              </w:rPr>
+              <w:t xml:space="preserve">Destination Page</w:t>
+            </w:r>
+          </w:p>
+          <w:p>
+            <w:pPr>
+              <w:keepNext w:val="0"/>
+              <w:keepLines w:val="0"/>
+              <w:pageBreakBefore w:val="0"/>
+              <w:widowControl w:val="0"/>
+              <w:numPr>
+                <w:ilvl w:val="0"/>
+                <w:numId w:val="11"/>
+              </w:numPr>
+              <w:pBdr>
+                <w:top w:space="0" w:sz="0" w:val="nil"/>
+                <w:left w:space="0" w:sz="0" w:val="nil"/>
+                <w:bottom w:space="0" w:sz="0" w:val="nil"/>
+                <w:right w:space="0" w:sz="0" w:val="nil"/>
+                <w:between w:space="0" w:sz="0" w:val="nil"/>
+              </w:pBdr>
+              <w:shd w:fill="auto" w:val="clear"/>
+              <w:spacing w:after="0" w:before="0" w:line="240" w:lineRule="auto"/>
+              <w:ind w:left="720" w:right="0" w:hanging="360"/>
+              <w:jc w:val="left"/>
+              <w:rPr>
+                <w:b w:val="1"/>
+                <w:bCs w:val="1"/>
+                <w:u w:val="none"/>
+              </w:rPr>
+            </w:pPr>
+            <w:r>
+              <w:rPr>
+                <w:b w:val="1"/>
+                <w:bCs w:val="1"/>
+                <w:rtl w:val="0"/>
+              </w:rPr>
+              <w:t xml:space="preserve">Hidden Gems</w:t>
+            </w:r>
+          </w:p>
+          <w:p>
+            <w:pPr>
+              <w:keepNext w:val="0"/>
+              <w:keepLines w:val="0"/>
+              <w:pageBreakBefore w:val="0"/>
+              <w:widowControl w:val="0"/>
+              <w:numPr>
+                <w:ilvl w:val="0"/>
+                <w:numId w:val="11"/>
+              </w:numPr>
+              <w:pBdr>
+                <w:top w:space="0" w:sz="0" w:val="nil"/>
+                <w:left w:space="0" w:sz="0" w:val="nil"/>
+                <w:bottom w:space="0" w:sz="0" w:val="nil"/>
+                <w:right w:space="0" w:sz="0" w:val="nil"/>
+                <w:between w:space="0" w:sz="0" w:val="nil"/>
+              </w:pBdr>
+              <w:shd w:fill="auto" w:val="clear"/>
+              <w:spacing w:after="0" w:before="0" w:line="240" w:lineRule="auto"/>
+              <w:ind w:left="720" w:right="0" w:hanging="360"/>
+              <w:jc w:val="left"/>
+              <w:rPr>
+                <w:b w:val="1"/>
+                <w:bCs w:val="1"/>
+                <w:u w:val="none"/>
+              </w:rPr>
+            </w:pPr>
+            <w:r>
+              <w:rPr>
+                <w:b w:val="1"/>
+                <w:bCs w:val="1"/>
+                <w:rtl w:val="0"/>
+              </w:rPr>
+              <w:t xml:space="preserve">Destination Information</w:t>
+            </w:r>
+          </w:p>
+          <w:p>
+            <w:pPr>
+              <w:keepNext w:val="0"/>
+              <w:keepLines w:val="0"/>
+              <w:pageBreakBefore w:val="0"/>
+              <w:widowControl w:val="0"/>
+              <w:numPr>
+                <w:ilvl w:val="0"/>
+                <w:numId w:val="11"/>
+              </w:numPr>
+              <w:pBdr>
+                <w:top w:space="0" w:sz="0" w:val="nil"/>
+                <w:left w:space="0" w:sz="0" w:val="nil"/>
+                <w:bottom w:space="0" w:sz="0" w:val="nil"/>
+                <w:right w:space="0" w:sz="0" w:val="nil"/>
+                <w:between w:space="0" w:sz="0" w:val="nil"/>
+              </w:pBdr>
+              <w:shd w:fill="auto" w:val="clear"/>
+              <w:spacing w:after="0" w:before="0" w:line="240" w:lineRule="auto"/>
+              <w:ind w:left="720" w:right="0" w:hanging="360"/>
+              <w:jc w:val="left"/>
+              <w:rPr>
+                <w:b w:val="1"/>
+                <w:bCs w:val="1"/>
+                <w:u w:val="none"/>
+              </w:rPr>
+            </w:pPr>
+            <w:r>
+              <w:rPr>
+                <w:b w:val="1"/>
+                <w:bCs w:val="1"/>
+                <w:rtl w:val="0"/>
+              </w:rPr>
+              <w:t xml:space="preserve">Activities list</w:t>
+            </w:r>
+          </w:p>
+          <w:p>
+            <w:pPr>
+              <w:keepNext w:val="0"/>
+              <w:keepLines w:val="0"/>
+              <w:pageBreakBefore w:val="0"/>
+              <w:widowControl w:val="0"/>
+              <w:numPr>
+                <w:ilvl w:val="0"/>
+                <w:numId w:val="11"/>
+              </w:numPr>
+              <w:pBdr>
+                <w:top w:space="0" w:sz="0" w:val="nil"/>
+                <w:left w:space="0" w:sz="0" w:val="nil"/>
+                <w:bottom w:space="0" w:sz="0" w:val="nil"/>
+                <w:right w:space="0" w:sz="0" w:val="nil"/>
+                <w:between w:space="0" w:sz="0" w:val="nil"/>
+              </w:pBdr>
+              <w:shd w:fill="auto" w:val="clear"/>
+              <w:spacing w:after="0" w:before="0" w:line="240" w:lineRule="auto"/>
+              <w:ind w:left="720" w:right="0" w:hanging="360"/>
+              <w:jc w:val="left"/>
+              <w:rPr>
+                <w:b w:val="1"/>
+                <w:bCs w:val="1"/>
+                <w:u w:val="none"/>
+              </w:rPr>
+            </w:pPr>
+            <w:r>
+              <w:rPr>
+                <w:b w:val="1"/>
+                <w:bCs w:val="1"/>
+                <w:rtl w:val="0"/>
+              </w:rPr>
+              <w:t xml:space="preserve">Hotel Price Comparison</w:t>
+            </w:r>
+          </w:p>
+          <w:p>
+            <w:pPr>
+              <w:keepNext w:val="0"/>
+              <w:keepLines w:val="0"/>
+              <w:pageBreakBefore w:val="0"/>
+              <w:widowControl w:val="0"/>
+              <w:numPr>
+                <w:ilvl w:val="0"/>
+                <w:numId w:val="11"/>
+              </w:numPr>
+              <w:pBdr>
+                <w:top w:space="0" w:sz="0" w:val="nil"/>
+                <w:left w:space="0" w:sz="0" w:val="nil"/>
+                <w:bottom w:space="0" w:sz="0" w:val="nil"/>
+                <w:right w:space="0" w:sz="0" w:val="nil"/>
+                <w:between w:space="0" w:sz="0" w:val="nil"/>
+              </w:pBdr>
+              <w:shd w:fill="auto" w:val="clear"/>
+              <w:spacing w:after="0" w:before="0" w:line="240" w:lineRule="auto"/>
+              <w:ind w:left="720" w:right="0" w:hanging="360"/>
+              <w:jc w:val="left"/>
+              <w:rPr>
+                <w:b w:val="1"/>
+                <w:bCs w:val="1"/>
+                <w:u w:val="none"/>
+              </w:rPr>
+            </w:pPr>
+            <w:r>
+              <w:rPr>
+                <w:b w:val="1"/>
+                <w:bCs w:val="1"/>
+                <w:rtl w:val="0"/>
+              </w:rPr>
+              <w:t xml:space="preserve">Flight Price Comparison</w:t>
             </w:r>
           </w:p>
         </w:tc>
@@ -6570,8 +7207,20 @@
   <w:abstractNum w:abstractNumId="3">
     <w:lvl w:ilvl="0">
       <w:start w:val="1"/>
-      <w:numFmt w:val="bullet"/>
-      <w:lvlText w:val="-"/>
+      <w:numFmt w:val="decimal"/>
+      <w:lvlText w:val="%1)"/>
+      <w:lvlJc w:val="left"/>
+      <w:pPr>
+        <w:ind w:left="720" w:hanging="360"/>
+      </w:pPr>
+      <w:rPr>
+        <w:u w:val="none"/>
+      </w:rPr>
+    </w:lvl>
+    <w:lvl w:ilvl="1">
+      <w:start w:val="1"/>
+      <w:numFmt w:val="lowerLetter"/>
+      <w:lvlText w:val="%2)"/>
       <w:lvlJc w:val="left"/>
       <w:pPr>
         <w:ind w:left="1440" w:hanging="360"/>
@@ -6580,11 +7229,11 @@
         <w:u w:val="none"/>
       </w:rPr>
     </w:lvl>
-    <w:lvl w:ilvl="1">
-      <w:start w:val="1"/>
-      <w:numFmt w:val="bullet"/>
-      <w:lvlText w:val="-"/>
-      <w:lvlJc w:val="left"/>
+    <w:lvl w:ilvl="2">
+      <w:start w:val="1"/>
+      <w:numFmt w:val="lowerRoman"/>
+      <w:lvlText w:val="%3)"/>
+      <w:lvlJc w:val="right"/>
       <w:pPr>
         <w:ind w:left="2160" w:hanging="360"/>
       </w:pPr>
@@ -6592,10 +7241,10 @@
         <w:u w:val="none"/>
       </w:rPr>
     </w:lvl>
-    <w:lvl w:ilvl="2">
-      <w:start w:val="1"/>
-      <w:numFmt w:val="bullet"/>
-      <w:lvlText w:val="-"/>
+    <w:lvl w:ilvl="3">
+      <w:start w:val="1"/>
+      <w:numFmt w:val="decimal"/>
+      <w:lvlText w:val="(%4)"/>
       <w:lvlJc w:val="left"/>
       <w:pPr>
         <w:ind w:left="2880" w:hanging="360"/>
@@ -6604,10 +7253,10 @@
         <w:u w:val="none"/>
       </w:rPr>
     </w:lvl>
-    <w:lvl w:ilvl="3">
-      <w:start w:val="1"/>
-      <w:numFmt w:val="bullet"/>
-      <w:lvlText w:val="-"/>
+    <w:lvl w:ilvl="4">
+      <w:start w:val="1"/>
+      <w:numFmt w:val="lowerLetter"/>
+      <w:lvlText w:val="(%5)"/>
       <w:lvlJc w:val="left"/>
       <w:pPr>
         <w:ind w:left="3600" w:hanging="360"/>
@@ -6616,11 +7265,11 @@
         <w:u w:val="none"/>
       </w:rPr>
     </w:lvl>
-    <w:lvl w:ilvl="4">
-      <w:start w:val="1"/>
-      <w:numFmt w:val="bullet"/>
-      <w:lvlText w:val="-"/>
-      <w:lvlJc w:val="left"/>
+    <w:lvl w:ilvl="5">
+      <w:start w:val="1"/>
+      <w:numFmt w:val="lowerRoman"/>
+      <w:lvlText w:val="(%6)"/>
+      <w:lvlJc w:val="right"/>
       <w:pPr>
         <w:ind w:left="4320" w:hanging="360"/>
       </w:pPr>
@@ -6628,10 +7277,10 @@
         <w:u w:val="none"/>
       </w:rPr>
     </w:lvl>
-    <w:lvl w:ilvl="5">
-      <w:start w:val="1"/>
-      <w:numFmt w:val="bullet"/>
-      <w:lvlText w:val="-"/>
+    <w:lvl w:ilvl="6">
+      <w:start w:val="1"/>
+      <w:numFmt w:val="decimal"/>
+      <w:lvlText w:val="%7."/>
       <w:lvlJc w:val="left"/>
       <w:pPr>
         <w:ind w:left="5040" w:hanging="360"/>
@@ -6640,10 +7289,10 @@
         <w:u w:val="none"/>
       </w:rPr>
     </w:lvl>
-    <w:lvl w:ilvl="6">
-      <w:start w:val="1"/>
-      <w:numFmt w:val="bullet"/>
-      <w:lvlText w:val="-"/>
+    <w:lvl w:ilvl="7">
+      <w:start w:val="1"/>
+      <w:numFmt w:val="lowerLetter"/>
+      <w:lvlText w:val="%8."/>
       <w:lvlJc w:val="left"/>
       <w:pPr>
         <w:ind w:left="5760" w:hanging="360"/>
@@ -6652,25 +7301,13 @@
         <w:u w:val="none"/>
       </w:rPr>
     </w:lvl>
-    <w:lvl w:ilvl="7">
-      <w:start w:val="1"/>
-      <w:numFmt w:val="bullet"/>
-      <w:lvlText w:val="-"/>
-      <w:lvlJc w:val="left"/>
+    <w:lvl w:ilvl="8">
+      <w:start w:val="1"/>
+      <w:numFmt w:val="lowerRoman"/>
+      <w:lvlText w:val="%9."/>
+      <w:lvlJc w:val="right"/>
       <w:pPr>
         <w:ind w:left="6480" w:hanging="360"/>
-      </w:pPr>
-      <w:rPr>
-        <w:u w:val="none"/>
-      </w:rPr>
-    </w:lvl>
-    <w:lvl w:ilvl="8">
-      <w:start w:val="1"/>
-      <w:numFmt w:val="bullet"/>
-      <w:lvlText w:val="-"/>
-      <w:lvlJc w:val="left"/>
-      <w:pPr>
-        <w:ind w:left="7200" w:hanging="360"/>
       </w:pPr>
       <w:rPr>
         <w:u w:val="none"/>
@@ -6900,6 +7537,446 @@
   <w:abstractNum w:abstractNumId="6">
     <w:lvl w:ilvl="0">
       <w:start w:val="1"/>
+      <w:numFmt w:val="bullet"/>
+      <w:lvlText w:val="-"/>
+      <w:lvlJc w:val="left"/>
+      <w:pPr>
+        <w:ind w:left="1440" w:hanging="360"/>
+      </w:pPr>
+      <w:rPr>
+        <w:u w:val="none"/>
+      </w:rPr>
+    </w:lvl>
+    <w:lvl w:ilvl="1">
+      <w:start w:val="1"/>
+      <w:numFmt w:val="bullet"/>
+      <w:lvlText w:val="-"/>
+      <w:lvlJc w:val="left"/>
+      <w:pPr>
+        <w:ind w:left="2160" w:hanging="360"/>
+      </w:pPr>
+      <w:rPr>
+        <w:u w:val="none"/>
+      </w:rPr>
+    </w:lvl>
+    <w:lvl w:ilvl="2">
+      <w:start w:val="1"/>
+      <w:numFmt w:val="bullet"/>
+      <w:lvlText w:val="-"/>
+      <w:lvlJc w:val="left"/>
+      <w:pPr>
+        <w:ind w:left="2880" w:hanging="360"/>
+      </w:pPr>
+      <w:rPr>
+        <w:u w:val="none"/>
+      </w:rPr>
+    </w:lvl>
+    <w:lvl w:ilvl="3">
+      <w:start w:val="1"/>
+      <w:numFmt w:val="bullet"/>
+      <w:lvlText w:val="-"/>
+      <w:lvlJc w:val="left"/>
+      <w:pPr>
+        <w:ind w:left="3600" w:hanging="360"/>
+      </w:pPr>
+      <w:rPr>
+        <w:u w:val="none"/>
+      </w:rPr>
+    </w:lvl>
+    <w:lvl w:ilvl="4">
+      <w:start w:val="1"/>
+      <w:numFmt w:val="bullet"/>
+      <w:lvlText w:val="-"/>
+      <w:lvlJc w:val="left"/>
+      <w:pPr>
+        <w:ind w:left="4320" w:hanging="360"/>
+      </w:pPr>
+      <w:rPr>
+        <w:u w:val="none"/>
+      </w:rPr>
+    </w:lvl>
+    <w:lvl w:ilvl="5">
+      <w:start w:val="1"/>
+      <w:numFmt w:val="bullet"/>
+      <w:lvlText w:val="-"/>
+      <w:lvlJc w:val="left"/>
+      <w:pPr>
+        <w:ind w:left="5040" w:hanging="360"/>
+      </w:pPr>
+      <w:rPr>
+        <w:u w:val="none"/>
+      </w:rPr>
+    </w:lvl>
+    <w:lvl w:ilvl="6">
+      <w:start w:val="1"/>
+      <w:numFmt w:val="bullet"/>
+      <w:lvlText w:val="-"/>
+      <w:lvlJc w:val="left"/>
+      <w:pPr>
+        <w:ind w:left="5760" w:hanging="360"/>
+      </w:pPr>
+      <w:rPr>
+        <w:u w:val="none"/>
+      </w:rPr>
+    </w:lvl>
+    <w:lvl w:ilvl="7">
+      <w:start w:val="1"/>
+      <w:numFmt w:val="bullet"/>
+      <w:lvlText w:val="-"/>
+      <w:lvlJc w:val="left"/>
+      <w:pPr>
+        <w:ind w:left="6480" w:hanging="360"/>
+      </w:pPr>
+      <w:rPr>
+        <w:u w:val="none"/>
+      </w:rPr>
+    </w:lvl>
+    <w:lvl w:ilvl="8">
+      <w:start w:val="1"/>
+      <w:numFmt w:val="bullet"/>
+      <w:lvlText w:val="-"/>
+      <w:lvlJc w:val="left"/>
+      <w:pPr>
+        <w:ind w:left="7200" w:hanging="360"/>
+      </w:pPr>
+      <w:rPr>
+        <w:u w:val="none"/>
+      </w:rPr>
+    </w:lvl>
+  </w:abstractNum>
+  <w:abstractNum w:abstractNumId="7">
+    <w:lvl w:ilvl="0">
+      <w:start w:val="1"/>
+      <w:numFmt w:val="bullet"/>
+      <w:lvlText w:val="-"/>
+      <w:lvlJc w:val="left"/>
+      <w:pPr>
+        <w:ind w:left="1440" w:hanging="360"/>
+      </w:pPr>
+      <w:rPr>
+        <w:u w:val="none"/>
+      </w:rPr>
+    </w:lvl>
+    <w:lvl w:ilvl="1">
+      <w:start w:val="1"/>
+      <w:numFmt w:val="bullet"/>
+      <w:lvlText w:val="-"/>
+      <w:lvlJc w:val="left"/>
+      <w:pPr>
+        <w:ind w:left="2160" w:hanging="360"/>
+      </w:pPr>
+      <w:rPr>
+        <w:u w:val="none"/>
+      </w:rPr>
+    </w:lvl>
+    <w:lvl w:ilvl="2">
+      <w:start w:val="1"/>
+      <w:numFmt w:val="bullet"/>
+      <w:lvlText w:val="-"/>
+      <w:lvlJc w:val="left"/>
+      <w:pPr>
+        <w:ind w:left="2880" w:hanging="360"/>
+      </w:pPr>
+      <w:rPr>
+        <w:u w:val="none"/>
+      </w:rPr>
+    </w:lvl>
+    <w:lvl w:ilvl="3">
+      <w:start w:val="1"/>
+      <w:numFmt w:val="bullet"/>
+      <w:lvlText w:val="-"/>
+      <w:lvlJc w:val="left"/>
+      <w:pPr>
+        <w:ind w:left="3600" w:hanging="360"/>
+      </w:pPr>
+      <w:rPr>
+        <w:u w:val="none"/>
+      </w:rPr>
+    </w:lvl>
+    <w:lvl w:ilvl="4">
+      <w:start w:val="1"/>
+      <w:numFmt w:val="bullet"/>
+      <w:lvlText w:val="-"/>
+      <w:lvlJc w:val="left"/>
+      <w:pPr>
+        <w:ind w:left="4320" w:hanging="360"/>
+      </w:pPr>
+      <w:rPr>
+        <w:u w:val="none"/>
+      </w:rPr>
+    </w:lvl>
+    <w:lvl w:ilvl="5">
+      <w:start w:val="1"/>
+      <w:numFmt w:val="bullet"/>
+      <w:lvlText w:val="-"/>
+      <w:lvlJc w:val="left"/>
+      <w:pPr>
+        <w:ind w:left="5040" w:hanging="360"/>
+      </w:pPr>
+      <w:rPr>
+        <w:u w:val="none"/>
+      </w:rPr>
+    </w:lvl>
+    <w:lvl w:ilvl="6">
+      <w:start w:val="1"/>
+      <w:numFmt w:val="bullet"/>
+      <w:lvlText w:val="-"/>
+      <w:lvlJc w:val="left"/>
+      <w:pPr>
+        <w:ind w:left="5760" w:hanging="360"/>
+      </w:pPr>
+      <w:rPr>
+        <w:u w:val="none"/>
+      </w:rPr>
+    </w:lvl>
+    <w:lvl w:ilvl="7">
+      <w:start w:val="1"/>
+      <w:numFmt w:val="bullet"/>
+      <w:lvlText w:val="-"/>
+      <w:lvlJc w:val="left"/>
+      <w:pPr>
+        <w:ind w:left="6480" w:hanging="360"/>
+      </w:pPr>
+      <w:rPr>
+        <w:u w:val="none"/>
+      </w:rPr>
+    </w:lvl>
+    <w:lvl w:ilvl="8">
+      <w:start w:val="1"/>
+      <w:numFmt w:val="bullet"/>
+      <w:lvlText w:val="-"/>
+      <w:lvlJc w:val="left"/>
+      <w:pPr>
+        <w:ind w:left="7200" w:hanging="360"/>
+      </w:pPr>
+      <w:rPr>
+        <w:u w:val="none"/>
+      </w:rPr>
+    </w:lvl>
+  </w:abstractNum>
+  <w:abstractNum w:abstractNumId="8">
+    <w:lvl w:ilvl="0">
+      <w:start w:val="1"/>
+      <w:numFmt w:val="bullet"/>
+      <w:lvlText w:val="-"/>
+      <w:lvlJc w:val="left"/>
+      <w:pPr>
+        <w:ind w:left="1440" w:hanging="360"/>
+      </w:pPr>
+      <w:rPr>
+        <w:u w:val="none"/>
+      </w:rPr>
+    </w:lvl>
+    <w:lvl w:ilvl="1">
+      <w:start w:val="1"/>
+      <w:numFmt w:val="bullet"/>
+      <w:lvlText w:val="-"/>
+      <w:lvlJc w:val="left"/>
+      <w:pPr>
+        <w:ind w:left="2160" w:hanging="360"/>
+      </w:pPr>
+      <w:rPr>
+        <w:u w:val="none"/>
+      </w:rPr>
+    </w:lvl>
+    <w:lvl w:ilvl="2">
+      <w:start w:val="1"/>
+      <w:numFmt w:val="bullet"/>
+      <w:lvlText w:val="-"/>
+      <w:lvlJc w:val="left"/>
+      <w:pPr>
+        <w:ind w:left="2880" w:hanging="360"/>
+      </w:pPr>
+      <w:rPr>
+        <w:u w:val="none"/>
+      </w:rPr>
+    </w:lvl>
+    <w:lvl w:ilvl="3">
+      <w:start w:val="1"/>
+      <w:numFmt w:val="bullet"/>
+      <w:lvlText w:val="-"/>
+      <w:lvlJc w:val="left"/>
+      <w:pPr>
+        <w:ind w:left="3600" w:hanging="360"/>
+      </w:pPr>
+      <w:rPr>
+        <w:u w:val="none"/>
+      </w:rPr>
+    </w:lvl>
+    <w:lvl w:ilvl="4">
+      <w:start w:val="1"/>
+      <w:numFmt w:val="bullet"/>
+      <w:lvlText w:val="-"/>
+      <w:lvlJc w:val="left"/>
+      <w:pPr>
+        <w:ind w:left="4320" w:hanging="360"/>
+      </w:pPr>
+      <w:rPr>
+        <w:u w:val="none"/>
+      </w:rPr>
+    </w:lvl>
+    <w:lvl w:ilvl="5">
+      <w:start w:val="1"/>
+      <w:numFmt w:val="bullet"/>
+      <w:lvlText w:val="-"/>
+      <w:lvlJc w:val="left"/>
+      <w:pPr>
+        <w:ind w:left="5040" w:hanging="360"/>
+      </w:pPr>
+      <w:rPr>
+        <w:u w:val="none"/>
+      </w:rPr>
+    </w:lvl>
+    <w:lvl w:ilvl="6">
+      <w:start w:val="1"/>
+      <w:numFmt w:val="bullet"/>
+      <w:lvlText w:val="-"/>
+      <w:lvlJc w:val="left"/>
+      <w:pPr>
+        <w:ind w:left="5760" w:hanging="360"/>
+      </w:pPr>
+      <w:rPr>
+        <w:u w:val="none"/>
+      </w:rPr>
+    </w:lvl>
+    <w:lvl w:ilvl="7">
+      <w:start w:val="1"/>
+      <w:numFmt w:val="bullet"/>
+      <w:lvlText w:val="-"/>
+      <w:lvlJc w:val="left"/>
+      <w:pPr>
+        <w:ind w:left="6480" w:hanging="360"/>
+      </w:pPr>
+      <w:rPr>
+        <w:u w:val="none"/>
+      </w:rPr>
+    </w:lvl>
+    <w:lvl w:ilvl="8">
+      <w:start w:val="1"/>
+      <w:numFmt w:val="bullet"/>
+      <w:lvlText w:val="-"/>
+      <w:lvlJc w:val="left"/>
+      <w:pPr>
+        <w:ind w:left="7200" w:hanging="360"/>
+      </w:pPr>
+      <w:rPr>
+        <w:u w:val="none"/>
+      </w:rPr>
+    </w:lvl>
+  </w:abstractNum>
+  <w:abstractNum w:abstractNumId="9">
+    <w:lvl w:ilvl="0">
+      <w:start w:val="1"/>
+      <w:numFmt w:val="bullet"/>
+      <w:lvlText w:val="➔"/>
+      <w:lvlJc w:val="left"/>
+      <w:pPr>
+        <w:ind w:left="720" w:hanging="360"/>
+      </w:pPr>
+      <w:rPr>
+        <w:u w:val="none"/>
+      </w:rPr>
+    </w:lvl>
+    <w:lvl w:ilvl="1">
+      <w:start w:val="1"/>
+      <w:numFmt w:val="bullet"/>
+      <w:lvlText w:val="◆"/>
+      <w:lvlJc w:val="left"/>
+      <w:pPr>
+        <w:ind w:left="1440" w:hanging="360"/>
+      </w:pPr>
+      <w:rPr>
+        <w:u w:val="none"/>
+      </w:rPr>
+    </w:lvl>
+    <w:lvl w:ilvl="2">
+      <w:start w:val="1"/>
+      <w:numFmt w:val="bullet"/>
+      <w:lvlText w:val="●"/>
+      <w:lvlJc w:val="left"/>
+      <w:pPr>
+        <w:ind w:left="2160" w:hanging="360"/>
+      </w:pPr>
+      <w:rPr>
+        <w:u w:val="none"/>
+      </w:rPr>
+    </w:lvl>
+    <w:lvl w:ilvl="3">
+      <w:start w:val="1"/>
+      <w:numFmt w:val="bullet"/>
+      <w:lvlText w:val="○"/>
+      <w:lvlJc w:val="left"/>
+      <w:pPr>
+        <w:ind w:left="2880" w:hanging="360"/>
+      </w:pPr>
+      <w:rPr>
+        <w:u w:val="none"/>
+      </w:rPr>
+    </w:lvl>
+    <w:lvl w:ilvl="4">
+      <w:start w:val="1"/>
+      <w:numFmt w:val="bullet"/>
+      <w:lvlText w:val="◆"/>
+      <w:lvlJc w:val="left"/>
+      <w:pPr>
+        <w:ind w:left="3600" w:hanging="360"/>
+      </w:pPr>
+      <w:rPr>
+        <w:u w:val="none"/>
+      </w:rPr>
+    </w:lvl>
+    <w:lvl w:ilvl="5">
+      <w:start w:val="1"/>
+      <w:numFmt w:val="bullet"/>
+      <w:lvlText w:val="●"/>
+      <w:lvlJc w:val="left"/>
+      <w:pPr>
+        <w:ind w:left="4320" w:hanging="360"/>
+      </w:pPr>
+      <w:rPr>
+        <w:u w:val="none"/>
+      </w:rPr>
+    </w:lvl>
+    <w:lvl w:ilvl="6">
+      <w:start w:val="1"/>
+      <w:numFmt w:val="bullet"/>
+      <w:lvlText w:val="○"/>
+      <w:lvlJc w:val="left"/>
+      <w:pPr>
+        <w:ind w:left="5040" w:hanging="360"/>
+      </w:pPr>
+      <w:rPr>
+        <w:u w:val="none"/>
+      </w:rPr>
+    </w:lvl>
+    <w:lvl w:ilvl="7">
+      <w:start w:val="1"/>
+      <w:numFmt w:val="bullet"/>
+      <w:lvlText w:val="◆"/>
+      <w:lvlJc w:val="left"/>
+      <w:pPr>
+        <w:ind w:left="5760" w:hanging="360"/>
+      </w:pPr>
+      <w:rPr>
+        <w:u w:val="none"/>
+      </w:rPr>
+    </w:lvl>
+    <w:lvl w:ilvl="8">
+      <w:start w:val="1"/>
+      <w:numFmt w:val="bullet"/>
+      <w:lvlText w:val="●"/>
+      <w:lvlJc w:val="left"/>
+      <w:pPr>
+        <w:ind w:left="6480" w:hanging="360"/>
+      </w:pPr>
+      <w:rPr>
+        <w:u w:val="none"/>
+      </w:rPr>
+    </w:lvl>
+  </w:abstractNum>
+  <w:abstractNum w:abstractNumId="10">
+    <w:lvl w:ilvl="0">
+      <w:start w:val="1"/>
       <w:numFmt w:val="decimal"/>
       <w:lvlText w:val="%1)"/>
       <w:lvlJc w:val="left"/>
@@ -7007,19 +8084,129 @@
       </w:rPr>
     </w:lvl>
   </w:abstractNum>
-  <w:abstractNum w:abstractNumId="7">
+  <w:abstractNum w:abstractNumId="11">
     <w:lvl w:ilvl="0">
       <w:start w:val="1"/>
       <w:numFmt w:val="bullet"/>
       <w:lvlText w:val="-"/>
       <w:lvlJc w:val="left"/>
       <w:pPr>
+        <w:ind w:left="720" w:hanging="360"/>
+      </w:pPr>
+      <w:rPr>
+        <w:u w:val="none"/>
+      </w:rPr>
+    </w:lvl>
+    <w:lvl w:ilvl="1">
+      <w:start w:val="1"/>
+      <w:numFmt w:val="bullet"/>
+      <w:lvlText w:val="-"/>
+      <w:lvlJc w:val="left"/>
+      <w:pPr>
         <w:ind w:left="1440" w:hanging="360"/>
       </w:pPr>
       <w:rPr>
         <w:u w:val="none"/>
       </w:rPr>
     </w:lvl>
+    <w:lvl w:ilvl="2">
+      <w:start w:val="1"/>
+      <w:numFmt w:val="bullet"/>
+      <w:lvlText w:val="-"/>
+      <w:lvlJc w:val="left"/>
+      <w:pPr>
+        <w:ind w:left="2160" w:hanging="360"/>
+      </w:pPr>
+      <w:rPr>
+        <w:u w:val="none"/>
+      </w:rPr>
+    </w:lvl>
+    <w:lvl w:ilvl="3">
+      <w:start w:val="1"/>
+      <w:numFmt w:val="bullet"/>
+      <w:lvlText w:val="-"/>
+      <w:lvlJc w:val="left"/>
+      <w:pPr>
+        <w:ind w:left="2880" w:hanging="360"/>
+      </w:pPr>
+      <w:rPr>
+        <w:u w:val="none"/>
+      </w:rPr>
+    </w:lvl>
+    <w:lvl w:ilvl="4">
+      <w:start w:val="1"/>
+      <w:numFmt w:val="bullet"/>
+      <w:lvlText w:val="-"/>
+      <w:lvlJc w:val="left"/>
+      <w:pPr>
+        <w:ind w:left="3600" w:hanging="360"/>
+      </w:pPr>
+      <w:rPr>
+        <w:u w:val="none"/>
+      </w:rPr>
+    </w:lvl>
+    <w:lvl w:ilvl="5">
+      <w:start w:val="1"/>
+      <w:numFmt w:val="bullet"/>
+      <w:lvlText w:val="-"/>
+      <w:lvlJc w:val="left"/>
+      <w:pPr>
+        <w:ind w:left="4320" w:hanging="360"/>
+      </w:pPr>
+      <w:rPr>
+        <w:u w:val="none"/>
+      </w:rPr>
+    </w:lvl>
+    <w:lvl w:ilvl="6">
+      <w:start w:val="1"/>
+      <w:numFmt w:val="bullet"/>
+      <w:lvlText w:val="-"/>
+      <w:lvlJc w:val="left"/>
+      <w:pPr>
+        <w:ind w:left="5040" w:hanging="360"/>
+      </w:pPr>
+      <w:rPr>
+        <w:u w:val="none"/>
+      </w:rPr>
+    </w:lvl>
+    <w:lvl w:ilvl="7">
+      <w:start w:val="1"/>
+      <w:numFmt w:val="bullet"/>
+      <w:lvlText w:val="-"/>
+      <w:lvlJc w:val="left"/>
+      <w:pPr>
+        <w:ind w:left="5760" w:hanging="360"/>
+      </w:pPr>
+      <w:rPr>
+        <w:u w:val="none"/>
+      </w:rPr>
+    </w:lvl>
+    <w:lvl w:ilvl="8">
+      <w:start w:val="1"/>
+      <w:numFmt w:val="bullet"/>
+      <w:lvlText w:val="-"/>
+      <w:lvlJc w:val="left"/>
+      <w:pPr>
+        <w:ind w:left="6480" w:hanging="360"/>
+      </w:pPr>
+      <w:rPr>
+        <w:u w:val="none"/>
+      </w:rPr>
+    </w:lvl>
+  </w:abstractNum>
+  <w:abstractNum w:abstractNumId="12">
+    <w:lvl w:ilvl="0">
+      <w:start w:val="1"/>
+      <w:numFmt w:val="bullet"/>
+      <w:lvlText w:val="-"/>
+      <w:lvlJc w:val="left"/>
+      <w:pPr>
+        <w:ind w:left="1440" w:hanging="360"/>
+      </w:pPr>
+      <w:rPr>
+        <w:u w:val="none"/>
+      </w:rPr>
+    </w:lvl>
     <w:lvl w:ilvl="1">
       <w:start w:val="1"/>
       <w:numFmt w:val="bullet"/>
@@ -7117,13 +8304,123 @@
       </w:rPr>
     </w:lvl>
   </w:abstractNum>
-  <w:abstractNum w:abstractNumId="8">
+  <w:abstractNum w:abstractNumId="13">
     <w:lvl w:ilvl="0">
       <w:start w:val="1"/>
       <w:numFmt w:val="bullet"/>
       <w:lvlText w:val="-"/>
       <w:lvlJc w:val="left"/>
       <w:pPr>
+        <w:ind w:left="1440" w:hanging="360"/>
+      </w:pPr>
+      <w:rPr>
+        <w:u w:val="none"/>
+      </w:rPr>
+    </w:lvl>
+    <w:lvl w:ilvl="1">
+      <w:start w:val="1"/>
+      <w:numFmt w:val="bullet"/>
+      <w:lvlText w:val="-"/>
+      <w:lvlJc w:val="left"/>
+      <w:pPr>
+        <w:ind w:left="2160" w:hanging="360"/>
+      </w:pPr>
+      <w:rPr>
+        <w:u w:val="none"/>
+      </w:rPr>
+    </w:lvl>
+    <w:lvl w:ilvl="2">
+      <w:start w:val="1"/>
+      <w:numFmt w:val="bullet"/>
+      <w:lvlText w:val="-"/>
+      <w:lvlJc w:val="left"/>
+      <w:pPr>
+        <w:ind w:left="2880" w:hanging="360"/>
+      </w:pPr>
+      <w:rPr>
+        <w:u w:val="none"/>
+      </w:rPr>
+    </w:lvl>
+    <w:lvl w:ilvl="3">
+      <w:start w:val="1"/>
+      <w:numFmt w:val="bullet"/>
+      <w:lvlText w:val="-"/>
+      <w:lvlJc w:val="left"/>
+      <w:pPr>
+        <w:ind w:left="3600" w:hanging="360"/>
+      </w:pPr>
+      <w:rPr>
+        <w:u w:val="none"/>
+      </w:rPr>
+    </w:lvl>
+    <w:lvl w:ilvl="4">
+      <w:start w:val="1"/>
+      <w:numFmt w:val="bullet"/>
+      <w:lvlText w:val="-"/>
+      <w:lvlJc w:val="left"/>
+      <w:pPr>
+        <w:ind w:left="4320" w:hanging="360"/>
+      </w:pPr>
+      <w:rPr>
+        <w:u w:val="none"/>
+      </w:rPr>
+    </w:lvl>
+    <w:lvl w:ilvl="5">
+      <w:start w:val="1"/>
+      <w:numFmt w:val="bullet"/>
+      <w:lvlText w:val="-"/>
+      <w:lvlJc w:val="left"/>
+      <w:pPr>
+        <w:ind w:left="5040" w:hanging="360"/>
+      </w:pPr>
+      <w:rPr>
+        <w:u w:val="none"/>
+      </w:rPr>
+    </w:lvl>
+    <w:lvl w:ilvl="6">
+      <w:start w:val="1"/>
+      <w:numFmt w:val="bullet"/>
+      <w:lvlText w:val="-"/>
+      <w:lvlJc w:val="left"/>
+      <w:pPr>
+        <w:ind w:left="5760" w:hanging="360"/>
+      </w:pPr>
+      <w:rPr>
+        <w:u w:val="none"/>
+      </w:rPr>
+    </w:lvl>
+    <w:lvl w:ilvl="7">
+      <w:start w:val="1"/>
+      <w:numFmt w:val="bullet"/>
+      <w:lvlText w:val="-"/>
+      <w:lvlJc w:val="left"/>
+      <w:pPr>
+        <w:ind w:left="6480" w:hanging="360"/>
+      </w:pPr>
+      <w:rPr>
+        <w:u w:val="none"/>
+      </w:rPr>
+    </w:lvl>
+    <w:lvl w:ilvl="8">
+      <w:start w:val="1"/>
+      <w:numFmt w:val="bullet"/>
+      <w:lvlText w:val="-"/>
+      <w:lvlJc w:val="left"/>
+      <w:pPr>
+        <w:ind w:left="7200" w:hanging="360"/>
+      </w:pPr>
+      <w:rPr>
+        <w:u w:val="none"/>
+      </w:rPr>
+    </w:lvl>
+  </w:abstractNum>
+  <w:abstractNum w:abstractNumId="14">
+    <w:lvl w:ilvl="0">
+      <w:start w:val="1"/>
+      <w:numFmt w:val="bullet"/>
+      <w:lvlText w:val="-"/>
+      <w:lvlJc w:val="left"/>
+      <w:pPr>
         <w:ind w:left="720" w:hanging="360"/>
       </w:pPr>
       <w:rPr>
@@ -7227,13 +8524,233 @@
       </w:rPr>
     </w:lvl>
   </w:abstractNum>
-  <w:abstractNum w:abstractNumId="9">
+  <w:abstractNum w:abstractNumId="15">
     <w:lvl w:ilvl="0">
       <w:start w:val="1"/>
       <w:numFmt w:val="bullet"/>
       <w:lvlText w:val="-"/>
       <w:lvlJc w:val="left"/>
       <w:pPr>
+        <w:ind w:left="1440" w:hanging="360"/>
+      </w:pPr>
+      <w:rPr>
+        <w:u w:val="none"/>
+      </w:rPr>
+    </w:lvl>
+    <w:lvl w:ilvl="1">
+      <w:start w:val="1"/>
+      <w:numFmt w:val="bullet"/>
+      <w:lvlText w:val="-"/>
+      <w:lvlJc w:val="left"/>
+      <w:pPr>
+        <w:ind w:left="2160" w:hanging="360"/>
+      </w:pPr>
+      <w:rPr>
+        <w:u w:val="none"/>
+      </w:rPr>
+    </w:lvl>
+    <w:lvl w:ilvl="2">
+      <w:start w:val="1"/>
+      <w:numFmt w:val="bullet"/>
+      <w:lvlText w:val="-"/>
+      <w:lvlJc w:val="left"/>
+      <w:pPr>
+        <w:ind w:left="2880" w:hanging="360"/>
+      </w:pPr>
+      <w:rPr>
+        <w:u w:val="none"/>
+      </w:rPr>
+    </w:lvl>
+    <w:lvl w:ilvl="3">
+      <w:start w:val="1"/>
+      <w:numFmt w:val="bullet"/>
+      <w:lvlText w:val="-"/>
+      <w:lvlJc w:val="left"/>
+      <w:pPr>
+        <w:ind w:left="3600" w:hanging="360"/>
+      </w:pPr>
+      <w:rPr>
+        <w:u w:val="none"/>
+      </w:rPr>
+    </w:lvl>
+    <w:lvl w:ilvl="4">
+      <w:start w:val="1"/>
+      <w:numFmt w:val="bullet"/>
+      <w:lvlText w:val="-"/>
+      <w:lvlJc w:val="left"/>
+      <w:pPr>
+        <w:ind w:left="4320" w:hanging="360"/>
+      </w:pPr>
+      <w:rPr>
+        <w:u w:val="none"/>
+      </w:rPr>
+    </w:lvl>
+    <w:lvl w:ilvl="5">
+      <w:start w:val="1"/>
+      <w:numFmt w:val="bullet"/>
+      <w:lvlText w:val="-"/>
+      <w:lvlJc w:val="left"/>
+      <w:pPr>
+        <w:ind w:left="5040" w:hanging="360"/>
+      </w:pPr>
+      <w:rPr>
+        <w:u w:val="none"/>
+      </w:rPr>
+    </w:lvl>
+    <w:lvl w:ilvl="6">
+      <w:start w:val="1"/>
+      <w:numFmt w:val="bullet"/>
+      <w:lvlText w:val="-"/>
+      <w:lvlJc w:val="left"/>
+      <w:pPr>
+        <w:ind w:left="5760" w:hanging="360"/>
+      </w:pPr>
+      <w:rPr>
+        <w:u w:val="none"/>
+      </w:rPr>
+    </w:lvl>
+    <w:lvl w:ilvl="7">
+      <w:start w:val="1"/>
+      <w:numFmt w:val="bullet"/>
+      <w:lvlText w:val="-"/>
+      <w:lvlJc w:val="left"/>
+      <w:pPr>
+        <w:ind w:left="6480" w:hanging="360"/>
+      </w:pPr>
+      <w:rPr>
+        <w:u w:val="none"/>
+      </w:rPr>
+    </w:lvl>
+    <w:lvl w:ilvl="8">
+      <w:start w:val="1"/>
+      <w:numFmt w:val="bullet"/>
+      <w:lvlText w:val="-"/>
+      <w:lvlJc w:val="left"/>
+      <w:pPr>
+        <w:ind w:left="7200" w:hanging="360"/>
+      </w:pPr>
+      <w:rPr>
+        <w:u w:val="none"/>
+      </w:rPr>
+    </w:lvl>
+  </w:abstractNum>
+  <w:abstractNum w:abstractNumId="16">
+    <w:lvl w:ilvl="0">
+      <w:start w:val="1"/>
+      <w:numFmt w:val="bullet"/>
+      <w:lvlText w:val="-"/>
+      <w:lvlJc w:val="left"/>
+      <w:pPr>
+        <w:ind w:left="1440" w:hanging="360"/>
+      </w:pPr>
+      <w:rPr>
+        <w:u w:val="none"/>
+      </w:rPr>
+    </w:lvl>
+    <w:lvl w:ilvl="1">
+      <w:start w:val="1"/>
+      <w:numFmt w:val="bullet"/>
+      <w:lvlText w:val="-"/>
+      <w:lvlJc w:val="left"/>
+      <w:pPr>
+        <w:ind w:left="2160" w:hanging="360"/>
+      </w:pPr>
+      <w:rPr>
+        <w:u w:val="none"/>
+      </w:rPr>
+    </w:lvl>
+    <w:lvl w:ilvl="2">
+      <w:start w:val="1"/>
+      <w:numFmt w:val="bullet"/>
+      <w:lvlText w:val="-"/>
+      <w:lvlJc w:val="left"/>
+      <w:pPr>
+        <w:ind w:left="2880" w:hanging="360"/>
+      </w:pPr>
+      <w:rPr>
+        <w:u w:val="none"/>
+      </w:rPr>
+    </w:lvl>
+    <w:lvl w:ilvl="3">
+      <w:start w:val="1"/>
+      <w:numFmt w:val="bullet"/>
+      <w:lvlText w:val="-"/>
+      <w:lvlJc w:val="left"/>
+      <w:pPr>
+        <w:ind w:left="3600" w:hanging="360"/>
+      </w:pPr>
+      <w:rPr>
+        <w:u w:val="none"/>
+      </w:rPr>
+    </w:lvl>
+    <w:lvl w:ilvl="4">
+      <w:start w:val="1"/>
+      <w:numFmt w:val="bullet"/>
+      <w:lvlText w:val="-"/>
+      <w:lvlJc w:val="left"/>
+      <w:pPr>
+        <w:ind w:left="4320" w:hanging="360"/>
+      </w:pPr>
+      <w:rPr>
+        <w:u w:val="none"/>
+      </w:rPr>
+    </w:lvl>
+    <w:lvl w:ilvl="5">
+      <w:start w:val="1"/>
+      <w:numFmt w:val="bullet"/>
+      <w:lvlText w:val="-"/>
+      <w:lvlJc w:val="left"/>
+      <w:pPr>
+        <w:ind w:left="5040" w:hanging="360"/>
+      </w:pPr>
+      <w:rPr>
+        <w:u w:val="none"/>
+      </w:rPr>
+    </w:lvl>
+    <w:lvl w:ilvl="6">
+      <w:start w:val="1"/>
+      <w:numFmt w:val="bullet"/>
+      <w:lvlText w:val="-"/>
+      <w:lvlJc w:val="left"/>
+      <w:pPr>
+        <w:ind w:left="5760" w:hanging="360"/>
+      </w:pPr>
+      <w:rPr>
+        <w:u w:val="none"/>
+      </w:rPr>
+    </w:lvl>
+    <w:lvl w:ilvl="7">
+      <w:start w:val="1"/>
+      <w:numFmt w:val="bullet"/>
+      <w:lvlText w:val="-"/>
+      <w:lvlJc w:val="left"/>
+      <w:pPr>
+        <w:ind w:left="6480" w:hanging="360"/>
+      </w:pPr>
+      <w:rPr>
+        <w:u w:val="none"/>
+      </w:rPr>
+    </w:lvl>
+    <w:lvl w:ilvl="8">
+      <w:start w:val="1"/>
+      <w:numFmt w:val="bullet"/>
+      <w:lvlText w:val="-"/>
+      <w:lvlJc w:val="left"/>
+      <w:pPr>
+        <w:ind w:left="7200" w:hanging="360"/>
+      </w:pPr>
+      <w:rPr>
+        <w:u w:val="none"/>
+      </w:rPr>
+    </w:lvl>
+  </w:abstractNum>
+  <w:abstractNum w:abstractNumId="17">
+    <w:lvl w:ilvl="0">
+      <w:start w:val="1"/>
+      <w:numFmt w:val="bullet"/>
+      <w:lvlText w:val="-"/>
+      <w:lvlJc w:val="left"/>
+      <w:pPr>
         <w:ind w:left="720" w:hanging="360"/>
       </w:pPr>
       <w:rPr>
@@ -7337,7 +8854,7 @@
       </w:rPr>
     </w:lvl>
   </w:abstractNum>
-  <w:abstractNum w:abstractNumId="10">
+  <w:abstractNum w:abstractNumId="18">
     <w:lvl w:ilvl="0">
       <w:start w:val="1"/>
       <w:numFmt w:val="decimal"/>
@@ -7476,6 +8993,30 @@
   </w:num>
   <w:num w:numId="10">
     <w:abstractNumId w:val="10"/>
+  </w:num>
+  <w:num w:numId="11">
+    <w:abstractNumId w:val="11"/>
+  </w:num>
+  <w:num w:numId="12">
+    <w:abstractNumId w:val="12"/>
+  </w:num>
+  <w:num w:numId="13">
+    <w:abstractNumId w:val="13"/>
+  </w:num>
+  <w:num w:numId="14">
+    <w:abstractNumId w:val="14"/>
+  </w:num>
+  <w:num w:numId="15">
+    <w:abstractNumId w:val="15"/>
+  </w:num>
+  <w:num w:numId="16">
+    <w:abstractNumId w:val="16"/>
+  </w:num>
+  <w:num w:numId="17">
+    <w:abstractNumId w:val="17"/>
+  </w:num>
+  <w:num w:numId="18">
+    <w:abstractNumId w:val="18"/>
   </w:num>
 </w:numbering>
 </file>

</xml_diff>